<commit_message>
add the challenges part
</commit_message>
<xml_diff>
--- a/IcebreakerReportChanged.docx
+++ b/IcebreakerReportChanged.docx
@@ -126,7 +126,7 @@
                                           <wp:inline distT="0" distB="0" distL="0" distR="0" wp14:anchorId="08D89557" wp14:editId="225E29DA">
                                             <wp:extent cx="3318576" cy="2933700"/>
                                             <wp:effectExtent l="0" t="0" r="0" b="0"/>
-                                            <wp:docPr id="90733703" name="Picture 1"/>
+                                            <wp:docPr id="244878103" name="Picture 1"/>
                                             <wp:cNvGraphicFramePr>
                                               <a:graphicFrameLocks xmlns:a="http://schemas.openxmlformats.org/drawingml/2006/main" noChangeAspect="1"/>
                                             </wp:cNvGraphicFramePr>
@@ -318,15 +318,7 @@
                                               <w:sz w:val="26"/>
                                               <w:szCs w:val="26"/>
                                             </w:rPr>
-                                            <w:t>Bilal Alali, Utkarsh Fulara</w:t>
-                                          </w:r>
-                                          <w:r>
-                                            <w:rPr>
-                                              <w:color w:val="E97132" w:themeColor="accent2"/>
-                                              <w:sz w:val="26"/>
-                                              <w:szCs w:val="26"/>
-                                            </w:rPr>
-                                            <w:t xml:space="preserve"> </w:t>
+                                            <w:t xml:space="preserve">Bilal Alali, Utkarsh Fulara </w:t>
                                           </w:r>
                                           <w:proofErr w:type="gramStart"/>
                                           <w:r>
@@ -335,15 +327,7 @@
                                               <w:sz w:val="26"/>
                                               <w:szCs w:val="26"/>
                                             </w:rPr>
-                                            <w:t>1372892</w:t>
-                                          </w:r>
-                                          <w:r>
-                                            <w:rPr>
-                                              <w:color w:val="E97132" w:themeColor="accent2"/>
-                                              <w:sz w:val="26"/>
-                                              <w:szCs w:val="26"/>
-                                            </w:rPr>
-                                            <w:t xml:space="preserve">,   </w:t>
+                                            <w:t xml:space="preserve">1372892,   </w:t>
                                           </w:r>
                                           <w:proofErr w:type="gramEnd"/>
                                           <w:r>
@@ -352,23 +336,7 @@
                                               <w:sz w:val="26"/>
                                               <w:szCs w:val="26"/>
                                             </w:rPr>
-                                            <w:t xml:space="preserve">                             Andrej Sum-Shik </w:t>
-                                          </w:r>
-                                          <w:r>
-                                            <w:rPr>
-                                              <w:color w:val="E97132" w:themeColor="accent2"/>
-                                              <w:sz w:val="26"/>
-                                              <w:szCs w:val="26"/>
-                                            </w:rPr>
-                                            <w:t>1449932</w:t>
-                                          </w:r>
-                                          <w:r>
-                                            <w:rPr>
-                                              <w:color w:val="E97132" w:themeColor="accent2"/>
-                                              <w:sz w:val="26"/>
-                                              <w:szCs w:val="26"/>
-                                            </w:rPr>
-                                            <w:t xml:space="preserve">                          </w:t>
+                                            <w:t xml:space="preserve">                             Andrej Sum-Shik 1449932</w:t>
                                           </w:r>
                                         </w:p>
                                       </w:sdtContent>
@@ -440,7 +408,7 @@
                     <v:stroke joinstyle="miter"/>
                     <v:path gradientshapeok="t" o:connecttype="rect"/>
                   </v:shapetype>
-                  <v:shape id="Text Box 139" o:spid="_x0000_s1026" type="#_x0000_t202" style="position:absolute;margin-left:0;margin-top:0;width:134.85pt;height:302.4pt;z-index:251659264;visibility:visible;mso-wrap-style:square;mso-width-percent:941;mso-height-percent:773;mso-wrap-distance-left:9pt;mso-wrap-distance-top:0;mso-wrap-distance-right:9pt;mso-wrap-distance-bottom:0;mso-position-horizontal:center;mso-position-horizontal-relative:page;mso-position-vertical:center;mso-position-vertical-relative:page;mso-width-percent:941;mso-height-percent:773;mso-width-relative:page;mso-height-relative:page;v-text-anchor:middle" o:gfxdata="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" fillcolor="white [3201]" stroked="f" strokeweight=".5pt">
+                  <v:shape id="Text Box 139" o:spid="_x0000_s1026" type="#_x0000_t202" style="position:absolute;margin-left:0;margin-top:0;width:134.85pt;height:302.4pt;z-index:251659264;visibility:visible;mso-wrap-style:square;mso-width-percent:941;mso-height-percent:773;mso-wrap-distance-left:9pt;mso-wrap-distance-top:0;mso-wrap-distance-right:9pt;mso-wrap-distance-bottom:0;mso-position-horizontal:center;mso-position-horizontal-relative:page;mso-position-vertical:center;mso-position-vertical-relative:page;mso-width-percent:941;mso-height-percent:773;mso-width-relative:page;mso-height-relative:page;v-text-anchor:middle" o:gfxdata="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" fillcolor="white [3201]" stroked="f" strokeweight=".5pt">
                     <v:textbox inset="0,0,0,0">
                       <w:txbxContent>
                         <w:tbl>
@@ -483,7 +451,7 @@
                                     <wp:inline distT="0" distB="0" distL="0" distR="0" wp14:anchorId="08D89557" wp14:editId="225E29DA">
                                       <wp:extent cx="3318576" cy="2933700"/>
                                       <wp:effectExtent l="0" t="0" r="0" b="0"/>
-                                      <wp:docPr id="90733703" name="Picture 1"/>
+                                      <wp:docPr id="244878103" name="Picture 1"/>
                                       <wp:cNvGraphicFramePr>
                                         <a:graphicFrameLocks xmlns:a="http://schemas.openxmlformats.org/drawingml/2006/main" noChangeAspect="1"/>
                                       </wp:cNvGraphicFramePr>
@@ -675,15 +643,7 @@
                                         <w:sz w:val="26"/>
                                         <w:szCs w:val="26"/>
                                       </w:rPr>
-                                      <w:t>Bilal Alali, Utkarsh Fulara</w:t>
-                                    </w:r>
-                                    <w:r>
-                                      <w:rPr>
-                                        <w:color w:val="E97132" w:themeColor="accent2"/>
-                                        <w:sz w:val="26"/>
-                                        <w:szCs w:val="26"/>
-                                      </w:rPr>
-                                      <w:t xml:space="preserve"> </w:t>
+                                      <w:t xml:space="preserve">Bilal Alali, Utkarsh Fulara </w:t>
                                     </w:r>
                                     <w:proofErr w:type="gramStart"/>
                                     <w:r>
@@ -692,15 +652,7 @@
                                         <w:sz w:val="26"/>
                                         <w:szCs w:val="26"/>
                                       </w:rPr>
-                                      <w:t>1372892</w:t>
-                                    </w:r>
-                                    <w:r>
-                                      <w:rPr>
-                                        <w:color w:val="E97132" w:themeColor="accent2"/>
-                                        <w:sz w:val="26"/>
-                                        <w:szCs w:val="26"/>
-                                      </w:rPr>
-                                      <w:t xml:space="preserve">,   </w:t>
+                                      <w:t xml:space="preserve">1372892,   </w:t>
                                     </w:r>
                                     <w:proofErr w:type="gramEnd"/>
                                     <w:r>
@@ -709,23 +661,7 @@
                                         <w:sz w:val="26"/>
                                         <w:szCs w:val="26"/>
                                       </w:rPr>
-                                      <w:t xml:space="preserve">                             Andrej Sum-Shik </w:t>
-                                    </w:r>
-                                    <w:r>
-                                      <w:rPr>
-                                        <w:color w:val="E97132" w:themeColor="accent2"/>
-                                        <w:sz w:val="26"/>
-                                        <w:szCs w:val="26"/>
-                                      </w:rPr>
-                                      <w:t>1449932</w:t>
-                                    </w:r>
-                                    <w:r>
-                                      <w:rPr>
-                                        <w:color w:val="E97132" w:themeColor="accent2"/>
-                                        <w:sz w:val="26"/>
-                                        <w:szCs w:val="26"/>
-                                      </w:rPr>
-                                      <w:t xml:space="preserve">                          </w:t>
+                                      <w:t xml:space="preserve">                             Andrej Sum-Shik 1449932</w:t>
                                     </w:r>
                                   </w:p>
                                 </w:sdtContent>
@@ -845,7 +781,6 @@
             <w:rPr>
               <w:rFonts w:eastAsiaTheme="minorEastAsia"/>
               <w:noProof/>
-              <w:lang w:val="en-DE" w:eastAsia="en-DE"/>
             </w:rPr>
           </w:pPr>
           <w:r>
@@ -857,7 +792,7 @@
           <w:r>
             <w:fldChar w:fldCharType="separate"/>
           </w:r>
-          <w:hyperlink w:anchor="_Toc189926556" w:history="1">
+          <w:hyperlink w:anchor="_Toc190097133" w:history="1">
             <w:r>
               <w:rPr>
                 <w:rStyle w:val="Hyperlink"/>
@@ -884,7 +819,7 @@
                 <w:noProof/>
                 <w:webHidden/>
               </w:rPr>
-              <w:instrText xml:space="preserve"> PAGEREF _Toc189926556 \h </w:instrText>
+              <w:instrText xml:space="preserve"> PAGEREF _Toc190097133 \h </w:instrText>
             </w:r>
             <w:r>
               <w:rPr>
@@ -925,10 +860,9 @@
             <w:rPr>
               <w:rFonts w:eastAsiaTheme="minorEastAsia"/>
               <w:noProof/>
-              <w:lang w:val="en-DE" w:eastAsia="en-DE"/>
             </w:rPr>
           </w:pPr>
-          <w:hyperlink w:anchor="_Toc189926557" w:history="1">
+          <w:hyperlink w:anchor="_Toc190097134" w:history="1">
             <w:r>
               <w:rPr>
                 <w:rStyle w:val="Hyperlink"/>
@@ -940,7 +874,6 @@
               <w:rPr>
                 <w:rFonts w:eastAsiaTheme="minorEastAsia"/>
                 <w:noProof/>
-                <w:lang w:val="en-DE" w:eastAsia="en-DE"/>
               </w:rPr>
               <w:tab/>
             </w:r>
@@ -970,7 +903,7 @@
                 <w:noProof/>
                 <w:webHidden/>
               </w:rPr>
-              <w:instrText xml:space="preserve"> PAGEREF _Toc189926557 \h </w:instrText>
+              <w:instrText xml:space="preserve"> PAGEREF _Toc190097134 \h </w:instrText>
             </w:r>
             <w:r>
               <w:rPr>
@@ -1011,10 +944,9 @@
             <w:rPr>
               <w:rFonts w:eastAsiaTheme="minorEastAsia"/>
               <w:noProof/>
-              <w:lang w:val="en-DE" w:eastAsia="en-DE"/>
             </w:rPr>
           </w:pPr>
-          <w:hyperlink w:anchor="_Toc189926558" w:history="1">
+          <w:hyperlink w:anchor="_Toc190097135" w:history="1">
             <w:r>
               <w:rPr>
                 <w:rStyle w:val="Hyperlink"/>
@@ -1026,7 +958,6 @@
               <w:rPr>
                 <w:rFonts w:eastAsiaTheme="minorEastAsia"/>
                 <w:noProof/>
-                <w:lang w:val="en-DE" w:eastAsia="en-DE"/>
               </w:rPr>
               <w:tab/>
             </w:r>
@@ -1056,7 +987,7 @@
                 <w:noProof/>
                 <w:webHidden/>
               </w:rPr>
-              <w:instrText xml:space="preserve"> PAGEREF _Toc189926558 \h </w:instrText>
+              <w:instrText xml:space="preserve"> PAGEREF _Toc190097135 \h </w:instrText>
             </w:r>
             <w:r>
               <w:rPr>
@@ -1096,10 +1027,9 @@
             <w:rPr>
               <w:rFonts w:eastAsiaTheme="minorEastAsia"/>
               <w:noProof/>
-              <w:lang w:val="en-DE" w:eastAsia="en-DE"/>
             </w:rPr>
           </w:pPr>
-          <w:hyperlink w:anchor="_Toc189926559" w:history="1">
+          <w:hyperlink w:anchor="_Toc190097136" w:history="1">
             <w:r>
               <w:rPr>
                 <w:rStyle w:val="Hyperlink"/>
@@ -1126,7 +1056,7 @@
                 <w:noProof/>
                 <w:webHidden/>
               </w:rPr>
-              <w:instrText xml:space="preserve"> PAGEREF _Toc189926559 \h </w:instrText>
+              <w:instrText xml:space="preserve"> PAGEREF _Toc190097136 \h </w:instrText>
             </w:r>
             <w:r>
               <w:rPr>
@@ -1166,10 +1096,9 @@
             <w:rPr>
               <w:rFonts w:eastAsiaTheme="minorEastAsia"/>
               <w:noProof/>
-              <w:lang w:val="en-DE" w:eastAsia="en-DE"/>
             </w:rPr>
           </w:pPr>
-          <w:hyperlink w:anchor="_Toc189926560" w:history="1">
+          <w:hyperlink w:anchor="_Toc190097137" w:history="1">
             <w:r>
               <w:rPr>
                 <w:rStyle w:val="Hyperlink"/>
@@ -1196,7 +1125,7 @@
                 <w:noProof/>
                 <w:webHidden/>
               </w:rPr>
-              <w:instrText xml:space="preserve"> PAGEREF _Toc189926560 \h </w:instrText>
+              <w:instrText xml:space="preserve"> PAGEREF _Toc190097137 \h </w:instrText>
             </w:r>
             <w:r>
               <w:rPr>
@@ -1236,10 +1165,9 @@
             <w:rPr>
               <w:rFonts w:eastAsiaTheme="minorEastAsia"/>
               <w:noProof/>
-              <w:lang w:val="en-DE" w:eastAsia="en-DE"/>
             </w:rPr>
           </w:pPr>
-          <w:hyperlink w:anchor="_Toc189926561" w:history="1">
+          <w:hyperlink w:anchor="_Toc190097138" w:history="1">
             <w:r>
               <w:rPr>
                 <w:rStyle w:val="Hyperlink"/>
@@ -1266,7 +1194,7 @@
                 <w:noProof/>
                 <w:webHidden/>
               </w:rPr>
-              <w:instrText xml:space="preserve"> PAGEREF _Toc189926561 \h </w:instrText>
+              <w:instrText xml:space="preserve"> PAGEREF _Toc190097138 \h </w:instrText>
             </w:r>
             <w:r>
               <w:rPr>
@@ -1286,7 +1214,7 @@
                 <w:noProof/>
                 <w:webHidden/>
               </w:rPr>
-              <w:t>8</w:t>
+              <w:t>9</w:t>
             </w:r>
             <w:r>
               <w:rPr>
@@ -1306,10 +1234,9 @@
             <w:rPr>
               <w:rFonts w:eastAsiaTheme="minorEastAsia"/>
               <w:noProof/>
-              <w:lang w:val="en-DE" w:eastAsia="en-DE"/>
             </w:rPr>
           </w:pPr>
-          <w:hyperlink w:anchor="_Toc189926562" w:history="1">
+          <w:hyperlink w:anchor="_Toc190097139" w:history="1">
             <w:r>
               <w:rPr>
                 <w:rStyle w:val="Hyperlink"/>
@@ -1336,7 +1263,7 @@
                 <w:noProof/>
                 <w:webHidden/>
               </w:rPr>
-              <w:instrText xml:space="preserve"> PAGEREF _Toc189926562 \h </w:instrText>
+              <w:instrText xml:space="preserve"> PAGEREF _Toc190097139 \h </w:instrText>
             </w:r>
             <w:r>
               <w:rPr>
@@ -1356,7 +1283,7 @@
                 <w:noProof/>
                 <w:webHidden/>
               </w:rPr>
-              <w:t>8</w:t>
+              <w:t>9</w:t>
             </w:r>
             <w:r>
               <w:rPr>
@@ -1376,10 +1303,9 @@
             <w:rPr>
               <w:rFonts w:eastAsiaTheme="minorEastAsia"/>
               <w:noProof/>
-              <w:lang w:val="en-DE" w:eastAsia="en-DE"/>
             </w:rPr>
           </w:pPr>
-          <w:hyperlink w:anchor="_Toc189926563" w:history="1">
+          <w:hyperlink w:anchor="_Toc190097140" w:history="1">
             <w:r>
               <w:rPr>
                 <w:rStyle w:val="Hyperlink"/>
@@ -1406,7 +1332,7 @@
                 <w:noProof/>
                 <w:webHidden/>
               </w:rPr>
-              <w:instrText xml:space="preserve"> PAGEREF _Toc189926563 \h </w:instrText>
+              <w:instrText xml:space="preserve"> PAGEREF _Toc190097140 \h </w:instrText>
             </w:r>
             <w:r>
               <w:rPr>
@@ -1426,7 +1352,7 @@
                 <w:noProof/>
                 <w:webHidden/>
               </w:rPr>
-              <w:t>10</w:t>
+              <w:t>11</w:t>
             </w:r>
             <w:r>
               <w:rPr>
@@ -1446,10 +1372,9 @@
             <w:rPr>
               <w:rFonts w:eastAsiaTheme="minorEastAsia"/>
               <w:noProof/>
-              <w:lang w:val="en-DE" w:eastAsia="en-DE"/>
             </w:rPr>
           </w:pPr>
-          <w:hyperlink w:anchor="_Toc189926564" w:history="1">
+          <w:hyperlink w:anchor="_Toc190097141" w:history="1">
             <w:r>
               <w:rPr>
                 <w:rStyle w:val="Hyperlink"/>
@@ -1476,7 +1401,7 @@
                 <w:noProof/>
                 <w:webHidden/>
               </w:rPr>
-              <w:instrText xml:space="preserve"> PAGEREF _Toc189926564 \h </w:instrText>
+              <w:instrText xml:space="preserve"> PAGEREF _Toc190097141 \h </w:instrText>
             </w:r>
             <w:r>
               <w:rPr>
@@ -1496,7 +1421,7 @@
                 <w:noProof/>
                 <w:webHidden/>
               </w:rPr>
-              <w:t>11</w:t>
+              <w:t>12</w:t>
             </w:r>
             <w:r>
               <w:rPr>
@@ -1516,10 +1441,9 @@
             <w:rPr>
               <w:rFonts w:eastAsiaTheme="minorEastAsia"/>
               <w:noProof/>
-              <w:lang w:val="en-DE" w:eastAsia="en-DE"/>
             </w:rPr>
           </w:pPr>
-          <w:hyperlink w:anchor="_Toc189926565" w:history="1">
+          <w:hyperlink w:anchor="_Toc190097142" w:history="1">
             <w:r>
               <w:rPr>
                 <w:rStyle w:val="Hyperlink"/>
@@ -1546,7 +1470,7 @@
                 <w:noProof/>
                 <w:webHidden/>
               </w:rPr>
-              <w:instrText xml:space="preserve"> PAGEREF _Toc189926565 \h </w:instrText>
+              <w:instrText xml:space="preserve"> PAGEREF _Toc190097142 \h </w:instrText>
             </w:r>
             <w:r>
               <w:rPr>
@@ -1586,10 +1510,9 @@
             <w:rPr>
               <w:rFonts w:eastAsiaTheme="minorEastAsia"/>
               <w:noProof/>
-              <w:lang w:val="en-DE" w:eastAsia="en-DE"/>
             </w:rPr>
           </w:pPr>
-          <w:hyperlink w:anchor="_Toc189926566" w:history="1">
+          <w:hyperlink w:anchor="_Toc190097143" w:history="1">
             <w:r>
               <w:rPr>
                 <w:rStyle w:val="Hyperlink"/>
@@ -1616,7 +1539,7 @@
                 <w:noProof/>
                 <w:webHidden/>
               </w:rPr>
-              <w:instrText xml:space="preserve"> PAGEREF _Toc189926566 \h </w:instrText>
+              <w:instrText xml:space="preserve"> PAGEREF _Toc190097143 \h </w:instrText>
             </w:r>
             <w:r>
               <w:rPr>
@@ -1656,10 +1579,9 @@
             <w:rPr>
               <w:rFonts w:eastAsiaTheme="minorEastAsia"/>
               <w:noProof/>
-              <w:lang w:val="en-DE" w:eastAsia="en-DE"/>
             </w:rPr>
           </w:pPr>
-          <w:hyperlink w:anchor="_Toc189926567" w:history="1">
+          <w:hyperlink w:anchor="_Toc190097144" w:history="1">
             <w:r>
               <w:rPr>
                 <w:rStyle w:val="Hyperlink"/>
@@ -1686,7 +1608,7 @@
                 <w:noProof/>
                 <w:webHidden/>
               </w:rPr>
-              <w:instrText xml:space="preserve"> PAGEREF _Toc189926567 \h </w:instrText>
+              <w:instrText xml:space="preserve"> PAGEREF _Toc190097144 \h </w:instrText>
             </w:r>
             <w:r>
               <w:rPr>
@@ -1706,7 +1628,7 @@
                 <w:noProof/>
                 <w:webHidden/>
               </w:rPr>
-              <w:t>13</w:t>
+              <w:t>14</w:t>
             </w:r>
             <w:r>
               <w:rPr>
@@ -1727,10 +1649,9 @@
             <w:rPr>
               <w:rFonts w:eastAsiaTheme="minorEastAsia"/>
               <w:noProof/>
-              <w:lang w:val="en-DE" w:eastAsia="en-DE"/>
             </w:rPr>
           </w:pPr>
-          <w:hyperlink w:anchor="_Toc189926568" w:history="1">
+          <w:hyperlink w:anchor="_Toc190097145" w:history="1">
             <w:r>
               <w:rPr>
                 <w:rStyle w:val="Hyperlink"/>
@@ -1742,7 +1663,6 @@
               <w:rPr>
                 <w:rFonts w:eastAsiaTheme="minorEastAsia"/>
                 <w:noProof/>
-                <w:lang w:val="en-DE" w:eastAsia="en-DE"/>
               </w:rPr>
               <w:tab/>
             </w:r>
@@ -1772,7 +1692,7 @@
                 <w:noProof/>
                 <w:webHidden/>
               </w:rPr>
-              <w:instrText xml:space="preserve"> PAGEREF _Toc189926568 \h </w:instrText>
+              <w:instrText xml:space="preserve"> PAGEREF _Toc190097145 \h </w:instrText>
             </w:r>
             <w:r>
               <w:rPr>
@@ -1792,7 +1712,7 @@
                 <w:noProof/>
                 <w:webHidden/>
               </w:rPr>
-              <w:t>14</w:t>
+              <w:t>15</w:t>
             </w:r>
             <w:r>
               <w:rPr>
@@ -1812,10 +1732,9 @@
             <w:rPr>
               <w:rFonts w:eastAsiaTheme="minorEastAsia"/>
               <w:noProof/>
-              <w:lang w:val="en-DE" w:eastAsia="en-DE"/>
             </w:rPr>
           </w:pPr>
-          <w:hyperlink w:anchor="_Toc189926569" w:history="1">
+          <w:hyperlink w:anchor="_Toc190097146" w:history="1">
             <w:r>
               <w:rPr>
                 <w:rStyle w:val="Hyperlink"/>
@@ -1842,7 +1761,7 @@
                 <w:noProof/>
                 <w:webHidden/>
               </w:rPr>
-              <w:instrText xml:space="preserve"> PAGEREF _Toc189926569 \h </w:instrText>
+              <w:instrText xml:space="preserve"> PAGEREF _Toc190097146 \h </w:instrText>
             </w:r>
             <w:r>
               <w:rPr>
@@ -1862,7 +1781,7 @@
                 <w:noProof/>
                 <w:webHidden/>
               </w:rPr>
-              <w:t>14</w:t>
+              <w:t>15</w:t>
             </w:r>
             <w:r>
               <w:rPr>
@@ -1882,10 +1801,9 @@
             <w:rPr>
               <w:rFonts w:eastAsiaTheme="minorEastAsia"/>
               <w:noProof/>
-              <w:lang w:val="en-DE" w:eastAsia="en-DE"/>
             </w:rPr>
           </w:pPr>
-          <w:hyperlink w:anchor="_Toc189926570" w:history="1">
+          <w:hyperlink w:anchor="_Toc190097147" w:history="1">
             <w:r>
               <w:rPr>
                 <w:rStyle w:val="Hyperlink"/>
@@ -1912,7 +1830,7 @@
                 <w:noProof/>
                 <w:webHidden/>
               </w:rPr>
-              <w:instrText xml:space="preserve"> PAGEREF _Toc189926570 \h </w:instrText>
+              <w:instrText xml:space="preserve"> PAGEREF _Toc190097147 \h </w:instrText>
             </w:r>
             <w:r>
               <w:rPr>
@@ -1932,7 +1850,7 @@
                 <w:noProof/>
                 <w:webHidden/>
               </w:rPr>
-              <w:t>15</w:t>
+              <w:t>16</w:t>
             </w:r>
             <w:r>
               <w:rPr>
@@ -1952,10 +1870,9 @@
             <w:rPr>
               <w:rFonts w:eastAsiaTheme="minorEastAsia"/>
               <w:noProof/>
-              <w:lang w:val="en-DE" w:eastAsia="en-DE"/>
             </w:rPr>
           </w:pPr>
-          <w:hyperlink w:anchor="_Toc189926571" w:history="1">
+          <w:hyperlink w:anchor="_Toc190097148" w:history="1">
             <w:r>
               <w:rPr>
                 <w:rStyle w:val="Hyperlink"/>
@@ -1982,7 +1899,7 @@
                 <w:noProof/>
                 <w:webHidden/>
               </w:rPr>
-              <w:instrText xml:space="preserve"> PAGEREF _Toc189926571 \h </w:instrText>
+              <w:instrText xml:space="preserve"> PAGEREF _Toc190097148 \h </w:instrText>
             </w:r>
             <w:r>
               <w:rPr>
@@ -2002,7 +1919,7 @@
                 <w:noProof/>
                 <w:webHidden/>
               </w:rPr>
-              <w:t>16</w:t>
+              <w:t>17</w:t>
             </w:r>
             <w:r>
               <w:rPr>
@@ -2022,10 +1939,9 @@
             <w:rPr>
               <w:rFonts w:eastAsiaTheme="minorEastAsia"/>
               <w:noProof/>
-              <w:lang w:val="en-DE" w:eastAsia="en-DE"/>
             </w:rPr>
           </w:pPr>
-          <w:hyperlink w:anchor="_Toc189926572" w:history="1">
+          <w:hyperlink w:anchor="_Toc190097149" w:history="1">
             <w:r>
               <w:rPr>
                 <w:rStyle w:val="Hyperlink"/>
@@ -2052,7 +1968,7 @@
                 <w:noProof/>
                 <w:webHidden/>
               </w:rPr>
-              <w:instrText xml:space="preserve"> PAGEREF _Toc189926572 \h </w:instrText>
+              <w:instrText xml:space="preserve"> PAGEREF _Toc190097149 \h </w:instrText>
             </w:r>
             <w:r>
               <w:rPr>
@@ -2072,7 +1988,7 @@
                 <w:noProof/>
                 <w:webHidden/>
               </w:rPr>
-              <w:t>18</w:t>
+              <w:t>19</w:t>
             </w:r>
             <w:r>
               <w:rPr>
@@ -2093,10 +2009,9 @@
             <w:rPr>
               <w:rFonts w:eastAsiaTheme="minorEastAsia"/>
               <w:noProof/>
-              <w:lang w:val="en-DE" w:eastAsia="en-DE"/>
             </w:rPr>
           </w:pPr>
-          <w:hyperlink w:anchor="_Toc189926573" w:history="1">
+          <w:hyperlink w:anchor="_Toc190097150" w:history="1">
             <w:r>
               <w:rPr>
                 <w:rStyle w:val="Hyperlink"/>
@@ -2108,7 +2023,6 @@
               <w:rPr>
                 <w:rFonts w:eastAsiaTheme="minorEastAsia"/>
                 <w:noProof/>
-                <w:lang w:val="en-DE" w:eastAsia="en-DE"/>
               </w:rPr>
               <w:tab/>
             </w:r>
@@ -2138,7 +2052,7 @@
                 <w:noProof/>
                 <w:webHidden/>
               </w:rPr>
-              <w:instrText xml:space="preserve"> PAGEREF _Toc189926573 \h </w:instrText>
+              <w:instrText xml:space="preserve"> PAGEREF _Toc190097150 \h </w:instrText>
             </w:r>
             <w:r>
               <w:rPr>
@@ -2158,7 +2072,7 @@
                 <w:noProof/>
                 <w:webHidden/>
               </w:rPr>
-              <w:t>18</w:t>
+              <w:t>19</w:t>
             </w:r>
             <w:r>
               <w:rPr>
@@ -2178,10 +2092,9 @@
             <w:rPr>
               <w:rFonts w:eastAsiaTheme="minorEastAsia"/>
               <w:noProof/>
-              <w:lang w:val="en-DE" w:eastAsia="en-DE"/>
             </w:rPr>
           </w:pPr>
-          <w:hyperlink w:anchor="_Toc189926574" w:history="1">
+          <w:hyperlink w:anchor="_Toc190097151" w:history="1">
             <w:r>
               <w:rPr>
                 <w:rStyle w:val="Hyperlink"/>
@@ -2208,7 +2121,7 @@
                 <w:noProof/>
                 <w:webHidden/>
               </w:rPr>
-              <w:instrText xml:space="preserve"> PAGEREF _Toc189926574 \h </w:instrText>
+              <w:instrText xml:space="preserve"> PAGEREF _Toc190097151 \h </w:instrText>
             </w:r>
             <w:r>
               <w:rPr>
@@ -2228,7 +2141,229 @@
                 <w:noProof/>
                 <w:webHidden/>
               </w:rPr>
-              <w:t>18</w:t>
+              <w:t>19</w:t>
+            </w:r>
+            <w:r>
+              <w:rPr>
+                <w:noProof/>
+                <w:webHidden/>
+              </w:rPr>
+              <w:fldChar w:fldCharType="end"/>
+            </w:r>
+          </w:hyperlink>
+        </w:p>
+        <w:p>
+          <w:pPr>
+            <w:pStyle w:val="TOC2"/>
+            <w:tabs>
+              <w:tab w:val="right" w:leader="dot" w:pos="9016"/>
+            </w:tabs>
+            <w:rPr>
+              <w:rFonts w:eastAsiaTheme="minorEastAsia"/>
+              <w:noProof/>
+            </w:rPr>
+          </w:pPr>
+          <w:hyperlink w:anchor="_Toc190097152" w:history="1">
+            <w:r>
+              <w:rPr>
+                <w:rStyle w:val="Hyperlink"/>
+                <w:noProof/>
+              </w:rPr>
+              <w:t>4.2 Compatibility, Versioning and Dependencies</w:t>
+            </w:r>
+            <w:r>
+              <w:rPr>
+                <w:noProof/>
+                <w:webHidden/>
+              </w:rPr>
+              <w:tab/>
+            </w:r>
+            <w:r>
+              <w:rPr>
+                <w:noProof/>
+                <w:webHidden/>
+              </w:rPr>
+              <w:fldChar w:fldCharType="begin"/>
+            </w:r>
+            <w:r>
+              <w:rPr>
+                <w:noProof/>
+                <w:webHidden/>
+              </w:rPr>
+              <w:instrText xml:space="preserve"> PAGEREF _Toc190097152 \h </w:instrText>
+            </w:r>
+            <w:r>
+              <w:rPr>
+                <w:noProof/>
+                <w:webHidden/>
+              </w:rPr>
+            </w:r>
+            <w:r>
+              <w:rPr>
+                <w:noProof/>
+                <w:webHidden/>
+              </w:rPr>
+              <w:fldChar w:fldCharType="separate"/>
+            </w:r>
+            <w:r>
+              <w:rPr>
+                <w:noProof/>
+                <w:webHidden/>
+              </w:rPr>
+              <w:t>20</w:t>
+            </w:r>
+            <w:r>
+              <w:rPr>
+                <w:noProof/>
+                <w:webHidden/>
+              </w:rPr>
+              <w:fldChar w:fldCharType="end"/>
+            </w:r>
+          </w:hyperlink>
+        </w:p>
+        <w:p>
+          <w:pPr>
+            <w:pStyle w:val="TOC2"/>
+            <w:tabs>
+              <w:tab w:val="left" w:pos="960"/>
+              <w:tab w:val="right" w:leader="dot" w:pos="9016"/>
+            </w:tabs>
+            <w:rPr>
+              <w:rFonts w:eastAsiaTheme="minorEastAsia"/>
+              <w:noProof/>
+            </w:rPr>
+          </w:pPr>
+          <w:hyperlink w:anchor="_Toc190097153" w:history="1">
+            <w:r>
+              <w:rPr>
+                <w:rStyle w:val="Hyperlink"/>
+                <w:noProof/>
+              </w:rPr>
+              <w:t>4.3</w:t>
+            </w:r>
+            <w:r>
+              <w:rPr>
+                <w:rFonts w:eastAsiaTheme="minorEastAsia"/>
+                <w:noProof/>
+              </w:rPr>
+              <w:tab/>
+            </w:r>
+            <w:r>
+              <w:rPr>
+                <w:rStyle w:val="Hyperlink"/>
+                <w:noProof/>
+              </w:rPr>
+              <w:t>Real Time Chat Application</w:t>
+            </w:r>
+            <w:r>
+              <w:rPr>
+                <w:noProof/>
+                <w:webHidden/>
+              </w:rPr>
+              <w:tab/>
+            </w:r>
+            <w:r>
+              <w:rPr>
+                <w:noProof/>
+                <w:webHidden/>
+              </w:rPr>
+              <w:fldChar w:fldCharType="begin"/>
+            </w:r>
+            <w:r>
+              <w:rPr>
+                <w:noProof/>
+                <w:webHidden/>
+              </w:rPr>
+              <w:instrText xml:space="preserve"> PAGEREF _Toc190097153 \h </w:instrText>
+            </w:r>
+            <w:r>
+              <w:rPr>
+                <w:noProof/>
+                <w:webHidden/>
+              </w:rPr>
+            </w:r>
+            <w:r>
+              <w:rPr>
+                <w:noProof/>
+                <w:webHidden/>
+              </w:rPr>
+              <w:fldChar w:fldCharType="separate"/>
+            </w:r>
+            <w:r>
+              <w:rPr>
+                <w:noProof/>
+                <w:webHidden/>
+              </w:rPr>
+              <w:t>21</w:t>
+            </w:r>
+            <w:r>
+              <w:rPr>
+                <w:noProof/>
+                <w:webHidden/>
+              </w:rPr>
+              <w:fldChar w:fldCharType="end"/>
+            </w:r>
+          </w:hyperlink>
+        </w:p>
+        <w:p>
+          <w:pPr>
+            <w:pStyle w:val="TOC2"/>
+            <w:tabs>
+              <w:tab w:val="right" w:leader="dot" w:pos="9016"/>
+            </w:tabs>
+            <w:rPr>
+              <w:rFonts w:eastAsiaTheme="minorEastAsia"/>
+              <w:noProof/>
+            </w:rPr>
+          </w:pPr>
+          <w:hyperlink w:anchor="_Toc190097154" w:history="1">
+            <w:r>
+              <w:rPr>
+                <w:rStyle w:val="Hyperlink"/>
+                <w:noProof/>
+              </w:rPr>
+              <w:t>4.4 Designing the UI</w:t>
+            </w:r>
+            <w:r>
+              <w:rPr>
+                <w:noProof/>
+                <w:webHidden/>
+              </w:rPr>
+              <w:tab/>
+            </w:r>
+            <w:r>
+              <w:rPr>
+                <w:noProof/>
+                <w:webHidden/>
+              </w:rPr>
+              <w:fldChar w:fldCharType="begin"/>
+            </w:r>
+            <w:r>
+              <w:rPr>
+                <w:noProof/>
+                <w:webHidden/>
+              </w:rPr>
+              <w:instrText xml:space="preserve"> PAGEREF _Toc190097154 \h </w:instrText>
+            </w:r>
+            <w:r>
+              <w:rPr>
+                <w:noProof/>
+                <w:webHidden/>
+              </w:rPr>
+            </w:r>
+            <w:r>
+              <w:rPr>
+                <w:noProof/>
+                <w:webHidden/>
+              </w:rPr>
+              <w:fldChar w:fldCharType="separate"/>
+            </w:r>
+            <w:r>
+              <w:rPr>
+                <w:noProof/>
+                <w:webHidden/>
+              </w:rPr>
+              <w:t>21</w:t>
             </w:r>
             <w:r>
               <w:rPr>
@@ -2249,10 +2384,9 @@
             <w:rPr>
               <w:rFonts w:eastAsiaTheme="minorEastAsia"/>
               <w:noProof/>
-              <w:lang w:val="en-DE" w:eastAsia="en-DE"/>
             </w:rPr>
           </w:pPr>
-          <w:hyperlink w:anchor="_Toc189926575" w:history="1">
+          <w:hyperlink w:anchor="_Toc190097155" w:history="1">
             <w:r>
               <w:rPr>
                 <w:rStyle w:val="Hyperlink"/>
@@ -2264,7 +2398,6 @@
               <w:rPr>
                 <w:rFonts w:eastAsiaTheme="minorEastAsia"/>
                 <w:noProof/>
-                <w:lang w:val="en-DE" w:eastAsia="en-DE"/>
               </w:rPr>
               <w:tab/>
             </w:r>
@@ -2294,7 +2427,7 @@
                 <w:noProof/>
                 <w:webHidden/>
               </w:rPr>
-              <w:instrText xml:space="preserve"> PAGEREF _Toc189926575 \h </w:instrText>
+              <w:instrText xml:space="preserve"> PAGEREF _Toc190097155 \h </w:instrText>
             </w:r>
             <w:r>
               <w:rPr>
@@ -2314,7 +2447,7 @@
                 <w:noProof/>
                 <w:webHidden/>
               </w:rPr>
-              <w:t>19</w:t>
+              <w:t>22</w:t>
             </w:r>
             <w:r>
               <w:rPr>
@@ -2335,10 +2468,9 @@
             <w:rPr>
               <w:rFonts w:eastAsiaTheme="minorEastAsia"/>
               <w:noProof/>
-              <w:lang w:val="en-DE" w:eastAsia="en-DE"/>
             </w:rPr>
           </w:pPr>
-          <w:hyperlink w:anchor="_Toc189926576" w:history="1">
+          <w:hyperlink w:anchor="_Toc190097156" w:history="1">
             <w:r>
               <w:rPr>
                 <w:rStyle w:val="Hyperlink"/>
@@ -2350,7 +2482,6 @@
               <w:rPr>
                 <w:rFonts w:eastAsiaTheme="minorEastAsia"/>
                 <w:noProof/>
-                <w:lang w:val="en-DE" w:eastAsia="en-DE"/>
               </w:rPr>
               <w:tab/>
             </w:r>
@@ -2380,7 +2511,7 @@
                 <w:noProof/>
                 <w:webHidden/>
               </w:rPr>
-              <w:instrText xml:space="preserve"> PAGEREF _Toc189926576 \h </w:instrText>
+              <w:instrText xml:space="preserve"> PAGEREF _Toc190097156 \h </w:instrText>
             </w:r>
             <w:r>
               <w:rPr>
@@ -2400,7 +2531,7 @@
                 <w:noProof/>
                 <w:webHidden/>
               </w:rPr>
-              <w:t>19</w:t>
+              <w:t>22</w:t>
             </w:r>
             <w:r>
               <w:rPr>
@@ -2425,11 +2556,6 @@
     </w:sdt>
     <w:p>
       <w:pPr>
-        <w:pStyle w:val="Heading1"/>
-      </w:pPr>
-    </w:p>
-    <w:p>
-      <w:pPr>
         <w:jc w:val="center"/>
         <w:rPr>
           <w:b/>
@@ -2441,15 +2567,10 @@
     </w:p>
     <w:p/>
     <w:p>
-      <w:r>
-        <w:br w:type="page"/>
-      </w:r>
-    </w:p>
-    <w:p>
       <w:pPr>
         <w:pStyle w:val="Heading1"/>
       </w:pPr>
-      <w:bookmarkStart w:id="0" w:name="_Toc189926556"/>
+      <w:bookmarkStart w:id="0" w:name="_Toc190097133"/>
       <w:r>
         <w:lastRenderedPageBreak/>
         <w:t>Table of figures</w:t>
@@ -2465,7 +2586,7 @@
         <w:rPr>
           <w:rFonts w:eastAsiaTheme="minorEastAsia"/>
           <w:noProof/>
-          <w:lang w:val="en-DE" w:eastAsia="en-DE"/>
+          <w:lang/>
         </w:rPr>
       </w:pPr>
       <w:r>
@@ -2544,7 +2665,7 @@
         <w:rPr>
           <w:rFonts w:eastAsiaTheme="minorEastAsia"/>
           <w:noProof/>
-          <w:lang w:val="en-DE" w:eastAsia="en-DE"/>
+          <w:lang/>
         </w:rPr>
       </w:pPr>
       <w:hyperlink w:anchor="_Toc189945506" w:history="1">
@@ -2614,7 +2735,7 @@
         <w:rPr>
           <w:rFonts w:eastAsiaTheme="minorEastAsia"/>
           <w:noProof/>
-          <w:lang w:val="en-DE" w:eastAsia="en-DE"/>
+          <w:lang/>
         </w:rPr>
       </w:pPr>
       <w:hyperlink w:anchor="_Toc189945507" w:history="1">
@@ -2692,7 +2813,7 @@
         <w:rPr>
           <w:rFonts w:eastAsiaTheme="minorEastAsia"/>
           <w:noProof/>
-          <w:lang w:val="en-DE" w:eastAsia="en-DE"/>
+          <w:lang/>
         </w:rPr>
       </w:pPr>
       <w:hyperlink w:anchor="_Toc189945508" w:history="1">
@@ -2762,7 +2883,7 @@
         <w:rPr>
           <w:rFonts w:eastAsiaTheme="minorEastAsia"/>
           <w:noProof/>
-          <w:lang w:val="en-DE" w:eastAsia="en-DE"/>
+          <w:lang/>
         </w:rPr>
       </w:pPr>
       <w:hyperlink w:anchor="_Toc189945509" w:history="1">
@@ -2832,7 +2953,7 @@
         <w:rPr>
           <w:rFonts w:eastAsiaTheme="minorEastAsia"/>
           <w:noProof/>
-          <w:lang w:val="en-DE" w:eastAsia="en-DE"/>
+          <w:lang/>
         </w:rPr>
       </w:pPr>
       <w:hyperlink w:anchor="_Toc189945510" w:history="1">
@@ -2902,7 +3023,7 @@
         <w:rPr>
           <w:rFonts w:eastAsiaTheme="minorEastAsia"/>
           <w:noProof/>
-          <w:lang w:val="en-DE" w:eastAsia="en-DE"/>
+          <w:lang/>
         </w:rPr>
       </w:pPr>
       <w:hyperlink w:anchor="_Toc189945511" w:history="1">
@@ -2972,7 +3093,7 @@
         <w:rPr>
           <w:rFonts w:eastAsiaTheme="minorEastAsia"/>
           <w:noProof/>
-          <w:lang w:val="en-DE" w:eastAsia="en-DE"/>
+          <w:lang/>
         </w:rPr>
       </w:pPr>
       <w:hyperlink w:anchor="_Toc189945512" w:history="1">
@@ -3042,7 +3163,7 @@
         <w:rPr>
           <w:rFonts w:eastAsiaTheme="minorEastAsia"/>
           <w:noProof/>
-          <w:lang w:val="en-DE" w:eastAsia="en-DE"/>
+          <w:lang/>
         </w:rPr>
       </w:pPr>
       <w:hyperlink w:anchor="_Toc189945513" w:history="1">
@@ -3112,7 +3233,7 @@
         <w:rPr>
           <w:rFonts w:eastAsiaTheme="minorEastAsia"/>
           <w:noProof/>
-          <w:lang w:val="en-DE" w:eastAsia="en-DE"/>
+          <w:lang/>
         </w:rPr>
       </w:pPr>
       <w:hyperlink w:anchor="_Toc189945514" w:history="1">
@@ -3182,7 +3303,7 @@
         <w:rPr>
           <w:rFonts w:eastAsiaTheme="minorEastAsia"/>
           <w:noProof/>
-          <w:lang w:val="en-DE" w:eastAsia="en-DE"/>
+          <w:lang/>
         </w:rPr>
       </w:pPr>
       <w:hyperlink w:anchor="_Toc189945515" w:history="1">
@@ -3252,7 +3373,7 @@
         <w:rPr>
           <w:rFonts w:eastAsiaTheme="minorEastAsia"/>
           <w:noProof/>
-          <w:lang w:val="en-DE" w:eastAsia="en-DE"/>
+          <w:lang/>
         </w:rPr>
       </w:pPr>
       <w:hyperlink w:anchor="_Toc189945516" w:history="1">
@@ -3322,7 +3443,7 @@
         <w:rPr>
           <w:rFonts w:eastAsiaTheme="minorEastAsia"/>
           <w:noProof/>
-          <w:lang w:val="en-DE" w:eastAsia="en-DE"/>
+          <w:lang/>
         </w:rPr>
       </w:pPr>
       <w:hyperlink w:anchor="_Toc189945517" w:history="1">
@@ -3392,7 +3513,7 @@
         <w:rPr>
           <w:rFonts w:eastAsiaTheme="minorEastAsia"/>
           <w:noProof/>
-          <w:lang w:val="en-DE" w:eastAsia="en-DE"/>
+          <w:lang/>
         </w:rPr>
       </w:pPr>
       <w:hyperlink w:anchor="_Toc189945518" w:history="1">
@@ -3462,7 +3583,7 @@
         <w:rPr>
           <w:rFonts w:eastAsiaTheme="minorEastAsia"/>
           <w:noProof/>
-          <w:lang w:val="en-DE" w:eastAsia="en-DE"/>
+          <w:lang/>
         </w:rPr>
       </w:pPr>
       <w:hyperlink w:anchor="_Toc189945519" w:history="1">
@@ -3532,7 +3653,7 @@
         <w:rPr>
           <w:rFonts w:eastAsiaTheme="minorEastAsia"/>
           <w:noProof/>
-          <w:lang w:val="en-DE" w:eastAsia="en-DE"/>
+          <w:lang/>
         </w:rPr>
       </w:pPr>
       <w:hyperlink w:anchor="_Toc189945520" w:history="1">
@@ -3609,7 +3730,7 @@
           <w:numId w:val="2"/>
         </w:numPr>
       </w:pPr>
-      <w:bookmarkStart w:id="1" w:name="_Toc189926557"/>
+      <w:bookmarkStart w:id="1" w:name="_Toc190097134"/>
       <w:r>
         <w:lastRenderedPageBreak/>
         <w:t>Introduction</w:t>
@@ -3656,33 +3777,17 @@
       </w:r>
       <w:proofErr w:type="gramEnd"/>
       <w:r>
-        <w:t xml:space="preserve"> the scientific and mathematical world of AI, without having to understand any of the complex structure behind it. For most of us ChatGPT has become an irreplaceable companion that helps us in our everyday tasks. Especially for university </w:t>
+        <w:t xml:space="preserve"> the scientific and mathematical world of AI, without having to understand any of the complex structure behind it. For most of us ChatGPT has become an irreplaceable companion that helps us in our everyday tasks. Especially for university students this technology became a brand-new way of learning and understanding complex concepts in every branch of research</w:t>
+      </w:r>
+      <w:r>
+        <w:t xml:space="preserve">. But as popular as AI is, it is also a highly controversial topic. Many fear the rise of AI, as it has the potential to become a lot smarter than us. Although, there a </w:t>
       </w:r>
       <w:proofErr w:type="gramStart"/>
       <w:r>
-        <w:t>students</w:t>
+        <w:t>valid reasons</w:t>
       </w:r>
       <w:proofErr w:type="gramEnd"/>
       <w:r>
-        <w:t xml:space="preserve"> this technology became a brand-new way of learning and understanding complex concepts in every branch of research</w:t>
-      </w:r>
-      <w:r>
-        <w:t xml:space="preserve">. But as popular as AI is, it is also a highly controversial topic. Many fear the rise of AI, as it has the potential to become a lot smarter than us. </w:t>
-      </w:r>
-      <w:proofErr w:type="gramStart"/>
-      <w:r>
-        <w:t>Although,</w:t>
-      </w:r>
-      <w:proofErr w:type="gramEnd"/>
-      <w:r>
-        <w:t xml:space="preserve"> there a </w:t>
-      </w:r>
-      <w:proofErr w:type="gramStart"/>
-      <w:r>
-        <w:t>valid reasons</w:t>
-      </w:r>
-      <w:proofErr w:type="gramEnd"/>
-      <w:r>
         <w:t xml:space="preserve"> for this fear, a bigger problem right now stems from the fact that most people discussing this topic do not actually understand how AIs like ChatGPT work</w:t>
       </w:r>
       <w:r>
@@ -3712,15 +3817,7 @@
         <w:t>d</w:t>
       </w:r>
       <w:r>
-        <w:t xml:space="preserve"> will be discussed in this report. Furthermore, this report serves as a first dive into the strange and scientific world of AI, that we as </w:t>
-      </w:r>
-      <w:proofErr w:type="gramStart"/>
-      <w:r>
-        <w:t>team</w:t>
-      </w:r>
-      <w:proofErr w:type="gramEnd"/>
-      <w:r>
-        <w:t xml:space="preserve"> began diving into since the start of this semester (October 2024). </w:t>
+        <w:t xml:space="preserve"> will be discussed in this report. Furthermore, this report serves as a first dive into the strange and scientific world of AI, that we as team began diving into since the start of this semester (October 2024). </w:t>
       </w:r>
     </w:p>
     <w:p/>
@@ -3733,7 +3830,7 @@
           <w:numId w:val="2"/>
         </w:numPr>
       </w:pPr>
-      <w:bookmarkStart w:id="2" w:name="_Toc189926558"/>
+      <w:bookmarkStart w:id="2" w:name="_Toc190097135"/>
       <w:r>
         <w:lastRenderedPageBreak/>
         <w:t>What is our app?</w:t>
@@ -3751,22 +3848,14 @@
         <w:t xml:space="preserve"> </w:t>
       </w:r>
       <w:r>
-        <w:t xml:space="preserve">she can select another user: Bilal. Then our AI analyses the description that Bilal wrote about himself and </w:t>
+        <w:t xml:space="preserve">she can select another user: Bilal. Then our AI analyses the description that Bilal wrote about himself and suggests Laura a few </w:t>
       </w:r>
       <w:proofErr w:type="gramStart"/>
       <w:r>
-        <w:t>suggests</w:t>
+        <w:t>potential</w:t>
       </w:r>
       <w:proofErr w:type="gramEnd"/>
       <w:r>
-        <w:t xml:space="preserve"> Laura a few </w:t>
-      </w:r>
-      <w:proofErr w:type="gramStart"/>
-      <w:r>
-        <w:t>potential</w:t>
-      </w:r>
-      <w:proofErr w:type="gramEnd"/>
-      <w:r>
         <w:t xml:space="preserve"> first messages she can send to Bilal. For instance: Bilal wrote about himself that he likes boxing, so a potential first message may be: “Boxing is so nerve-wrecking. Who is your </w:t>
       </w:r>
       <w:proofErr w:type="spellStart"/>
@@ -3778,22 +3867,14 @@
         <w:t xml:space="preserve"> Boxer?” Laura selects this Icebreaker and sends it as a first message. A new chat now exists between Laura and Bilal. Here they can spend as much time texting each other as they want and best of all, only they know </w:t>
       </w:r>
       <w:r>
-        <w:t xml:space="preserve">the content of their conversation. Because we value user privacy, we want this chatting feature to be </w:t>
-      </w:r>
-      <w:proofErr w:type="gramStart"/>
-      <w:r>
-        <w:t>end-to-end encrypted</w:t>
-      </w:r>
-      <w:proofErr w:type="gramEnd"/>
-      <w:r>
-        <w:t xml:space="preserve">, this means only Laura and Bilal have the means to decrypt the exchanged messages. </w:t>
+        <w:t xml:space="preserve">the content of their conversation. Because we value user privacy, we want this chatting feature to be end-to-end encrypted, this means only Laura and Bilal have the means to decrypt the exchanged messages. </w:t>
       </w:r>
     </w:p>
     <w:p>
       <w:pPr>
         <w:pStyle w:val="Heading2"/>
       </w:pPr>
-      <w:bookmarkStart w:id="3" w:name="_Toc189926559"/>
+      <w:bookmarkStart w:id="3" w:name="_Toc190097136"/>
       <w:r>
         <w:t xml:space="preserve">2.1 </w:t>
       </w:r>
@@ -4047,15 +4128,7 @@
         <w:t xml:space="preserve"> </w:t>
       </w:r>
       <w:r>
-        <w:t xml:space="preserve">Users can </w:t>
-      </w:r>
-      <w:proofErr w:type="gramStart"/>
-      <w:r>
-        <w:t>logout</w:t>
-      </w:r>
-      <w:proofErr w:type="gramEnd"/>
-      <w:r>
-        <w:t xml:space="preserve"> manually </w:t>
+        <w:t xml:space="preserve">Users can logout manually </w:t>
       </w:r>
     </w:p>
     <w:p>
@@ -4074,7 +4147,7 @@
       <w:pPr>
         <w:pStyle w:val="Heading2"/>
       </w:pPr>
-      <w:bookmarkStart w:id="4" w:name="_Toc189926560"/>
+      <w:bookmarkStart w:id="4" w:name="_Toc190097137"/>
       <w:r>
         <w:lastRenderedPageBreak/>
         <w:t xml:space="preserve">2.2 </w:t>
@@ -4085,9 +4158,6 @@
       <w:bookmarkEnd w:id="4"/>
     </w:p>
     <w:p>
-      <w:pPr>
-        <w:pStyle w:val="Heading2"/>
-      </w:pPr>
       <w:r>
         <w:rPr>
           <w:noProof/>
@@ -4167,16 +4237,11 @@
     <w:p/>
     <w:p>
       <w:r>
-        <w:t xml:space="preserve">When accessing the website users first </w:t>
-      </w:r>
-      <w:proofErr w:type="gramStart"/>
-      <w:r>
-        <w:t>meet</w:t>
+        <w:t>When accessing the website users first meet</w:t>
       </w:r>
       <w:r>
         <w:t>s</w:t>
       </w:r>
-      <w:proofErr w:type="gramEnd"/>
       <w:r>
         <w:t xml:space="preserve"> a login screen, here they can choose to create a new account or sign in with an existing one. Users can also choose which language the prefer: German or English. </w:t>
       </w:r>
@@ -4661,15 +4726,7 @@
     <w:p/>
     <w:p>
       <w:r>
-        <w:t xml:space="preserve">After that the user is greeted with </w:t>
-      </w:r>
-      <w:proofErr w:type="gramStart"/>
-      <w:r>
-        <w:t>following</w:t>
-      </w:r>
-      <w:proofErr w:type="gramEnd"/>
-      <w:r>
-        <w:t xml:space="preserve"> screen </w:t>
+        <w:t xml:space="preserve">After that the user is greeted with following screen </w:t>
       </w:r>
     </w:p>
     <w:p>
@@ -4775,15 +4832,7 @@
       <w:proofErr w:type="spellEnd"/>
       <w:proofErr w:type="gramEnd"/>
       <w:r>
-        <w:t xml:space="preserve"> the user sees various </w:t>
-      </w:r>
-      <w:proofErr w:type="gramStart"/>
-      <w:r>
-        <w:t>messages as</w:t>
-      </w:r>
-      <w:proofErr w:type="gramEnd"/>
-      <w:r>
-        <w:t xml:space="preserve"> to distract him/her from the passing time. </w:t>
+        <w:t xml:space="preserve"> the user sees various messages as to distract him/her from the passing time. </w:t>
       </w:r>
     </w:p>
     <w:p>
@@ -4960,15 +5009,7 @@
     <w:p/>
     <w:p>
       <w:r>
-        <w:t xml:space="preserve">When a user sends </w:t>
-      </w:r>
-      <w:proofErr w:type="gramStart"/>
-      <w:r>
-        <w:t>a first</w:t>
-      </w:r>
-      <w:proofErr w:type="gramEnd"/>
-      <w:r>
-        <w:t xml:space="preserve"> message a chat is created this chat can be views, when the user clicks on chat overview. </w:t>
+        <w:t xml:space="preserve">When a user sends a first message a chat is created this chat can be views, when the user clicks on chat overview. </w:t>
       </w:r>
     </w:p>
     <w:p>
@@ -5085,7 +5126,7 @@
       <w:pPr>
         <w:pStyle w:val="Heading2"/>
       </w:pPr>
-      <w:bookmarkStart w:id="33" w:name="_Toc189926561"/>
+      <w:bookmarkStart w:id="33" w:name="_Toc190097138"/>
       <w:r>
         <w:t xml:space="preserve">2.3 </w:t>
       </w:r>
@@ -5098,7 +5139,7 @@
       <w:pPr>
         <w:pStyle w:val="Heading3"/>
       </w:pPr>
-      <w:bookmarkStart w:id="34" w:name="_Toc189926562"/>
+      <w:bookmarkStart w:id="34" w:name="_Toc190097139"/>
       <w:r>
         <w:t xml:space="preserve">2.3.1 </w:t>
       </w:r>
@@ -5112,15 +5153,7 @@
         <w:t>The feature is a fine-tuned version of the pretrained gpt2-medium model.</w:t>
       </w:r>
       <w:r>
-        <w:t xml:space="preserve"> In the following it will </w:t>
-      </w:r>
-      <w:proofErr w:type="gramStart"/>
-      <w:r>
-        <w:t>be described</w:t>
-      </w:r>
-      <w:proofErr w:type="gramEnd"/>
-      <w:r>
-        <w:t xml:space="preserve"> step-by-step</w:t>
+        <w:t xml:space="preserve"> In the following it will be described step-by-step</w:t>
       </w:r>
       <w:r>
         <w:t xml:space="preserve"> how generative AIs work and how we can leverage that for our</w:t>
@@ -5173,15 +5206,7 @@
         <w:t>), which returns 0 for negative inputs and the input itself for positive values. This final output is called the neuron’s activation, loosely inspired by biological neurons that ‘fire’ when their input crosses a threshold.</w:t>
       </w:r>
       <w:r>
-        <w:t xml:space="preserve"> </w:t>
-      </w:r>
-      <w:proofErr w:type="gramStart"/>
-      <w:r>
-        <w:t>This described</w:t>
-      </w:r>
-      <w:proofErr w:type="gramEnd"/>
-      <w:r>
-        <w:t xml:space="preserve"> process is then repeated x times. At last, there is an output, also called a “prediction”, (for example there may be 10 outputs representing the numbers 0-9</w:t>
+        <w:t xml:space="preserve"> This described process is then repeated x times. At last, there is an output, also called a “prediction”, (for example there may be 10 outputs representing the numbers 0-9</w:t>
       </w:r>
       <w:r>
         <w:t>,</w:t>
@@ -5190,15 +5215,7 @@
         <w:t xml:space="preserve"> the neuron with the highest number at the end represents the predicted number by the neural network). As expected at first this expected output will not make any sense but that is why we need to train the AI. In the training process we know the desired output for each </w:t>
       </w:r>
       <w:r>
-        <w:t xml:space="preserve">input. We then compare each predicted output with the actual output. We can use functions </w:t>
-      </w:r>
-      <w:proofErr w:type="gramStart"/>
-      <w:r>
-        <w:t>like mean</w:t>
-      </w:r>
-      <w:proofErr w:type="gramEnd"/>
-      <w:r>
-        <w:t xml:space="preserve"> squared error, to estimate how bad the prediction </w:t>
+        <w:t xml:space="preserve">input. We then compare each predicted output with the actual output. We can use functions like mean squared error, to estimate how bad the prediction </w:t>
       </w:r>
       <w:proofErr w:type="gramStart"/>
       <w:r>
@@ -5332,15 +5349,7 @@
         <w:t>a high probability means a strong relevance between tokens</w:t>
       </w:r>
       <w:r>
-        <w:t xml:space="preserve">). This in turn is multiplied by the value vectors; by learning how closely each of the embedding vectors are, the AI can learn the structure of the sentences. If the AI models </w:t>
-      </w:r>
-      <w:proofErr w:type="gramStart"/>
-      <w:r>
-        <w:t>is</w:t>
-      </w:r>
-      <w:proofErr w:type="gramEnd"/>
-      <w:r>
-        <w:t xml:space="preserve"> fed with a lot of sentences and information, it could thus, learn its structure and reproduce it. This is the magic behind how ChatGPT </w:t>
+        <w:t xml:space="preserve">). This in turn is multiplied by the value vectors; by learning how closely each of the embedding vectors are, the AI can learn the structure of the sentences. If the AI models is fed with a lot of sentences and information, it could thus, learn its structure and reproduce it. This is the magic behind how ChatGPT </w:t>
       </w:r>
       <w:proofErr w:type="gramStart"/>
       <w:r>
@@ -5428,25 +5437,17 @@
         <w:t>like</w:t>
       </w:r>
       <w:r>
-        <w:t xml:space="preserve"> a way of teaching gpt2-medium the different possibilities for icebreakers for a given user profile. But now we know that this will </w:t>
+        <w:t xml:space="preserve"> a way of teaching gpt2-medium the different possibilities for icebreakers for a given user profile. But now we know that this will no work as the model will learn contradicting relationships between the tokens and would not be able to produce valid output. Thus, a better structure would be “Profile A- Icebreaker 1- Icebreaker 2.... Profile B- Icebreaker 1....”. With this structure the model will learn all icebreakers corresponding to one user profile. This learned knowledge is then captured in its updated weights, these are used to then predict several icebreakers for new profiles written by users of our app. This works </w:t>
       </w:r>
       <w:proofErr w:type="gramStart"/>
       <w:r>
-        <w:t>no</w:t>
+        <w:t xml:space="preserve">pretty </w:t>
+      </w:r>
+      <w:r>
+        <w:t>well</w:t>
       </w:r>
       <w:proofErr w:type="gramEnd"/>
       <w:r>
-        <w:t xml:space="preserve"> work as the model will learn contradicting relationships between the tokens and would not be able to produce valid output. Thus, a better structure would be “Profile A- Icebreaker 1- Icebreaker 2.... Profile B- Icebreaker 1....”. With this structure the model will learn all icebreakers corresponding to one user profile. This learned knowledge is then captured in its updated weights, these are used to then predict several icebreakers for new profiles written by users of our app. This works </w:t>
-      </w:r>
-      <w:proofErr w:type="gramStart"/>
-      <w:r>
-        <w:t xml:space="preserve">pretty </w:t>
-      </w:r>
-      <w:r>
-        <w:t>well</w:t>
-      </w:r>
-      <w:proofErr w:type="gramEnd"/>
-      <w:r>
         <w:t>;</w:t>
       </w:r>
       <w:r>
@@ -5457,7 +5458,7 @@
       <w:pPr>
         <w:pStyle w:val="Heading3"/>
       </w:pPr>
-      <w:bookmarkStart w:id="35" w:name="_Toc189926563"/>
+      <w:bookmarkStart w:id="35" w:name="_Toc190097140"/>
       <w:r>
         <w:t xml:space="preserve">2.3.2 </w:t>
       </w:r>
@@ -5468,15 +5469,7 @@
     </w:p>
     <w:p>
       <w:r>
-        <w:t xml:space="preserve">During the discussion, as to how this app shall look like, we derived that it is extremely important that each chat is end-to-end encrypted. The first reason </w:t>
-      </w:r>
-      <w:proofErr w:type="gramStart"/>
-      <w:r>
-        <w:t>is,</w:t>
-      </w:r>
-      <w:proofErr w:type="gramEnd"/>
-      <w:r>
-        <w:t xml:space="preserve"> that users may not want the server or the provider of the app to know the contents of their conversations </w:t>
+        <w:t xml:space="preserve">During the discussion, as to how this app shall look like, we derived that it is extremely important that each chat is end-to-end encrypted. The first reason is, that users may not want the server or the provider of the app to know the contents of their conversations </w:t>
       </w:r>
       <w:r>
         <w:t>and secondly the messages are saved on servers, if they are stored as plaintext, an attacker hijacking the servers may find out all contents of each conversation. Therefore, we needed a way to prevent this. Upon creating an account, the user creates a passphrase and a magic number. The passphrase alongside the magic number is put into a hash function and only the hash value alongside the magic number (also called salt) is saved on the server. A hash function is used so that hash(</w:t>
@@ -5489,79 +5482,55 @@
       <w:proofErr w:type="spellEnd"/>
       <w:proofErr w:type="gramEnd"/>
       <w:r>
-        <w:t xml:space="preserve">) = x is easy but the reverse is computationally infeasible. Then in the </w:t>
+        <w:t>) = x is easy but the reverse is computationally infeasible. Then in the frontend a new public/private key pair is generated. The private key is encrypted with passphrase to the power of magic number modulo 10^12+33.</w:t>
+      </w:r>
+      <w:r>
+        <w:t xml:space="preserve"> (A modulo value large enough, so that brute force attacks are infeasible).</w:t>
+      </w:r>
+      <w:r>
+        <w:t xml:space="preserve"> The keypair is then uploaded to the server. When starting a new chat, the </w:t>
+      </w:r>
+      <w:r>
+        <w:t>frontend</w:t>
+      </w:r>
+      <w:r>
+        <w:t xml:space="preserve"> retrieves the public key of the recipient (which is not encrypted) and generates a symmetric key, </w:t>
+      </w:r>
+      <w:r>
+        <w:t xml:space="preserve">then it </w:t>
+      </w:r>
+      <w:r>
+        <w:t>encrypts the first message with the symmetric key and then in turn encrypts the symmetric key twice. Once with his public key and once with the public key of the recipient.</w:t>
+      </w:r>
+      <w:r>
+        <w:t xml:space="preserve"> These encrypted symmetric keys are uploaded to the server.</w:t>
+      </w:r>
+      <w:r>
+        <w:t xml:space="preserve"> When</w:t>
+      </w:r>
+      <w:r>
+        <w:t xml:space="preserve"> the recipient logs into the website he/she </w:t>
       </w:r>
       <w:proofErr w:type="gramStart"/>
       <w:r>
-        <w:t>frontend</w:t>
+        <w:t>has to</w:t>
       </w:r>
       <w:proofErr w:type="gramEnd"/>
       <w:r>
-        <w:t xml:space="preserve"> a new public/private key pair is generated. The private key is encrypted with passphrase to the power of magic number modulo 10^12+33.</w:t>
-      </w:r>
-      <w:r>
-        <w:t xml:space="preserve"> (A modulo value large enough, so that brute force attacks are infeasible).</w:t>
-      </w:r>
-      <w:r>
-        <w:t xml:space="preserve"> The keypair is then uploaded to the server. When starting a new chat, the </w:t>
-      </w:r>
-      <w:r>
-        <w:t>frontend</w:t>
-      </w:r>
-      <w:r>
-        <w:t xml:space="preserve"> retrieves the public key of the recipient (which is not encrypted) and generates a symmetric key, </w:t>
-      </w:r>
-      <w:r>
-        <w:t xml:space="preserve">then it </w:t>
-      </w:r>
-      <w:r>
-        <w:t>encrypts the first message with the symmetric key and then in turn encrypts the symmetric key twice. Once with his public key and once with the public key of the recipient.</w:t>
-      </w:r>
-      <w:r>
-        <w:t xml:space="preserve"> These encrypted symmetric keys are uploaded to the server.</w:t>
-      </w:r>
-      <w:r>
-        <w:t xml:space="preserve"> When</w:t>
-      </w:r>
-      <w:r>
-        <w:t xml:space="preserve"> the recipient logs into the website he/she </w:t>
-      </w:r>
-      <w:proofErr w:type="gramStart"/>
-      <w:r>
-        <w:t>has to</w:t>
-      </w:r>
-      <w:proofErr w:type="gramEnd"/>
-      <w:r>
-        <w:t xml:space="preserve"> type in the passphrase, the output hash is compared to the one stored on the server if they match, he/she is permitted to enter. His/her encrypted private key is fetched from the server, in the </w:t>
-      </w:r>
-      <w:proofErr w:type="gramStart"/>
-      <w:r>
-        <w:t>frontend</w:t>
-      </w:r>
-      <w:proofErr w:type="gramEnd"/>
-      <w:r>
-        <w:t xml:space="preserve"> the passphrase is used to decrypt it. Now he/she can go to the new chat. For this, the symmetric key (encrypted with this user’s public key) is fetched, the decrypted private key is used to decrypt the symmetric key, then the symmetric key is used to decrypt the new message. This lengthy process is only needed in the beginning, from the moment the user fetched the symmetric key for this chat, the key is saved in the local cache and used for encrypting/decrypting all messages during the session. (Referring to the period where the user uses our website</w:t>
+        <w:t xml:space="preserve"> type in the passphrase, the output hash is compared to the one stored on the server if they match, he/she is permitted to enter. His/her encrypted private key is fetched from the server, in the frontend the passphrase is used to decrypt it. Now he/she can go to the new chat. For this, the symmetric key (encrypted with this user’s public key) is fetched, the decrypted private key is used to decrypt the symmetric key, then the symmetric key is used to decrypt the new message. This lengthy process is only needed in the beginning, from the moment the user fetched the symmetric key for this chat, the key is saved in the local cache and used for encrypting/decrypting all messages during the session. (Referring to the period where the user uses our website</w:t>
       </w:r>
       <w:r>
         <w:t xml:space="preserve">; </w:t>
       </w:r>
       <w:r>
-        <w:t xml:space="preserve">a session </w:t>
-      </w:r>
-      <w:proofErr w:type="gramStart"/>
-      <w:r>
-        <w:t>terminates,</w:t>
-      </w:r>
-      <w:proofErr w:type="gramEnd"/>
-      <w:r>
-        <w:t xml:space="preserve"> if a user is inactive or logs out). </w:t>
+        <w:t xml:space="preserve">a session terminates, if a user is inactive or logs out). </w:t>
       </w:r>
     </w:p>
     <w:p>
       <w:pPr>
         <w:pStyle w:val="Heading3"/>
       </w:pPr>
-      <w:bookmarkStart w:id="36" w:name="_Toc189926564"/>
+      <w:bookmarkStart w:id="36" w:name="_Toc190097141"/>
       <w:r>
         <w:lastRenderedPageBreak/>
         <w:t xml:space="preserve">2.3.3 </w:t>
@@ -5578,15 +5547,7 @@
     </w:p>
     <w:p>
       <w:r>
-        <w:t xml:space="preserve">We started exploring other options and came across the publish-subscribe architecture. In this setup, an event automatically sends notifications to </w:t>
-      </w:r>
-      <w:proofErr w:type="gramStart"/>
-      <w:r>
-        <w:t>everyone</w:t>
-      </w:r>
-      <w:proofErr w:type="gramEnd"/>
-      <w:r>
-        <w:t xml:space="preserve"> subscribed to it. However, since we were working across two different platforms, implementing this wasn’t straightforward. After some research, we found a great solution </w:t>
+        <w:t xml:space="preserve">We started exploring other options and came across the publish-subscribe architecture. In this setup, an event automatically sends notifications to everyone subscribed to it. However, since we were working across two different platforms, implementing this wasn’t straightforward. After some research, we found a great solution </w:t>
       </w:r>
       <w:r>
         <w:t>using WebSocket</w:t>
@@ -5603,15 +5564,7 @@
         <w:t>e user</w:t>
       </w:r>
       <w:r>
-        <w:t>, and the user is subscribed to it. The queues follow a standard structure, like user/</w:t>
-      </w:r>
-      <w:proofErr w:type="gramStart"/>
-      <w:r>
-        <w:t>queue/{</w:t>
-      </w:r>
-      <w:proofErr w:type="gramEnd"/>
-      <w:r>
-        <w:t>username}/messages. This consistency allows the server to automatically create queues even if they don’t already exist.</w:t>
+        <w:t>, and the user is subscribed to it. The queues follow a standard structure, like user/queue/{username}/messages. This consistency allows the server to automatically create queues even if they don’t already exist.</w:t>
       </w:r>
     </w:p>
     <w:p>
@@ -5640,7 +5593,7 @@
       <w:pPr>
         <w:pStyle w:val="Heading3"/>
       </w:pPr>
-      <w:bookmarkStart w:id="37" w:name="_Toc189926565"/>
+      <w:bookmarkStart w:id="37" w:name="_Toc190097142"/>
       <w:r>
         <w:t xml:space="preserve">2.3.4 </w:t>
       </w:r>
@@ -5678,23 +5631,7 @@
           <w:b/>
           <w:bCs/>
         </w:rPr>
-        <w:t>2</w:t>
-      </w:r>
-      <w:proofErr w:type="gramStart"/>
-      <w:r>
-        <w:rPr>
-          <w:b/>
-          <w:bCs/>
-        </w:rPr>
-        <w:t>.  Leverage</w:t>
-      </w:r>
-      <w:proofErr w:type="gramEnd"/>
-      <w:r>
-        <w:rPr>
-          <w:b/>
-          <w:bCs/>
-        </w:rPr>
-        <w:t xml:space="preserve"> an open-source authentication microservice to handle these tasks efficiently.</w:t>
+        <w:t>2.  Leverage an open-source authentication microservice to handle these tasks efficiently.</w:t>
       </w:r>
     </w:p>
     <w:p>
@@ -5728,15 +5665,7 @@
     </w:p>
     <w:p>
       <w:r>
-        <w:t xml:space="preserve">The core functionality we implemented involves checking for an authentication </w:t>
-      </w:r>
-      <w:proofErr w:type="gramStart"/>
-      <w:r>
-        <w:t>token</w:t>
-      </w:r>
-      <w:proofErr w:type="gramEnd"/>
-      <w:r>
-        <w:t xml:space="preserve"> in every outgoing request to the backend. If a request lacks a valid token, the user is automatically redirected to the login page.</w:t>
+        <w:t>The core functionality we implemented involves checking for an authentication token in every outgoing request to the backend. If a request lacks a valid token, the user is automatically redirected to the login page.</w:t>
       </w:r>
     </w:p>
     <w:p>
@@ -5977,7 +5906,7 @@
       <w:pPr>
         <w:pStyle w:val="Heading3"/>
       </w:pPr>
-      <w:bookmarkStart w:id="41" w:name="_Toc189926566"/>
+      <w:bookmarkStart w:id="41" w:name="_Toc190097143"/>
       <w:r>
         <w:t xml:space="preserve">2.3.5 </w:t>
       </w:r>
@@ -6351,7 +6280,7 @@
       <w:pPr>
         <w:pStyle w:val="Heading3"/>
       </w:pPr>
-      <w:bookmarkStart w:id="42" w:name="_Toc189926567"/>
+      <w:bookmarkStart w:id="42" w:name="_Toc190097144"/>
       <w:r>
         <w:t xml:space="preserve">2.3.6 </w:t>
       </w:r>
@@ -6479,7 +6408,7 @@
           <w:numId w:val="2"/>
         </w:numPr>
       </w:pPr>
-      <w:bookmarkStart w:id="43" w:name="_Toc189926568"/>
+      <w:bookmarkStart w:id="43" w:name="_Toc190097145"/>
       <w:r>
         <w:lastRenderedPageBreak/>
         <w:t>Architecture</w:t>
@@ -6490,7 +6419,7 @@
       <w:pPr>
         <w:pStyle w:val="Heading2"/>
       </w:pPr>
-      <w:bookmarkStart w:id="44" w:name="_Toc189926569"/>
+      <w:bookmarkStart w:id="44" w:name="_Toc190097146"/>
       <w:r>
         <w:t xml:space="preserve">3.1 </w:t>
       </w:r>
@@ -6610,7 +6539,7 @@
       <w:pPr>
         <w:pStyle w:val="Heading2"/>
       </w:pPr>
-      <w:bookmarkStart w:id="48" w:name="_Toc189926570"/>
+      <w:bookmarkStart w:id="48" w:name="_Toc190097147"/>
       <w:r>
         <w:lastRenderedPageBreak/>
         <w:t xml:space="preserve">3.2 </w:t>
@@ -6712,7 +6641,7 @@
       <w:pPr>
         <w:pStyle w:val="Heading2"/>
       </w:pPr>
-      <w:bookmarkStart w:id="52" w:name="_Toc189926571"/>
+      <w:bookmarkStart w:id="52" w:name="_Toc190097148"/>
       <w:r>
         <w:lastRenderedPageBreak/>
         <w:t xml:space="preserve">3.3 </w:t>
@@ -6961,15 +6890,7 @@
     </w:p>
     <w:p>
       <w:r>
-        <w:t xml:space="preserve">This sequence diagram illustrates how the other user logs in and receives </w:t>
-      </w:r>
-      <w:proofErr w:type="gramStart"/>
-      <w:r>
-        <w:t>the</w:t>
-      </w:r>
-      <w:proofErr w:type="gramEnd"/>
-      <w:r>
-        <w:t xml:space="preserve"> new message from the new user. Important abbreviations: hash – hashing algorithm, pk – passkey, </w:t>
+        <w:t xml:space="preserve">This sequence diagram illustrates how the other user logs in and receives the new message from the new user. Important abbreviations: hash – hashing algorithm, pk – passkey, </w:t>
       </w:r>
       <w:proofErr w:type="spellStart"/>
       <w:r>
@@ -7038,7 +6959,7 @@
       <w:pPr>
         <w:pStyle w:val="Heading2"/>
       </w:pPr>
-      <w:bookmarkStart w:id="59" w:name="_Toc189926572"/>
+      <w:bookmarkStart w:id="59" w:name="_Toc190097149"/>
       <w:r>
         <w:lastRenderedPageBreak/>
         <w:t>3.</w:t>
@@ -7140,7 +7061,7 @@
           <w:numId w:val="2"/>
         </w:numPr>
       </w:pPr>
-      <w:bookmarkStart w:id="63" w:name="_Toc189926573"/>
+      <w:bookmarkStart w:id="63" w:name="_Toc190097150"/>
       <w:r>
         <w:t>Challenges we have faced</w:t>
       </w:r>
@@ -7150,7 +7071,7 @@
       <w:pPr>
         <w:pStyle w:val="Heading2"/>
       </w:pPr>
-      <w:bookmarkStart w:id="64" w:name="_Toc189926574"/>
+      <w:bookmarkStart w:id="64" w:name="_Toc190097151"/>
       <w:r>
         <w:t xml:space="preserve">4.1 </w:t>
       </w:r>
@@ -7356,9 +7277,11 @@
       <w:pPr>
         <w:pStyle w:val="Heading2"/>
       </w:pPr>
+      <w:bookmarkStart w:id="65" w:name="_Toc190097152"/>
       <w:r>
         <w:t>4.2 Compatibility, Versioning and Dependencies</w:t>
       </w:r>
+      <w:bookmarkEnd w:id="65"/>
     </w:p>
     <w:p>
       <w:r>
@@ -7388,15 +7311,7 @@
         <w:t xml:space="preserve"> </w:t>
       </w:r>
       <w:r>
-        <w:t xml:space="preserve">Especially, when trying to run our program on a separate machine to test it, we again noticed how </w:t>
-      </w:r>
-      <w:proofErr w:type="gramStart"/>
-      <w:r>
-        <w:t>much</w:t>
-      </w:r>
-      <w:proofErr w:type="gramEnd"/>
-      <w:r>
-        <w:t xml:space="preserve"> versions of node.js, java, etc. mattered. We changed the </w:t>
+        <w:t xml:space="preserve">Especially, when trying to run our program on a separate machine to test it, we again noticed how much versions of node.js, java, etc. mattered. We changed the </w:t>
       </w:r>
       <w:r>
         <w:t>“README”</w:t>
@@ -7408,8 +7323,86 @@
         <w:t xml:space="preserve">could not guarantee with this setup that our program would run on all devices. Lastly, our AI feature proved to be another major issue, when executing it throughout development, we used PyCharm, this proved to be fatal for one of our teammates, as executing any program on PyCharm was not possible on his machine (The problem laid with python). Unfortunately, until the end of our project he could not make python work on his machine and therefore, he was not able to execute the AI Api. </w:t>
       </w:r>
     </w:p>
+    <w:p>
+      <w:pPr>
+        <w:pStyle w:val="Heading2"/>
+        <w:numPr>
+          <w:ilvl w:val="1"/>
+          <w:numId w:val="2"/>
+        </w:numPr>
+      </w:pPr>
+      <w:bookmarkStart w:id="66" w:name="_Toc190097153"/>
+      <w:r>
+        <w:lastRenderedPageBreak/>
+        <w:t>Real Time Chat Application</w:t>
+      </w:r>
+      <w:bookmarkEnd w:id="66"/>
+      <w:r>
+        <w:t xml:space="preserve"> </w:t>
+      </w:r>
+    </w:p>
+    <w:p>
+      <w:r>
+        <w:t>With all the knowledge we gathered up to the 4th semester, we felt fully equipped to understand how a real-time chat application could be designed—at least in theory. However, we underestimated the effort required to transition from theory to reality.</w:t>
+      </w:r>
+      <w:r>
+        <w:t xml:space="preserve"> </w:t>
+      </w:r>
+    </w:p>
+    <w:p>
+      <w:r>
+        <w:t>During the early planning phase, one of the biggest challenges was evaluating individual frameworks and understanding how certain components, such as message queues, could be implemented. For instance, we struggled with designing a common queue structure that wouldn’t require storing user details on the server.</w:t>
+      </w:r>
+    </w:p>
+    <w:p>
+      <w:r>
+        <w:t>Additionally, many of the YouTube tutorials we found were outdated and incompatible with the latest versions of the technologies we were using. Syntax changes and missing documentation for our specific framework further complicated the process. Since there were no up-to-date video tutorials available, we had to rely entirely on official documentation. This turned out to be a significant challenge, as the necessary information was scattered across multiple web pages, requiring extensive time and effort to piece everything together.</w:t>
+      </w:r>
+      <w:r>
+        <w:t xml:space="preserve"> </w:t>
+      </w:r>
+      <w:r>
+        <w:t>Apart from that, connecting the backend and frontend was another major challenge. A direct POST request was not a viable option in this scenario, which required substantial syntax modifications. Adapting to these changes and ensuring proper communication between both ends of the application took considerable effort.</w:t>
+      </w:r>
+    </w:p>
+    <w:p>
+      <w:r>
+        <w:t>Despite these challenges, overcoming them gave us a new level of confidence. We now understand how to approach larger problems and find solutions even when resources like YouTube tutorials are not available. This experience has strengthened our ability to tackle complex technical issues and build solutions from the ground up.</w:t>
+      </w:r>
+    </w:p>
+    <w:p>
+      <w:pPr>
+        <w:pStyle w:val="Heading2"/>
+      </w:pPr>
+    </w:p>
+    <w:p>
+      <w:pPr>
+        <w:pStyle w:val="Heading2"/>
+      </w:pPr>
+      <w:bookmarkStart w:id="67" w:name="_Toc190097154"/>
+      <w:r>
+        <w:t xml:space="preserve">4.4 </w:t>
+      </w:r>
+      <w:r>
+        <w:t>Designing the UI</w:t>
+      </w:r>
+      <w:bookmarkEnd w:id="67"/>
+      <w:r>
+        <w:t xml:space="preserve"> </w:t>
+      </w:r>
+    </w:p>
     <w:p/>
-    <w:p/>
+    <w:p>
+      <w:r>
+        <w:t>Since our UI knowledge was quite limited, we only designed basic user interfaces for essential components. However, we lacked a well-defined UI structure, particularly for features like Icebreakers and the chat application. As a result, the developer had to spend additional time first visualizing the concept and then implementing it in code.</w:t>
+      </w:r>
+      <w:r>
+        <w:t xml:space="preserve"> </w:t>
+      </w:r>
+      <w:r>
+        <w:t>Moreover, since the developer was not a professional UI/UX designer, we acknowledge that the visual experience of the application may not be as polished as it could be. However, if we decide to scale the application in the future, we plan to redesign the UI to ensure a more structured, user-friendly, and visually appealing experience.</w:t>
+      </w:r>
+    </w:p>
     <w:p/>
     <w:p>
       <w:pPr>
@@ -7419,11 +7412,12 @@
           <w:numId w:val="2"/>
         </w:numPr>
       </w:pPr>
-      <w:bookmarkStart w:id="65" w:name="_Toc189926575"/>
-      <w:r>
+      <w:bookmarkStart w:id="68" w:name="_Toc190097155"/>
+      <w:r>
+        <w:lastRenderedPageBreak/>
         <w:t>Who has done what</w:t>
       </w:r>
-      <w:bookmarkEnd w:id="65"/>
+      <w:bookmarkEnd w:id="68"/>
     </w:p>
     <w:p>
       <w:r>
@@ -7435,23 +7429,7 @@
       </w:r>
       <w:proofErr w:type="spellEnd"/>
       <w:r>
-        <w:t xml:space="preserve"> </w:t>
-      </w:r>
-      <w:proofErr w:type="gramStart"/>
-      <w:r>
-        <w:t>the AI</w:t>
-      </w:r>
-      <w:proofErr w:type="gramEnd"/>
-      <w:r>
-        <w:t xml:space="preserve">, training the AI and integrating the AI into the Website. Furthermore, he was also responsible for the end-to-end encryption of the messages. All members worked on creating </w:t>
-      </w:r>
-      <w:proofErr w:type="gramStart"/>
-      <w:r>
-        <w:t>architectures</w:t>
-      </w:r>
-      <w:proofErr w:type="gramEnd"/>
-      <w:r>
-        <w:t xml:space="preserve"> for the application. Especially </w:t>
+        <w:t xml:space="preserve"> the AI, training the AI and integrating the AI into the Website. Furthermore, he was also responsible for the end-to-end encryption of the messages. All members worked on creating architectures for the application. Especially </w:t>
       </w:r>
       <w:proofErr w:type="spellStart"/>
       <w:r>
@@ -7470,11 +7448,11 @@
           <w:numId w:val="2"/>
         </w:numPr>
       </w:pPr>
-      <w:bookmarkStart w:id="66" w:name="_Toc189926576"/>
+      <w:bookmarkStart w:id="69" w:name="_Toc190097156"/>
       <w:r>
         <w:t>Conclusion</w:t>
       </w:r>
-      <w:bookmarkEnd w:id="66"/>
+      <w:bookmarkEnd w:id="69"/>
     </w:p>
     <w:p>
       <w:r>
@@ -7492,22 +7470,12 @@
         <w:t xml:space="preserve">e basis for all modern AI. Furthermore, we were able to work with and understand the complex models of </w:t>
       </w:r>
       <w:proofErr w:type="spellStart"/>
-      <w:proofErr w:type="gramStart"/>
       <w:r>
         <w:t>todays</w:t>
       </w:r>
       <w:proofErr w:type="spellEnd"/>
-      <w:proofErr w:type="gramEnd"/>
-      <w:r>
-        <w:t xml:space="preserve"> age which extend the classic neural networks, namely generative AI models like ChatGPT. We had a lot of fun understanding how AIs like ChatGPT </w:t>
-      </w:r>
-      <w:proofErr w:type="gramStart"/>
-      <w:r>
-        <w:t>work</w:t>
-      </w:r>
-      <w:proofErr w:type="gramEnd"/>
-      <w:r>
-        <w:t xml:space="preserve"> and how we can fine-tune these models to our demands. Furthermore, we were able to sophisticate and enlarge our knowledge of creating complex websites, which incorporate a java driven backend (in our case </w:t>
+      <w:r>
+        <w:t xml:space="preserve"> age which extend the classic neural networks, namely generative AI models like ChatGPT. We had a lot of fun understanding how AIs like ChatGPT work and how we can fine-tune these models to our demands. Furthermore, we were able to sophisticate and enlarge our knowledge of creating complex websites, which incorporate a java driven backend (in our case </w:t>
       </w:r>
       <w:proofErr w:type="spellStart"/>
       <w:r>
@@ -7523,15 +7491,7 @@
       </w:r>
       <w:proofErr w:type="spellEnd"/>
       <w:r>
-        <w:t xml:space="preserve"> driven frontend (in our case angular) and database structure (in our case PostgreSQL). Especially conceptualizing and implementing the chat functionality demanded a lot of our knowledge acquired in courses like: Distributed Systems or Computer Networks. Thus, we could bring a lot of the </w:t>
-      </w:r>
-      <w:proofErr w:type="gramStart"/>
-      <w:r>
-        <w:t>learned concepts</w:t>
-      </w:r>
-      <w:proofErr w:type="gramEnd"/>
-      <w:r>
-        <w:t xml:space="preserve"> into practice. The same can be said for the end-to-end encryption. Here the knowledge acquired in the IT Security lecture</w:t>
+        <w:t xml:space="preserve"> driven frontend (in our case angular) and database structure (in our case PostgreSQL). Especially conceptualizing and implementing the chat functionality demanded a lot of our knowledge acquired in courses like: Distributed Systems or Computer Networks. Thus, we could bring a lot of the learned concepts into practice. The same can be said for the end-to-end encryption. Here the knowledge acquired in the IT Security lecture</w:t>
       </w:r>
       <w:r>
         <w:t>s</w:t>
@@ -7543,26 +7503,10 @@
         <w:t>was</w:t>
       </w:r>
       <w:r>
-        <w:t xml:space="preserve"> of vital importance to </w:t>
-      </w:r>
-      <w:proofErr w:type="gramStart"/>
-      <w:r>
-        <w:t>realize</w:t>
-      </w:r>
-      <w:proofErr w:type="gramEnd"/>
-      <w:r>
-        <w:t xml:space="preserve"> our ideas. </w:t>
-      </w:r>
-      <w:r>
-        <w:t xml:space="preserve">As the </w:t>
-      </w:r>
-      <w:proofErr w:type="gramStart"/>
-      <w:r>
-        <w:t>mentioned courses</w:t>
-      </w:r>
-      <w:proofErr w:type="gramEnd"/>
-      <w:r>
-        <w:t xml:space="preserve"> were among some of our </w:t>
+        <w:t xml:space="preserve"> of vital importance to realize our ideas. </w:t>
+      </w:r>
+      <w:r>
+        <w:t xml:space="preserve">As the mentioned courses were among some of our </w:t>
       </w:r>
       <w:proofErr w:type="spellStart"/>
       <w:r>
@@ -7576,15 +7520,7 @@
         <w:t>conclusion,</w:t>
       </w:r>
       <w:r>
-        <w:t xml:space="preserve"> on behalf of the entire team: Utkarsh Fulara, Bilal Alali and Andrej Sum-</w:t>
-      </w:r>
-      <w:proofErr w:type="gramStart"/>
-      <w:r>
-        <w:t>Shik</w:t>
-      </w:r>
-      <w:proofErr w:type="gramEnd"/>
-      <w:r>
-        <w:t xml:space="preserve"> we would like to thank Prof. Dr. </w:t>
+        <w:t xml:space="preserve"> on behalf of the entire team: Utkarsh Fulara, Bilal Alali and Andrej Sum-Shik we would like to thank Prof. Dr. </w:t>
       </w:r>
       <w:r>
         <w:t>-</w:t>
@@ -7737,10 +7673,123 @@
 <file path=word/numbering.xml><?xml version="1.0" encoding="utf-8"?>
 <w:numbering xmlns:wpc="http://schemas.microsoft.com/office/word/2010/wordprocessingCanvas" xmlns:cx="http://schemas.microsoft.com/office/drawing/2014/chartex" xmlns:cx1="http://schemas.microsoft.com/office/drawing/2015/9/8/chartex" xmlns:cx2="http://schemas.microsoft.com/office/drawing/2015/10/21/chartex" xmlns:cx3="http://schemas.microsoft.com/office/drawing/2016/5/9/chartex" xmlns:cx4="http://schemas.microsoft.com/office/drawing/2016/5/10/chartex" xmlns:cx5="http://schemas.microsoft.com/office/drawing/2016/5/11/chartex" xmlns:cx6="http://schemas.microsoft.com/office/drawing/2016/5/12/chartex" xmlns:cx7="http://schemas.microsoft.com/office/drawing/2016/5/13/chartex" xmlns:cx8="http://schemas.microsoft.com/office/drawing/2016/5/14/chartex" xmlns:mc="http://schemas.openxmlformats.org/markup-compatibility/2006" xmlns:aink="http://schemas.microsoft.com/office/drawing/2016/ink" xmlns:am3d="http://schemas.microsoft.com/office/drawing/2017/model3d" xmlns:o="urn:schemas-microsoft-com:office:office" xmlns:oel="http://schemas.microsoft.com/office/2019/extlst" xmlns:r="http://schemas.openxmlformats.org/officeDocument/2006/relationships" xmlns:m="http://schemas.openxmlformats.org/officeDocument/2006/math" xmlns:v="urn:schemas-microsoft-com:vml" xmlns:wp14="http://schemas.microsoft.com/office/word/2010/wordprocessingDrawing" xmlns:wp="http://schemas.openxmlformats.org/drawingml/2006/wordprocessingDrawing" xmlns:w10="urn:schemas-microsoft-com:office:word" xmlns:w="http://schemas.openxmlformats.org/wordprocessingml/2006/main" xmlns:w14="http://schemas.microsoft.com/office/word/2010/wordml" xmlns:w15="http://schemas.microsoft.com/office/word/2012/wordml" xmlns:w16cex="http://schemas.microsoft.com/office/word/2018/wordml/cex" xmlns:w16cid="http://schemas.microsoft.com/office/word/2016/wordml/cid" xmlns:w16="http://schemas.microsoft.com/office/word/2018/wordml" xmlns:w16du="http://schemas.microsoft.com/office/word/2023/wordml/word16du" xmlns:w16sdtdh="http://schemas.microsoft.com/office/word/2020/wordml/sdtdatahash" xmlns:w16sdtfl="http://schemas.microsoft.com/office/word/2024/wordml/sdtformatlock" xmlns:w16se="http://schemas.microsoft.com/office/word/2015/wordml/symex" xmlns:wpg="http://schemas.microsoft.com/office/word/2010/wordprocessingGroup" xmlns:wpi="http://schemas.microsoft.com/office/word/2010/wordprocessingInk" xmlns:wne="http://schemas.microsoft.com/office/word/2006/wordml" xmlns:wps="http://schemas.microsoft.com/office/word/2010/wordprocessingShape" mc:Ignorable="w14 w15 w16se w16cid w16 w16cex w16sdtdh w16sdtfl w16du wp14">
   <w:abstractNum w:abstractNumId="0" w15:restartNumberingAfterBreak="0">
+    <w:nsid w:val="1B400DD9"/>
+    <w:multiLevelType w:val="multilevel"/>
+    <w:tmpl w:val="04744DE4"/>
+    <w:lvl w:ilvl="0">
+      <w:start w:val="4"/>
+      <w:numFmt w:val="decimal"/>
+      <w:lvlText w:val="%1."/>
+      <w:lvlJc w:val="left"/>
+      <w:pPr>
+        <w:ind w:left="500" w:hanging="500"/>
+      </w:pPr>
+      <w:rPr>
+        <w:rFonts w:hint="default"/>
+      </w:rPr>
+    </w:lvl>
+    <w:lvl w:ilvl="1">
+      <w:start w:val="3"/>
+      <w:numFmt w:val="decimal"/>
+      <w:lvlText w:val="%1.%2."/>
+      <w:lvlJc w:val="left"/>
+      <w:pPr>
+        <w:ind w:left="720" w:hanging="720"/>
+      </w:pPr>
+      <w:rPr>
+        <w:rFonts w:hint="default"/>
+      </w:rPr>
+    </w:lvl>
+    <w:lvl w:ilvl="2">
+      <w:start w:val="1"/>
+      <w:numFmt w:val="decimal"/>
+      <w:lvlText w:val="%1.%2.%3."/>
+      <w:lvlJc w:val="left"/>
+      <w:pPr>
+        <w:ind w:left="1080" w:hanging="1080"/>
+      </w:pPr>
+      <w:rPr>
+        <w:rFonts w:hint="default"/>
+      </w:rPr>
+    </w:lvl>
+    <w:lvl w:ilvl="3">
+      <w:start w:val="1"/>
+      <w:numFmt w:val="decimal"/>
+      <w:lvlText w:val="%1.%2.%3.%4."/>
+      <w:lvlJc w:val="left"/>
+      <w:pPr>
+        <w:ind w:left="1080" w:hanging="1080"/>
+      </w:pPr>
+      <w:rPr>
+        <w:rFonts w:hint="default"/>
+      </w:rPr>
+    </w:lvl>
+    <w:lvl w:ilvl="4">
+      <w:start w:val="1"/>
+      <w:numFmt w:val="decimal"/>
+      <w:lvlText w:val="%1.%2.%3.%4.%5."/>
+      <w:lvlJc w:val="left"/>
+      <w:pPr>
+        <w:ind w:left="1440" w:hanging="1440"/>
+      </w:pPr>
+      <w:rPr>
+        <w:rFonts w:hint="default"/>
+      </w:rPr>
+    </w:lvl>
+    <w:lvl w:ilvl="5">
+      <w:start w:val="1"/>
+      <w:numFmt w:val="decimal"/>
+      <w:lvlText w:val="%1.%2.%3.%4.%5.%6."/>
+      <w:lvlJc w:val="left"/>
+      <w:pPr>
+        <w:ind w:left="1800" w:hanging="1800"/>
+      </w:pPr>
+      <w:rPr>
+        <w:rFonts w:hint="default"/>
+      </w:rPr>
+    </w:lvl>
+    <w:lvl w:ilvl="6">
+      <w:start w:val="1"/>
+      <w:numFmt w:val="decimal"/>
+      <w:lvlText w:val="%1.%2.%3.%4.%5.%6.%7."/>
+      <w:lvlJc w:val="left"/>
+      <w:pPr>
+        <w:ind w:left="1800" w:hanging="1800"/>
+      </w:pPr>
+      <w:rPr>
+        <w:rFonts w:hint="default"/>
+      </w:rPr>
+    </w:lvl>
+    <w:lvl w:ilvl="7">
+      <w:start w:val="1"/>
+      <w:numFmt w:val="decimal"/>
+      <w:lvlText w:val="%1.%2.%3.%4.%5.%6.%7.%8."/>
+      <w:lvlJc w:val="left"/>
+      <w:pPr>
+        <w:ind w:left="2160" w:hanging="2160"/>
+      </w:pPr>
+      <w:rPr>
+        <w:rFonts w:hint="default"/>
+      </w:rPr>
+    </w:lvl>
+    <w:lvl w:ilvl="8">
+      <w:start w:val="1"/>
+      <w:numFmt w:val="decimal"/>
+      <w:lvlText w:val="%1.%2.%3.%4.%5.%6.%7.%8.%9."/>
+      <w:lvlJc w:val="left"/>
+      <w:pPr>
+        <w:ind w:left="2520" w:hanging="2520"/>
+      </w:pPr>
+      <w:rPr>
+        <w:rFonts w:hint="default"/>
+      </w:rPr>
+    </w:lvl>
+  </w:abstractNum>
+  <w:abstractNum w:abstractNumId="1" w15:restartNumberingAfterBreak="0">
     <w:nsid w:val="22682E3C"/>
-    <w:multiLevelType w:val="hybridMultilevel"/>
-    <w:tmpl w:val="40F8D27E"/>
-    <w:lvl w:ilvl="0" w:tplc="2000000F">
+    <w:multiLevelType w:val="multilevel"/>
+    <w:tmpl w:val="87681B66"/>
+    <w:lvl w:ilvl="0">
       <w:start w:val="1"/>
       <w:numFmt w:val="decimal"/>
       <w:lvlText w:val="%1."/>
@@ -7752,80 +7801,112 @@
         <w:rFonts w:hint="default"/>
       </w:rPr>
     </w:lvl>
-    <w:lvl w:ilvl="1" w:tplc="20000019" w:tentative="1">
-      <w:start w:val="1"/>
-      <w:numFmt w:val="lowerLetter"/>
-      <w:lvlText w:val="%2."/>
+    <w:lvl w:ilvl="1">
+      <w:start w:val="3"/>
+      <w:numFmt w:val="decimal"/>
+      <w:isLgl/>
+      <w:lvlText w:val="%1.%2"/>
       <w:lvlJc w:val="left"/>
       <w:pPr>
-        <w:ind w:left="1440" w:hanging="360"/>
-      </w:pPr>
+        <w:ind w:left="840" w:hanging="480"/>
+      </w:pPr>
+      <w:rPr>
+        <w:rFonts w:hint="default"/>
+      </w:rPr>
     </w:lvl>
-    <w:lvl w:ilvl="2" w:tplc="2000001B" w:tentative="1">
-      <w:start w:val="1"/>
-      <w:numFmt w:val="lowerRoman"/>
-      <w:lvlText w:val="%3."/>
-      <w:lvlJc w:val="right"/>
-      <w:pPr>
-        <w:ind w:left="2160" w:hanging="180"/>
-      </w:pPr>
-    </w:lvl>
-    <w:lvl w:ilvl="3" w:tplc="2000000F" w:tentative="1">
+    <w:lvl w:ilvl="2">
       <w:start w:val="1"/>
       <w:numFmt w:val="decimal"/>
-      <w:lvlText w:val="%4."/>
+      <w:isLgl/>
+      <w:lvlText w:val="%1.%2.%3"/>
       <w:lvlJc w:val="left"/>
       <w:pPr>
-        <w:ind w:left="2880" w:hanging="360"/>
-      </w:pPr>
+        <w:ind w:left="1080" w:hanging="720"/>
+      </w:pPr>
+      <w:rPr>
+        <w:rFonts w:hint="default"/>
+      </w:rPr>
     </w:lvl>
-    <w:lvl w:ilvl="4" w:tplc="20000019" w:tentative="1">
-      <w:start w:val="1"/>
-      <w:numFmt w:val="lowerLetter"/>
-      <w:lvlText w:val="%5."/>
-      <w:lvlJc w:val="left"/>
-      <w:pPr>
-        <w:ind w:left="3600" w:hanging="360"/>
-      </w:pPr>
-    </w:lvl>
-    <w:lvl w:ilvl="5" w:tplc="2000001B" w:tentative="1">
-      <w:start w:val="1"/>
-      <w:numFmt w:val="lowerRoman"/>
-      <w:lvlText w:val="%6."/>
-      <w:lvlJc w:val="right"/>
-      <w:pPr>
-        <w:ind w:left="4320" w:hanging="180"/>
-      </w:pPr>
-    </w:lvl>
-    <w:lvl w:ilvl="6" w:tplc="2000000F" w:tentative="1">
+    <w:lvl w:ilvl="3">
       <w:start w:val="1"/>
       <w:numFmt w:val="decimal"/>
-      <w:lvlText w:val="%7."/>
+      <w:isLgl/>
+      <w:lvlText w:val="%1.%2.%3.%4"/>
       <w:lvlJc w:val="left"/>
       <w:pPr>
-        <w:ind w:left="5040" w:hanging="360"/>
-      </w:pPr>
+        <w:ind w:left="1440" w:hanging="1080"/>
+      </w:pPr>
+      <w:rPr>
+        <w:rFonts w:hint="default"/>
+      </w:rPr>
     </w:lvl>
-    <w:lvl w:ilvl="7" w:tplc="20000019" w:tentative="1">
+    <w:lvl w:ilvl="4">
       <w:start w:val="1"/>
-      <w:numFmt w:val="lowerLetter"/>
-      <w:lvlText w:val="%8."/>
+      <w:numFmt w:val="decimal"/>
+      <w:isLgl/>
+      <w:lvlText w:val="%1.%2.%3.%4.%5"/>
       <w:lvlJc w:val="left"/>
       <w:pPr>
-        <w:ind w:left="5760" w:hanging="360"/>
-      </w:pPr>
+        <w:ind w:left="1440" w:hanging="1080"/>
+      </w:pPr>
+      <w:rPr>
+        <w:rFonts w:hint="default"/>
+      </w:rPr>
     </w:lvl>
-    <w:lvl w:ilvl="8" w:tplc="2000001B" w:tentative="1">
+    <w:lvl w:ilvl="5">
       <w:start w:val="1"/>
-      <w:numFmt w:val="lowerRoman"/>
-      <w:lvlText w:val="%9."/>
-      <w:lvlJc w:val="right"/>
-      <w:pPr>
-        <w:ind w:left="6480" w:hanging="180"/>
-      </w:pPr>
+      <w:numFmt w:val="decimal"/>
+      <w:isLgl/>
+      <w:lvlText w:val="%1.%2.%3.%4.%5.%6"/>
+      <w:lvlJc w:val="left"/>
+      <w:pPr>
+        <w:ind w:left="1800" w:hanging="1440"/>
+      </w:pPr>
+      <w:rPr>
+        <w:rFonts w:hint="default"/>
+      </w:rPr>
+    </w:lvl>
+    <w:lvl w:ilvl="6">
+      <w:start w:val="1"/>
+      <w:numFmt w:val="decimal"/>
+      <w:isLgl/>
+      <w:lvlText w:val="%1.%2.%3.%4.%5.%6.%7"/>
+      <w:lvlJc w:val="left"/>
+      <w:pPr>
+        <w:ind w:left="1800" w:hanging="1440"/>
+      </w:pPr>
+      <w:rPr>
+        <w:rFonts w:hint="default"/>
+      </w:rPr>
+    </w:lvl>
+    <w:lvl w:ilvl="7">
+      <w:start w:val="1"/>
+      <w:numFmt w:val="decimal"/>
+      <w:isLgl/>
+      <w:lvlText w:val="%1.%2.%3.%4.%5.%6.%7.%8"/>
+      <w:lvlJc w:val="left"/>
+      <w:pPr>
+        <w:ind w:left="2160" w:hanging="1800"/>
+      </w:pPr>
+      <w:rPr>
+        <w:rFonts w:hint="default"/>
+      </w:rPr>
+    </w:lvl>
+    <w:lvl w:ilvl="8">
+      <w:start w:val="1"/>
+      <w:numFmt w:val="decimal"/>
+      <w:isLgl/>
+      <w:lvlText w:val="%1.%2.%3.%4.%5.%6.%7.%8.%9"/>
+      <w:lvlJc w:val="left"/>
+      <w:pPr>
+        <w:ind w:left="2160" w:hanging="1800"/>
+      </w:pPr>
+      <w:rPr>
+        <w:rFonts w:hint="default"/>
+      </w:rPr>
     </w:lvl>
   </w:abstractNum>
-  <w:abstractNum w:abstractNumId="1" w15:restartNumberingAfterBreak="0">
+  <w:abstractNum w:abstractNumId="2" w15:restartNumberingAfterBreak="0">
     <w:nsid w:val="48077644"/>
     <w:multiLevelType w:val="hybridMultilevel"/>
     <w:tmpl w:val="703C0850"/>
@@ -7938,9 +8019,12 @@
     </w:lvl>
   </w:abstractNum>
   <w:num w:numId="1" w16cid:durableId="1112017538">
+    <w:abstractNumId w:val="2"/>
+  </w:num>
+  <w:num w:numId="2" w16cid:durableId="1001547563">
     <w:abstractNumId w:val="1"/>
   </w:num>
-  <w:num w:numId="2" w16cid:durableId="1001547563">
+  <w:num w:numId="3" w16cid:durableId="1286278346">
     <w:abstractNumId w:val="0"/>
   </w:num>
 </w:numbering>

</xml_diff>

<commit_message>
left our our matriculation numbers and corrected some spelling errors
</commit_message>
<xml_diff>
--- a/IcebreakerReportChanged.docx
+++ b/IcebreakerReportChanged.docx
@@ -326,7 +326,7 @@
                                               <w:sz w:val="26"/>
                                               <w:szCs w:val="26"/>
                                             </w:rPr>
-                                            <w:t xml:space="preserve"> 1443572,</w:t>
+                                            <w:t>,</w:t>
                                           </w:r>
                                           <w:r>
                                             <w:rPr>
@@ -334,7 +334,7 @@
                                               <w:sz w:val="26"/>
                                               <w:szCs w:val="26"/>
                                             </w:rPr>
-                                            <w:t xml:space="preserve"> Utkarsh Fulara 1372892,</w:t>
+                                            <w:t xml:space="preserve"> Utkarsh Fulara,</w:t>
                                           </w:r>
                                           <w:r>
                                             <w:rPr>
@@ -350,7 +350,7 @@
                                               <w:sz w:val="26"/>
                                               <w:szCs w:val="26"/>
                                             </w:rPr>
-                                            <w:t>Andrej Sum-Shik 1449932</w:t>
+                                            <w:t xml:space="preserve">Andrej Sum-Shik </w:t>
                                           </w:r>
                                         </w:p>
                                       </w:sdtContent>
@@ -665,7 +665,7 @@
                                         <w:sz w:val="26"/>
                                         <w:szCs w:val="26"/>
                                       </w:rPr>
-                                      <w:t xml:space="preserve"> 1443572,</w:t>
+                                      <w:t>,</w:t>
                                     </w:r>
                                     <w:r>
                                       <w:rPr>
@@ -673,7 +673,7 @@
                                         <w:sz w:val="26"/>
                                         <w:szCs w:val="26"/>
                                       </w:rPr>
-                                      <w:t xml:space="preserve"> Utkarsh Fulara 1372892,</w:t>
+                                      <w:t xml:space="preserve"> Utkarsh Fulara,</w:t>
                                     </w:r>
                                     <w:r>
                                       <w:rPr>
@@ -689,7 +689,7 @@
                                         <w:sz w:val="26"/>
                                         <w:szCs w:val="26"/>
                                       </w:rPr>
-                                      <w:t>Andrej Sum-Shik 1449932</w:t>
+                                      <w:t xml:space="preserve">Andrej Sum-Shik </w:t>
                                     </w:r>
                                   </w:p>
                                 </w:sdtContent>
@@ -3923,64 +3923,16 @@
     </w:p>
     <w:p>
       <w:r>
-        <w:t xml:space="preserve">Nowadays the term AI is discussed in nearly every corner of this world. The Term AI refers to artificial intelligence. But what that </w:t>
-      </w:r>
-      <w:proofErr w:type="gramStart"/>
-      <w:r>
-        <w:t>actually means</w:t>
-      </w:r>
-      <w:proofErr w:type="gramEnd"/>
-      <w:r>
-        <w:t xml:space="preserve"> is hard to tell, as we humans do not have a decisive definition of the term intelligence. Mainly because our own intellect is still a mystery to us. The term artificial seems a lot more straightforward, as it refers to something that is man</w:t>
+        <w:t>Nowadays the term AI is discussed in nearly every corner of this world. The Term AI refers to artificial intelligence. But what that actually means is hard to tell, as we humans do not have a decisive definition of the term intelligence. Mainly because our own intellect is still a mystery to us. The term artificial seems a lot more straightforward, as it refers to something that is man</w:t>
       </w:r>
       <w:r>
         <w:t>-</w:t>
       </w:r>
       <w:r>
-        <w:t xml:space="preserve">made and not naturally produced. (Although as every component in every machine is </w:t>
-      </w:r>
-      <w:proofErr w:type="gramStart"/>
-      <w:r>
-        <w:t>made out of</w:t>
-      </w:r>
-      <w:proofErr w:type="gramEnd"/>
-      <w:r>
-        <w:t xml:space="preserve"> particles, you cannot definitely prove that there is not a planet in the universe where this particular machine was made by nature). To still derive a general definition artificial intelligence refers to a man-made machine which exhibits cognitive skills </w:t>
-      </w:r>
-      <w:proofErr w:type="gramStart"/>
-      <w:r>
-        <w:t>similar to</w:t>
-      </w:r>
-      <w:proofErr w:type="gramEnd"/>
-      <w:r>
-        <w:t xml:space="preserve"> that of a human. In recent years AI has made further progress and was able to sophisticate itself in everyday life, that is to escape from the purely scientific world and acquiring general relevance in the world of all human beings. ChatGPT made a significant contribution to this change, as it allowed every human being to </w:t>
-      </w:r>
-      <w:proofErr w:type="gramStart"/>
-      <w:r>
-        <w:t>come into contact with</w:t>
-      </w:r>
-      <w:proofErr w:type="gramEnd"/>
-      <w:r>
-        <w:t xml:space="preserve"> the scientific and mathematical world of AI, without having to understand any of the complex structure behind it. For most of us ChatGPT has become an irreplaceable companion that helps us in our everyday tasks. Especially for university students this technology became a brand-new way of learning and understanding complex concepts in every branch of research</w:t>
-      </w:r>
-      <w:r>
-        <w:t xml:space="preserve">. But as popular as AI is, it is also a highly controversial topic. Many fear the rise of AI, as it has the potential to become a lot smarter than us. </w:t>
-      </w:r>
-      <w:proofErr w:type="gramStart"/>
-      <w:r>
-        <w:t>Although,</w:t>
-      </w:r>
-      <w:proofErr w:type="gramEnd"/>
-      <w:r>
-        <w:t xml:space="preserve"> there a </w:t>
-      </w:r>
-      <w:proofErr w:type="gramStart"/>
-      <w:r>
-        <w:t>valid reasons</w:t>
-      </w:r>
-      <w:proofErr w:type="gramEnd"/>
-      <w:r>
-        <w:t xml:space="preserve"> for this fear, a bigger problem right now stems from the fact that most people discussing this topic do not actually understand how AIs like ChatGPT work</w:t>
+        <w:t>made and not naturally produced. (Although as every component in every machine is made out of particles, you cannot definitely prove that there is not a planet in the universe where this particular machine was made by nature). To still derive a general definition artificial intelligence refers to a man-made machine which exhibits cognitive skills similar to that of a human. In recent years AI has made further progress and was able to sophisticate itself in everyday life, that is to escape from the purely scientific world and acquiring general relevance in the world of all human beings. ChatGPT made a significant contribution to this change, as it allowed every human being to come into contact with the scientific and mathematical world of AI, without having to understand any of the complex structure behind it. For most of us ChatGPT has become an irreplaceable companion that helps us in our everyday tasks. Especially for university students this technology became a brand-new way of learning and understanding complex concepts in every branch of research</w:t>
+      </w:r>
+      <w:r>
+        <w:t>. But as popular as AI is, it is also a highly controversial topic. Many fear the rise of AI, as it has the potential to become a lot smarter than us. Although, there a valid reasons for this fear, a bigger problem right now stems from the fact that most people discussing this topic do not actually understand how AIs like ChatGPT work</w:t>
       </w:r>
       <w:r>
         <w:rPr>
@@ -3995,15 +3947,7 @@
         <w:t xml:space="preserve">ChatGPT does not actually understand us, what it does instead is predict the most likely next word for an input. It then concatenates the input and the predicted word as a new input and repeats this process. This is resumed until there is a response. In this project we want to leverage this “skill” ChatGPT has, we take user profiles as an input and </w:t>
       </w:r>
       <w:r>
-        <w:t xml:space="preserve">try to produce an output for that. We call the desired output “Icebreakers” and as the name implies, we want this system to generate good first messages for a given user profile. All of this is part of a real-time chat application. How we </w:t>
-      </w:r>
-      <w:proofErr w:type="spellStart"/>
-      <w:r>
-        <w:t>realised</w:t>
-      </w:r>
-      <w:proofErr w:type="spellEnd"/>
-      <w:r>
-        <w:t xml:space="preserve"> this task and what problems and obstacles we face</w:t>
+        <w:t>try to produce an output for that. We call the desired output “Icebreakers” and as the name implies, we want this system to generate good first messages for a given user profile. All of this is part of a real-time chat application. How we realised this task and what problems and obstacles we face</w:t>
       </w:r>
       <w:r>
         <w:t>d</w:t>
@@ -4040,31 +3984,7 @@
         <w:t xml:space="preserve"> </w:t>
       </w:r>
       <w:r>
-        <w:t xml:space="preserve">she can select another user: Bilal. Then our AI analyses the description that Bilal wrote about himself and </w:t>
-      </w:r>
-      <w:proofErr w:type="gramStart"/>
-      <w:r>
-        <w:t>suggests</w:t>
-      </w:r>
-      <w:proofErr w:type="gramEnd"/>
-      <w:r>
-        <w:t xml:space="preserve"> Laura a few </w:t>
-      </w:r>
-      <w:proofErr w:type="gramStart"/>
-      <w:r>
-        <w:t>potential</w:t>
-      </w:r>
-      <w:proofErr w:type="gramEnd"/>
-      <w:r>
-        <w:t xml:space="preserve"> first messages she can send to Bilal. For instance: Bilal wrote about himself that he likes boxing, so a potential first message may be: “Boxing is so nerve-wrecking. Who is your </w:t>
-      </w:r>
-      <w:proofErr w:type="spellStart"/>
-      <w:r>
-        <w:t>favourite</w:t>
-      </w:r>
-      <w:proofErr w:type="spellEnd"/>
-      <w:r>
-        <w:t xml:space="preserve"> Boxer?” Laura selects this Icebreaker and sends it as a first message. A new chat now exists between Laura and Bilal. Here they can spend as much time texting each other as they want and best of all, only they know </w:t>
+        <w:t xml:space="preserve">she can select another user: Bilal. Then our AI analyses the description that Bilal wrote about himself and suggests Laura a few potential first messages she can send to Bilal. For instance: Bilal wrote about himself that he likes boxing, so a potential first message may be: “Boxing is so nerve-wrecking. Who is your favourite Boxer?” Laura selects this Icebreaker and sends it as a first message. A new chat now exists between Laura and Bilal. Here they can spend as much time texting each other as they want and best of all, only they know </w:t>
       </w:r>
       <w:r>
         <w:t xml:space="preserve">the content of their conversation. Because we value user privacy, we want this chatting feature to be end-to-end encrypted, this means only Laura and Bilal have the means to decrypt the exchanged messages. </w:t>
@@ -4421,27 +4341,14 @@
       <w:r>
         <w:t xml:space="preserve">Figure </w:t>
       </w:r>
-      <w:r>
-        <w:fldChar w:fldCharType="begin"/>
-      </w:r>
-      <w:r>
-        <w:instrText xml:space="preserve"> SEQ Figure \* ARABIC </w:instrText>
-      </w:r>
-      <w:r>
-        <w:fldChar w:fldCharType="separate"/>
-      </w:r>
-      <w:r>
-        <w:rPr>
-          <w:noProof/>
-        </w:rPr>
-        <w:t>1</w:t>
-      </w:r>
-      <w:r>
-        <w:rPr>
-          <w:noProof/>
-        </w:rPr>
-        <w:fldChar w:fldCharType="end"/>
-      </w:r>
+      <w:fldSimple w:instr=" SEQ Figure \* ARABIC ">
+        <w:r>
+          <w:rPr>
+            <w:noProof/>
+          </w:rPr>
+          <w:t>1</w:t>
+        </w:r>
+      </w:fldSimple>
       <w:r>
         <w:t xml:space="preserve"> High Level Component Overview</w:t>
       </w:r>
@@ -4450,13 +4357,13 @@
     <w:p/>
     <w:p>
       <w:r>
-        <w:t>When accessing the website users first meet</w:t>
-      </w:r>
-      <w:r>
-        <w:t>s</w:t>
-      </w:r>
-      <w:r>
-        <w:t xml:space="preserve"> a login screen, here they can choose to create a new account or sign in with an existing one. Users can also choose which language the prefer: German or English. </w:t>
+        <w:t>When accessing the website users first meet a login screen, here they can choose to create a new account or sign in with an existing one. Users can also choose which language the</w:t>
+      </w:r>
+      <w:r>
+        <w:t>y</w:t>
+      </w:r>
+      <w:r>
+        <w:t xml:space="preserve"> prefer: German or English. </w:t>
       </w:r>
     </w:p>
     <w:p>
@@ -4529,37 +4436,16 @@
       <w:r>
         <w:t xml:space="preserve">Figure </w:t>
       </w:r>
-      <w:r>
-        <w:fldChar w:fldCharType="begin"/>
-      </w:r>
-      <w:r>
-        <w:instrText xml:space="preserve"> SEQ Figure \* ARABIC </w:instrText>
-      </w:r>
-      <w:r>
-        <w:fldChar w:fldCharType="separate"/>
-      </w:r>
-      <w:r>
-        <w:rPr>
-          <w:noProof/>
-        </w:rPr>
-        <w:t>2</w:t>
-      </w:r>
-      <w:r>
-        <w:rPr>
-          <w:noProof/>
-        </w:rPr>
-        <w:fldChar w:fldCharType="end"/>
-      </w:r>
-      <w:r>
-        <w:t xml:space="preserve">: </w:t>
-      </w:r>
-      <w:proofErr w:type="spellStart"/>
-      <w:r>
-        <w:t>Keycloak</w:t>
-      </w:r>
-      <w:proofErr w:type="spellEnd"/>
-      <w:r>
-        <w:t xml:space="preserve"> Login Terminal</w:t>
+      <w:fldSimple w:instr=" SEQ Figure \* ARABIC ">
+        <w:r>
+          <w:rPr>
+            <w:noProof/>
+          </w:rPr>
+          <w:t>2</w:t>
+        </w:r>
+      </w:fldSimple>
+      <w:r>
+        <w:t>: Keycloak Login Terminal</w:t>
       </w:r>
       <w:bookmarkEnd w:id="6"/>
       <w:bookmarkEnd w:id="7"/>
@@ -4568,15 +4454,7 @@
     <w:p/>
     <w:p>
       <w:r>
-        <w:t xml:space="preserve">When the login was successful new users </w:t>
-      </w:r>
-      <w:proofErr w:type="gramStart"/>
-      <w:r>
-        <w:t>have to</w:t>
-      </w:r>
-      <w:proofErr w:type="gramEnd"/>
-      <w:r>
-        <w:t xml:space="preserve"> create a passphrase and a magic number</w:t>
+        <w:t>When the login was successful new users have to create a passphrase and a magic number</w:t>
       </w:r>
       <w:r>
         <w:t>,</w:t>
@@ -4658,27 +4536,14 @@
       <w:r>
         <w:t xml:space="preserve">Figure </w:t>
       </w:r>
-      <w:r>
-        <w:fldChar w:fldCharType="begin"/>
-      </w:r>
-      <w:r>
-        <w:instrText xml:space="preserve"> SEQ Figure \* ARABIC </w:instrText>
-      </w:r>
-      <w:r>
-        <w:fldChar w:fldCharType="separate"/>
-      </w:r>
-      <w:r>
-        <w:rPr>
-          <w:noProof/>
-        </w:rPr>
-        <w:t>3</w:t>
-      </w:r>
-      <w:r>
-        <w:rPr>
-          <w:noProof/>
-        </w:rPr>
-        <w:fldChar w:fldCharType="end"/>
-      </w:r>
+      <w:fldSimple w:instr=" SEQ Figure \* ARABIC ">
+        <w:r>
+          <w:rPr>
+            <w:noProof/>
+          </w:rPr>
+          <w:t>3</w:t>
+        </w:r>
+      </w:fldSimple>
       <w:r>
         <w:rPr>
           <w:lang w:val="de-DE"/>
@@ -4759,27 +4624,14 @@
       <w:r>
         <w:t xml:space="preserve">Figure </w:t>
       </w:r>
-      <w:r>
-        <w:fldChar w:fldCharType="begin"/>
-      </w:r>
-      <w:r>
-        <w:instrText xml:space="preserve"> SEQ Figure \* ARABIC </w:instrText>
-      </w:r>
-      <w:r>
-        <w:fldChar w:fldCharType="separate"/>
-      </w:r>
-      <w:r>
-        <w:rPr>
-          <w:noProof/>
-        </w:rPr>
-        <w:t>4</w:t>
-      </w:r>
-      <w:r>
-        <w:rPr>
-          <w:noProof/>
-        </w:rPr>
-        <w:fldChar w:fldCharType="end"/>
-      </w:r>
+      <w:fldSimple w:instr=" SEQ Figure \* ARABIC ">
+        <w:r>
+          <w:rPr>
+            <w:noProof/>
+          </w:rPr>
+          <w:t>4</w:t>
+        </w:r>
+      </w:fldSimple>
       <w:r>
         <w:t>: Passphrase Setup</w:t>
       </w:r>
@@ -4790,7 +4642,19 @@
     <w:p/>
     <w:p>
       <w:r>
-        <w:t xml:space="preserve">After this a user </w:t>
+        <w:t>After this</w:t>
+      </w:r>
+      <w:r>
+        <w:t xml:space="preserve"> if</w:t>
+      </w:r>
+      <w:r>
+        <w:t xml:space="preserve"> a </w:t>
+      </w:r>
+      <w:r>
+        <w:t xml:space="preserve">new </w:t>
+      </w:r>
+      <w:r>
+        <w:t xml:space="preserve">user </w:t>
       </w:r>
       <w:r>
         <w:t xml:space="preserve">will </w:t>
@@ -4869,27 +4733,14 @@
       <w:r>
         <w:t xml:space="preserve">Figure </w:t>
       </w:r>
-      <w:r>
-        <w:fldChar w:fldCharType="begin"/>
-      </w:r>
-      <w:r>
-        <w:instrText xml:space="preserve"> SEQ Figure \* ARABIC </w:instrText>
-      </w:r>
-      <w:r>
-        <w:fldChar w:fldCharType="separate"/>
-      </w:r>
-      <w:r>
-        <w:rPr>
-          <w:noProof/>
-        </w:rPr>
-        <w:t>5</w:t>
-      </w:r>
-      <w:r>
-        <w:rPr>
-          <w:noProof/>
-        </w:rPr>
-        <w:fldChar w:fldCharType="end"/>
-      </w:r>
+      <w:fldSimple w:instr=" SEQ Figure \* ARABIC ">
+        <w:r>
+          <w:rPr>
+            <w:noProof/>
+          </w:rPr>
+          <w:t>5</w:t>
+        </w:r>
+      </w:fldSimple>
       <w:r>
         <w:t>: Available Users-Home Screen</w:t>
       </w:r>
@@ -4973,27 +4824,14 @@
       <w:r>
         <w:t xml:space="preserve">Figure </w:t>
       </w:r>
-      <w:r>
-        <w:fldChar w:fldCharType="begin"/>
-      </w:r>
-      <w:r>
-        <w:instrText xml:space="preserve"> SEQ Figure \* ARABIC </w:instrText>
-      </w:r>
-      <w:r>
-        <w:fldChar w:fldCharType="separate"/>
-      </w:r>
-      <w:r>
-        <w:rPr>
-          <w:noProof/>
-        </w:rPr>
-        <w:t>6</w:t>
-      </w:r>
-      <w:r>
-        <w:rPr>
-          <w:noProof/>
-        </w:rPr>
-        <w:fldChar w:fldCharType="end"/>
-      </w:r>
+      <w:fldSimple w:instr=" SEQ Figure \* ARABIC ">
+        <w:r>
+          <w:rPr>
+            <w:noProof/>
+          </w:rPr>
+          <w:t>6</w:t>
+        </w:r>
+      </w:fldSimple>
       <w:r>
         <w:t>: Public User Profile</w:t>
       </w:r>
@@ -5004,7 +4842,13 @@
     <w:p/>
     <w:p>
       <w:r>
-        <w:t xml:space="preserve">After that the user is greeted with following screen </w:t>
+        <w:t xml:space="preserve">After that the user is greeted with </w:t>
+      </w:r>
+      <w:r>
+        <w:t xml:space="preserve">the </w:t>
+      </w:r>
+      <w:r>
+        <w:t xml:space="preserve">following screen </w:t>
       </w:r>
     </w:p>
     <w:p>
@@ -5077,27 +4921,14 @@
       <w:r>
         <w:t xml:space="preserve">Figure </w:t>
       </w:r>
-      <w:r>
-        <w:fldChar w:fldCharType="begin"/>
-      </w:r>
-      <w:r>
-        <w:instrText xml:space="preserve"> SEQ Figure \* ARABIC </w:instrText>
-      </w:r>
-      <w:r>
-        <w:fldChar w:fldCharType="separate"/>
-      </w:r>
-      <w:r>
-        <w:rPr>
-          <w:noProof/>
-        </w:rPr>
-        <w:t>7</w:t>
-      </w:r>
-      <w:r>
-        <w:rPr>
-          <w:noProof/>
-        </w:rPr>
-        <w:fldChar w:fldCharType="end"/>
-      </w:r>
+      <w:fldSimple w:instr=" SEQ Figure \* ARABIC ">
+        <w:r>
+          <w:rPr>
+            <w:noProof/>
+          </w:rPr>
+          <w:t>7</w:t>
+        </w:r>
+      </w:fldSimple>
       <w:r>
         <w:t>: Online available Users</w:t>
       </w:r>
@@ -5108,30 +4939,12 @@
     <w:p/>
     <w:p>
       <w:r>
-        <w:t>Here the user can see all other “available” users. The term “available” in this context means active users, whom this user does not yet have a chat with. The user can see the description, username and picture (if provided) of every “available” user. Furthermore, a user can set himself as inactive, can change his profile and search for users.</w:t>
-      </w:r>
-    </w:p>
-    <w:p>
-      <w:r>
-        <w:t xml:space="preserve">When clicking on a user profile the user can send a first message to this person, there the icebreakers are also generated, this takes some time, so in the </w:t>
-      </w:r>
-      <w:proofErr w:type="spellStart"/>
-      <w:proofErr w:type="gramStart"/>
-      <w:r>
-        <w:t>mean time</w:t>
-      </w:r>
-      <w:proofErr w:type="spellEnd"/>
-      <w:proofErr w:type="gramEnd"/>
-      <w:r>
-        <w:t xml:space="preserve"> the user sees various </w:t>
-      </w:r>
-      <w:proofErr w:type="gramStart"/>
-      <w:r>
-        <w:t>messages as</w:t>
-      </w:r>
-      <w:proofErr w:type="gramEnd"/>
-      <w:r>
-        <w:t xml:space="preserve"> to distract him/her from the passing time. </w:t>
+        <w:t>Here the user can see all other “available” users. The term “available” in this context means active users, whom this user does not yet have a chat with. The user can see the description, username and picture (if provided) of every “available” user. Furthermore, a user can set himself as inactive, change his profile and search for users.</w:t>
+      </w:r>
+    </w:p>
+    <w:p>
+      <w:r>
+        <w:t xml:space="preserve">When clicking on a user profile the user can send a first message to this person, there the icebreakers are also generated, this takes some time, so in the mean time the user sees various messages as to distract him/her from the passing time. </w:t>
       </w:r>
     </w:p>
     <w:p>
@@ -5205,27 +5018,14 @@
       <w:r>
         <w:t xml:space="preserve">Figure </w:t>
       </w:r>
-      <w:r>
-        <w:fldChar w:fldCharType="begin"/>
-      </w:r>
-      <w:r>
-        <w:instrText xml:space="preserve"> SEQ Figure \* ARABIC </w:instrText>
-      </w:r>
-      <w:r>
-        <w:fldChar w:fldCharType="separate"/>
-      </w:r>
-      <w:r>
-        <w:rPr>
-          <w:noProof/>
-        </w:rPr>
-        <w:t>8</w:t>
-      </w:r>
-      <w:r>
-        <w:rPr>
-          <w:noProof/>
-        </w:rPr>
-        <w:fldChar w:fldCharType="end"/>
-      </w:r>
+      <w:fldSimple w:instr=" SEQ Figure \* ARABIC ">
+        <w:r>
+          <w:rPr>
+            <w:noProof/>
+          </w:rPr>
+          <w:t>8</w:t>
+        </w:r>
+      </w:fldSimple>
       <w:r>
         <w:t>: One particular 'Waiting Time Slogan'</w:t>
       </w:r>
@@ -5303,27 +5103,14 @@
       <w:r>
         <w:t xml:space="preserve">Figure </w:t>
       </w:r>
-      <w:r>
-        <w:fldChar w:fldCharType="begin"/>
-      </w:r>
-      <w:r>
-        <w:instrText xml:space="preserve"> SEQ Figure \* ARABIC </w:instrText>
-      </w:r>
-      <w:r>
-        <w:fldChar w:fldCharType="separate"/>
-      </w:r>
-      <w:r>
-        <w:rPr>
-          <w:noProof/>
-        </w:rPr>
-        <w:t>9</w:t>
-      </w:r>
-      <w:r>
-        <w:rPr>
-          <w:noProof/>
-        </w:rPr>
-        <w:fldChar w:fldCharType="end"/>
-      </w:r>
+      <w:fldSimple w:instr=" SEQ Figure \* ARABIC ">
+        <w:r>
+          <w:rPr>
+            <w:noProof/>
+          </w:rPr>
+          <w:t>9</w:t>
+        </w:r>
+      </w:fldSimple>
       <w:r>
         <w:t>: Generated Icebreakers for this Profile</w:t>
       </w:r>
@@ -5334,7 +5121,19 @@
     <w:p/>
     <w:p>
       <w:r>
-        <w:t xml:space="preserve">When a user sends a first message a chat is created this chat can be views, when the user clicks on chat overview. </w:t>
+        <w:t>When a user sends a first message a chat is created</w:t>
+      </w:r>
+      <w:r>
+        <w:t>,</w:t>
+      </w:r>
+      <w:r>
+        <w:t xml:space="preserve"> this chat can be view</w:t>
+      </w:r>
+      <w:r>
+        <w:t>ed</w:t>
+      </w:r>
+      <w:r>
+        <w:t xml:space="preserve"> when the user clicks on chat overview. </w:t>
       </w:r>
     </w:p>
     <w:p>
@@ -5407,27 +5206,14 @@
       <w:r>
         <w:t xml:space="preserve">Figure </w:t>
       </w:r>
-      <w:r>
-        <w:fldChar w:fldCharType="begin"/>
-      </w:r>
-      <w:r>
-        <w:instrText xml:space="preserve"> SEQ Figure \* ARABIC </w:instrText>
-      </w:r>
-      <w:r>
-        <w:fldChar w:fldCharType="separate"/>
-      </w:r>
-      <w:r>
-        <w:rPr>
-          <w:noProof/>
-        </w:rPr>
-        <w:t>10</w:t>
-      </w:r>
-      <w:r>
-        <w:rPr>
-          <w:noProof/>
-        </w:rPr>
-        <w:fldChar w:fldCharType="end"/>
-      </w:r>
+      <w:fldSimple w:instr=" SEQ Figure \* ARABIC ">
+        <w:r>
+          <w:rPr>
+            <w:noProof/>
+          </w:rPr>
+          <w:t>10</w:t>
+        </w:r>
+      </w:fldSimple>
       <w:r>
         <w:t>: Chat Screen with E2EE</w:t>
       </w:r>
@@ -5437,27 +5223,41 @@
     </w:p>
     <w:p>
       <w:r>
-        <w:t xml:space="preserve">This is what the user sees afterwards, here </w:t>
-      </w:r>
-      <w:proofErr w:type="gramStart"/>
-      <w:r>
-        <w:t>all of</w:t>
-      </w:r>
-      <w:proofErr w:type="gramEnd"/>
-      <w:r>
-        <w:t xml:space="preserve"> his chats are displayed. When he selects a particular chat (like here with test3) he can see all exchanged messages along with timestamps for each message. The messages on the </w:t>
-      </w:r>
-      <w:proofErr w:type="gramStart"/>
-      <w:r>
-        <w:t>right hand</w:t>
-      </w:r>
-      <w:proofErr w:type="gramEnd"/>
-      <w:r>
-        <w:t xml:space="preserve"> side are the ones </w:t>
+        <w:t>This is what the user sees afterwards, here all of his chats are displayed. When he</w:t>
+      </w:r>
+      <w:r>
+        <w:t>/she</w:t>
+      </w:r>
+      <w:r>
+        <w:t xml:space="preserve"> selects a particular chat (like here with test3) he</w:t>
+      </w:r>
+      <w:r>
+        <w:t>/she</w:t>
+      </w:r>
+      <w:r>
+        <w:t xml:space="preserve"> can see all exchanged messages along with timestamps for each message. The messages on the </w:t>
+      </w:r>
+      <w:r>
+        <w:t>right-hand</w:t>
+      </w:r>
+      <w:r>
+        <w:t xml:space="preserve"> side are the </w:t>
       </w:r>
       <w:r>
         <w:lastRenderedPageBreak/>
-        <w:t xml:space="preserve">the user wrote him/herself the messages on the left hand side are the messages of the other participant. </w:t>
+        <w:t>ones the user wrote him/</w:t>
+      </w:r>
+      <w:r>
+        <w:t>herself,</w:t>
+      </w:r>
+      <w:r>
+        <w:t xml:space="preserve"> the messages on the left</w:t>
+      </w:r>
+      <w:r>
+        <w:t>-</w:t>
+      </w:r>
+      <w:r>
+        <w:t xml:space="preserve">hand side are the messages of the other participant. </w:t>
       </w:r>
     </w:p>
     <w:p>
@@ -5533,15 +5333,7 @@
         <w:t xml:space="preserve">”, at first the values for these weights are random, this process can also be described as a matrix multiplication. Because many inputs (for example multiple pictures each with 1000 pixels for instance) are multiplied by a variety of weights. (The height of the input matrix may be the number of pictures and the width the number of pixels). </w:t>
       </w:r>
       <w:r>
-        <w:t xml:space="preserve">Each output from the matrix multiplication (weights × inputs) is called a pre-activation. A bias term is added to each pre-activation, acting as a learnable offset that adjusts the neuron’s sensitivity. The result is then passed through a non-linear activation function (e.g., </w:t>
-      </w:r>
-      <w:proofErr w:type="spellStart"/>
-      <w:r>
-        <w:t>ReLU</w:t>
-      </w:r>
-      <w:proofErr w:type="spellEnd"/>
-      <w:r>
-        <w:t>), which returns 0 for negative inputs and the input itself for positive values. This final output is called the neuron’s activation, loosely inspired by biological neurons that ‘fire’ when their input crosses a threshold.</w:t>
+        <w:t>Each output from the matrix multiplication (weights × inputs) is called a pre-activation. A bias term is added to each pre-activation, acting as a learnable offset that adjusts the neuron’s sensitivity. The result is then passed through a non-linear activation function (e.g., ReLU), which returns 0 for negative inputs and the input itself for positive values. This final output is called the neuron’s activation, loosely inspired by biological neurons that ‘fire’ when their input crosses a threshold.</w:t>
       </w:r>
       <w:r>
         <w:t xml:space="preserve"> This described process is then repeated x times. At last, there is an output, also called a “prediction”, (for example there may be 10 outputs representing the numbers 0-9</w:t>
@@ -5550,26 +5342,22 @@
         <w:t>,</w:t>
       </w:r>
       <w:r>
-        <w:t xml:space="preserve"> the neuron with the highest number at the end represents the predicted number by the neural network). As expected at first this expected output will not make any sense but that is why we need to train the AI. In the training process we know the desired output for each </w:t>
-      </w:r>
-      <w:r>
-        <w:t xml:space="preserve">input. We then compare each predicted output with the actual output. We can use functions </w:t>
-      </w:r>
-      <w:proofErr w:type="gramStart"/>
-      <w:r>
-        <w:t>like mean</w:t>
-      </w:r>
-      <w:proofErr w:type="gramEnd"/>
-      <w:r>
-        <w:t xml:space="preserve"> squared error, to estimate how bad the prediction </w:t>
-      </w:r>
-      <w:proofErr w:type="gramStart"/>
-      <w:r>
-        <w:t>actually is</w:t>
-      </w:r>
-      <w:proofErr w:type="gramEnd"/>
-      <w:r>
-        <w:t xml:space="preserve"> and then build an estimate of all predictions. But since the prediction depends on the weights which can be changed, </w:t>
+        <w:t xml:space="preserve"> the neuron with the highest number at the end represents the predicted number by the neural network). As expected at first this output will not make any sense but that is</w:t>
+      </w:r>
+      <w:r>
+        <w:t xml:space="preserve"> precisely</w:t>
+      </w:r>
+      <w:r>
+        <w:t xml:space="preserve"> why we need to train the AI. In the training process we know the desired output for each </w:t>
+      </w:r>
+      <w:r>
+        <w:t xml:space="preserve">input. We then compare each predicted output with the actual output. We can use functions like mean squared error, to estimate how bad </w:t>
+      </w:r>
+      <w:r>
+        <w:t>a certain</w:t>
+      </w:r>
+      <w:r>
+        <w:t xml:space="preserve"> prediction actually is and then build an estimate of all predictions. But since the prediction depends on the weights which can be changed, </w:t>
       </w:r>
       <w:r>
         <w:t>the</w:t>
@@ -5606,7 +5394,13 @@
       </w:r>
       <w:r>
         <w:lastRenderedPageBreak/>
-        <w:t xml:space="preserve">the weights and subtract that from the current weights. This is the basis for basically all modern AI models. </w:t>
+        <w:t>the weights and subtract that from the current weights</w:t>
+      </w:r>
+      <w:r>
+        <w:t xml:space="preserve"> (often multiplied by a learn rate)</w:t>
+      </w:r>
+      <w:r>
+        <w:t xml:space="preserve">. This is the basis for basically all modern AI models. </w:t>
       </w:r>
       <w:r>
         <w:t xml:space="preserve">   </w:t>
@@ -5660,7 +5454,13 @@
         <w:footnoteReference w:id="2"/>
       </w:r>
       <w:r>
-        <w:t xml:space="preserve">, used in between mapping the tokens into vectors and then using the vectors to predict the next. </w:t>
+        <w:t>, used in between mapping the tokens into vectors and then using the</w:t>
+      </w:r>
+      <w:r>
+        <w:t xml:space="preserve"> final</w:t>
+      </w:r>
+      <w:r>
+        <w:t xml:space="preserve"> vector to predict the next. </w:t>
       </w:r>
       <w:r>
         <w:t>To put it simply each of the sentence’s token’s embeddings (the vectors) is mapped into query, key and value vectors using matrices. Then the dot product of all key and query vector</w:t>
@@ -5675,15 +5475,7 @@
         <w:t xml:space="preserve"> and then divided by the square root of the dimension size of the vectors (for scaling)</w:t>
       </w:r>
       <w:r>
-        <w:t xml:space="preserve">, this is put into </w:t>
-      </w:r>
-      <w:proofErr w:type="spellStart"/>
-      <w:r>
-        <w:t>softmax</w:t>
-      </w:r>
-      <w:proofErr w:type="spellEnd"/>
-      <w:r>
-        <w:t xml:space="preserve"> (a function scaling all values between 0 and 1) to find out the </w:t>
+        <w:t xml:space="preserve">, this is put into softmax (a function scaling all values between 0 and 1) to find out the </w:t>
       </w:r>
       <w:r>
         <w:t>probability distribution of the results.</w:t>
@@ -5695,26 +5487,10 @@
         <w:t>a high probability means a strong relevance between tokens</w:t>
       </w:r>
       <w:r>
-        <w:t xml:space="preserve">). This in turn is multiplied by the value vectors; by learning how closely each of the embedding vectors are, the AI can learn the structure of the sentences. If the AI models is fed with a lot of sentences and information, it could thus, learn its structure and reproduce it. This is the magic behind how ChatGPT </w:t>
-      </w:r>
-      <w:proofErr w:type="gramStart"/>
-      <w:r>
-        <w:t>is able to</w:t>
-      </w:r>
-      <w:proofErr w:type="gramEnd"/>
-      <w:r>
-        <w:t xml:space="preserve"> predict the next word for an input. </w:t>
-      </w:r>
-      <w:r>
-        <w:t xml:space="preserve">(A few important aspects to mention are generative AI models often use Gelu instead of </w:t>
-      </w:r>
-      <w:proofErr w:type="spellStart"/>
-      <w:r>
-        <w:t>Relu</w:t>
-      </w:r>
-      <w:proofErr w:type="spellEnd"/>
-      <w:r>
-        <w:t xml:space="preserve"> and a cross-entropy loss instead of the mean squared error; masked self-attention is also important so that no “future” tokens are used when predicting the next token during training. Lastly, </w:t>
+        <w:t xml:space="preserve">). This in turn is multiplied by the value vectors; by learning how closely each of the embedding vectors are, the AI can learn the structure of the sentences. If the AI models is fed with a lot of sentences and information, it could thus, learn its structure and reproduce it. This is the magic behind how ChatGPT is able to predict the next word for an input. </w:t>
+      </w:r>
+      <w:r>
+        <w:t xml:space="preserve">(A few important aspects to mention are generative AI models often use Gelu instead of Relu and a cross-entropy loss instead of the mean squared error; masked self-attention is also important so that no “future” tokens are used when predicting the next token during training. Lastly, </w:t>
       </w:r>
       <w:r>
         <w:t xml:space="preserve">the model </w:t>
@@ -5764,13 +5540,8 @@
       <w:r>
         <w:t xml:space="preserve">                                                                                                                                                                                           </w:t>
       </w:r>
-      <w:proofErr w:type="gramStart"/>
-      <w:r>
-        <w:t>With</w:t>
-      </w:r>
-      <w:proofErr w:type="gramEnd"/>
-      <w:r>
-        <w:t xml:space="preserve"> this knowledge our use of the gpt2-medium model can be explained. We wanted the model to learn the structure of user profiles and corresponding “icebreakers”, thus, we had to create 200-300 of these examples. (For professional purposes a lot more a needed). These are then fed into the </w:t>
+      <w:r>
+        <w:t xml:space="preserve">With this knowledge our use of the gpt2-medium model can be explained. We wanted the model to learn the structure of user profiles and corresponding “icebreakers”, thus, we had to create 200-300 of these examples. (For professional purposes a lot more a needed). These are then fed into the </w:t>
       </w:r>
       <w:r>
         <w:t xml:space="preserve">gpt2-medium model to learn the relationship between the profiles and the icebreakers. We used a pretrained model, because, without a pretrained model, gpt2-medium would have no knowledge of grammar or sentence structure and a lot more than 200-300 examples would have been needed to train the model. Now that we understood how the model works it also makes sense why feeding the model the following structure for learning would not bring any result: “Profile </w:t>
@@ -5783,18 +5554,22 @@
         <w:t>like</w:t>
       </w:r>
       <w:r>
-        <w:t xml:space="preserve"> a way of teaching gpt2-medium the different possibilities for icebreakers for a given user profile. But now we know that this will no work as the model will learn contradicting relationships between the tokens and would not be able to produce valid output. Thus, a better structure would be “Profile A- Icebreaker 1- Icebreaker 2.... Profile B- Icebreaker 1....”. With this structure the model will learn all icebreakers corresponding to one user profile. This learned knowledge is then captured in its updated weights, these are used to then predict several icebreakers for new profiles written by users of our app. This works </w:t>
-      </w:r>
-      <w:proofErr w:type="gramStart"/>
-      <w:r>
-        <w:t xml:space="preserve">pretty </w:t>
-      </w:r>
-      <w:r>
-        <w:t>well</w:t>
-      </w:r>
-      <w:proofErr w:type="gramEnd"/>
-      <w:r>
-        <w:t>;</w:t>
+        <w:t xml:space="preserve"> a way of teaching gpt2-medium the different possib</w:t>
+      </w:r>
+      <w:r>
+        <w:t>le</w:t>
+      </w:r>
+      <w:r>
+        <w:t xml:space="preserve"> icebreakers for a given user profile. But now we know that this will no</w:t>
+      </w:r>
+      <w:r>
+        <w:t>t</w:t>
+      </w:r>
+      <w:r>
+        <w:t xml:space="preserve"> work as the model will learn contradicting relationships between the tokens and would not be able to produce valid output. Thus, a better structure would be “Profile A- Icebreaker 1- Icebreaker 2.... Profile B- Icebreaker 1....”. With this structure the model will learn all icebreakers corresponding to one user profile. This learned knowledge is then captured in its updated weights, these are used to then predict several icebreakers for new profiles written by users of our app. This works pretty </w:t>
+      </w:r>
+      <w:r>
+        <w:t>well;</w:t>
       </w:r>
       <w:r>
         <w:t xml:space="preserve"> the limitations of our fine-tuned model are discussed in the section “Challenges we have faced”. </w:t>
@@ -5818,23 +5593,34 @@
         <w:t xml:space="preserve">During the discussion, as to how this app shall look like, we derived that it is extremely important that each chat is end-to-end encrypted. The first reason is, that users may not want the server or the provider of the app to know the contents of their conversations </w:t>
       </w:r>
       <w:r>
-        <w:t>and secondly the messages are saved on servers, if they are stored as plaintext, an attacker hijacking the servers may find out all contents of each conversation. Therefore, we needed a way to prevent this. Upon creating an account, the user creates a passphrase and a magic number. The passphrase alongside the magic number is put into a hash function and only the hash value alongside the magic number (also called salt) is saved on the server. A hash function is used so that hash(</w:t>
-      </w:r>
-      <w:proofErr w:type="spellStart"/>
-      <w:proofErr w:type="gramStart"/>
-      <w:r>
-        <w:t>p,m</w:t>
-      </w:r>
-      <w:proofErr w:type="spellEnd"/>
-      <w:proofErr w:type="gramEnd"/>
-      <w:r>
-        <w:t>) = x is easy but the reverse is computationally infeasible. Then in the frontend a new public/private key pair is generated. The private key is encrypted with passphrase to the power of magic number modulo 10^12+33.</w:t>
+        <w:t>and secondly the messages are saved on servers, if they are stored as plaintext, an attacker hijacking the servers may find out all contents of each conversation. Therefore, we needed a way to prevent this. Upon creating an account, the user creates a passphrase and a magic number. The passphrase alongside the magic number is put into a hash function and only the hash value alongside the magic number (also called salt) is saved on the server. A hash function</w:t>
+      </w:r>
+      <w:r>
+        <w:t xml:space="preserve"> (sha256)</w:t>
+      </w:r>
+      <w:r>
+        <w:t xml:space="preserve"> is used so that hash(p,m) = x is easy but the reverse is computationally infeasible. Then in the frontend a new public/private key pair is generated. The private key is encrypted with passphrase to the power of magic number modulo 10^12+33.</w:t>
       </w:r>
       <w:r>
         <w:t xml:space="preserve"> (A modulo value large enough, so that brute force attacks are infeasible).</w:t>
       </w:r>
       <w:r>
-        <w:t xml:space="preserve"> The keypair is then uploaded to the server. When starting a new chat, the </w:t>
+        <w:t xml:space="preserve"> </w:t>
+      </w:r>
+      <w:r>
+        <w:t>Thus, in the end it is encrypt(</w:t>
+      </w:r>
+      <w:r>
+        <w:t>privkey, p^m%10^12+33) using AES for the encryption algorithm</w:t>
+      </w:r>
+      <w:r>
+        <w:t>.</w:t>
+      </w:r>
+      <w:r>
+        <w:t xml:space="preserve"> </w:t>
+      </w:r>
+      <w:r>
+        <w:t xml:space="preserve">The keypair is then uploaded to the server. When starting a new chat, the </w:t>
       </w:r>
       <w:r>
         <w:t>frontend</w:t>
@@ -5846,7 +5632,19 @@
         <w:t xml:space="preserve">then it </w:t>
       </w:r>
       <w:r>
-        <w:t>encrypts the first message with the symmetric key and then in turn encrypts the symmetric key twice. Once with his public key and once with the public key of the recipient.</w:t>
+        <w:t>encrypts the first message with the symmetric key and then in turn encrypts the symmetric key twice</w:t>
+      </w:r>
+      <w:r>
+        <w:t xml:space="preserve"> (using RSA-OAEP)</w:t>
+      </w:r>
+      <w:r>
+        <w:t>. Once with his</w:t>
+      </w:r>
+      <w:r>
+        <w:t>/her</w:t>
+      </w:r>
+      <w:r>
+        <w:t xml:space="preserve"> public key and once with the public key of the recipient.</w:t>
       </w:r>
       <w:r>
         <w:t xml:space="preserve"> These encrypted symmetric keys are uploaded to the server.</w:t>
@@ -5855,21 +5653,23 @@
         <w:t xml:space="preserve"> When</w:t>
       </w:r>
       <w:r>
-        <w:t xml:space="preserve"> the recipient logs into the website he/she </w:t>
-      </w:r>
-      <w:proofErr w:type="gramStart"/>
-      <w:r>
-        <w:t>has to</w:t>
-      </w:r>
-      <w:proofErr w:type="gramEnd"/>
-      <w:r>
-        <w:t xml:space="preserve"> type in the passphrase, the output hash is compared to the one stored on the server if they match, he/she is permitted to enter. His/her encrypted private key is fetched from the server, in the frontend the passphrase is used to decrypt it. Now he/she can go to the new chat. For this, the symmetric key (encrypted with this user’s public key) is fetched, the decrypted private key is used to decrypt the symmetric key, then the symmetric key is used to decrypt the new message. This lengthy process is only needed in the beginning, from the moment the user fetched the symmetric key for this chat, the key is saved in the local cache and used for encrypting/decrypting all messages during the session. (Referring to the period where the user uses our website</w:t>
+        <w:t xml:space="preserve"> the recipient logs into the website he/she has to type in the passphrase</w:t>
+      </w:r>
+      <w:r>
+        <w:t xml:space="preserve"> (the magic number is also fetched from the server)</w:t>
+      </w:r>
+      <w:r>
+        <w:t>, the output hash is compared to the one stored on the server if they match, he/she is permitted to enter. His/her encrypted private key is fetched from the server, in the frontend the passphrase is used to decrypt it. Now he/she can go to the new chat. For this, the symmetric key (encrypted with this user’s public key) is fetched, the decrypted private key is used to decrypt the symmetric key, then the symmetric key is used to decrypt the new message. This lengthy process is only needed in the beginning, from the moment the user fetched the symmetric key for this chat, the key is saved in the local cache and used for encrypting/decrypting all messages during the session. (Referring to the period where the user uses our website</w:t>
       </w:r>
       <w:r>
         <w:t xml:space="preserve">; </w:t>
       </w:r>
       <w:r>
-        <w:t xml:space="preserve">a session terminates, if a user is inactive or logs out). </w:t>
+        <w:lastRenderedPageBreak/>
+        <w:t>a session terminates, if a user is inactive or logs out</w:t>
+      </w:r>
+      <w:r>
+        <w:t xml:space="preserve">. Furthermore, for more details on the implementation please refer to our code, especially E2EEComponents in the Frontend). </w:t>
       </w:r>
     </w:p>
     <w:p>
@@ -5878,7 +5678,6 @@
       </w:pPr>
       <w:bookmarkStart w:id="36" w:name="_Toc190161234"/>
       <w:r>
-        <w:lastRenderedPageBreak/>
         <w:t xml:space="preserve">2.3.3 </w:t>
       </w:r>
       <w:r>
@@ -5982,23 +5781,7 @@
     </w:p>
     <w:p>
       <w:r>
-        <w:t xml:space="preserve">After evaluating our options, we decided to integrate </w:t>
-      </w:r>
-      <w:proofErr w:type="spellStart"/>
-      <w:r>
-        <w:t>Keycloak</w:t>
-      </w:r>
-      <w:proofErr w:type="spellEnd"/>
-      <w:r>
-        <w:t xml:space="preserve">, an open-source identity and access management solution. We containerized </w:t>
-      </w:r>
-      <w:proofErr w:type="spellStart"/>
-      <w:r>
-        <w:t>Keycloak</w:t>
-      </w:r>
-      <w:proofErr w:type="spellEnd"/>
-      <w:r>
-        <w:t xml:space="preserve"> using Docker, configuring it to listen on port 8081.</w:t>
+        <w:t>After evaluating our options, we decided to integrate Keycloak, an open-source identity and access management solution. We containerized Keycloak using Docker, configuring it to listen on port 8081.</w:t>
       </w:r>
     </w:p>
     <w:p>
@@ -6006,6 +5789,7 @@
         <w:pStyle w:val="Heading4"/>
       </w:pPr>
       <w:r>
+        <w:lastRenderedPageBreak/>
         <w:t>Implementation Overview</w:t>
       </w:r>
     </w:p>
@@ -6016,7 +5800,6 @@
     </w:p>
     <w:p>
       <w:r>
-        <w:lastRenderedPageBreak/>
         <w:t>To handle this process efficiently, we used an interceptor in our code. If a user is logged in, the interceptor appends an authentication token to each request, ensuring the structure looks like:</w:t>
       </w:r>
     </w:p>
@@ -6072,43 +5855,7 @@
           <w:kern w:val="0"/>
           <w14:ligatures w14:val="none"/>
         </w:rPr>
-        <w:t xml:space="preserve">The backend then retrieves this token and forwards it to the </w:t>
-      </w:r>
-      <w:proofErr w:type="spellStart"/>
-      <w:r>
-        <w:rPr>
-          <w:rFonts w:ascii="Times New Roman" w:eastAsia="Times New Roman" w:hAnsi="Times New Roman" w:cs="Times New Roman"/>
-          <w:kern w:val="0"/>
-          <w14:ligatures w14:val="none"/>
-        </w:rPr>
-        <w:t>Keycloak</w:t>
-      </w:r>
-      <w:proofErr w:type="spellEnd"/>
-      <w:r>
-        <w:rPr>
-          <w:rFonts w:ascii="Times New Roman" w:eastAsia="Times New Roman" w:hAnsi="Times New Roman" w:cs="Times New Roman"/>
-          <w:kern w:val="0"/>
-          <w14:ligatures w14:val="none"/>
-        </w:rPr>
-        <w:t xml:space="preserve"> microservice for validation. If the token is verified as legitimate, </w:t>
-      </w:r>
-      <w:proofErr w:type="spellStart"/>
-      <w:r>
-        <w:rPr>
-          <w:rFonts w:ascii="Times New Roman" w:eastAsia="Times New Roman" w:hAnsi="Times New Roman" w:cs="Times New Roman"/>
-          <w:kern w:val="0"/>
-          <w14:ligatures w14:val="none"/>
-        </w:rPr>
-        <w:t>Keycloak</w:t>
-      </w:r>
-      <w:proofErr w:type="spellEnd"/>
-      <w:r>
-        <w:rPr>
-          <w:rFonts w:ascii="Times New Roman" w:eastAsia="Times New Roman" w:hAnsi="Times New Roman" w:cs="Times New Roman"/>
-          <w:kern w:val="0"/>
-          <w14:ligatures w14:val="none"/>
-        </w:rPr>
-        <w:t xml:space="preserve"> sends a green flag to the backend, which then processes the request and returns the appropriate response to the frontend.</w:t>
+        <w:t>The backend then retrieves this token and forwards it to the Keycloak microservice for validation. If the token is verified as legitimate, Keycloak sends a green flag to the backend, which then processes the request and returns the appropriate response to the frontend.</w:t>
       </w:r>
     </w:p>
     <w:p>
@@ -6224,41 +5971,23 @@
       <w:r>
         <w:t xml:space="preserve">Figure </w:t>
       </w:r>
-      <w:r>
-        <w:fldChar w:fldCharType="begin"/>
-      </w:r>
-      <w:r>
-        <w:instrText xml:space="preserve"> SEQ Figure \* ARABIC </w:instrText>
-      </w:r>
-      <w:r>
-        <w:fldChar w:fldCharType="separate"/>
-      </w:r>
-      <w:r>
-        <w:rPr>
-          <w:noProof/>
-        </w:rPr>
-        <w:t>11</w:t>
-      </w:r>
-      <w:r>
-        <w:rPr>
-          <w:noProof/>
-        </w:rPr>
-        <w:fldChar w:fldCharType="end"/>
-      </w:r>
+      <w:fldSimple w:instr=" SEQ Figure \* ARABIC ">
+        <w:r>
+          <w:rPr>
+            <w:noProof/>
+          </w:rPr>
+          <w:t>11</w:t>
+        </w:r>
+      </w:fldSimple>
       <w:r>
         <w:t xml:space="preserve">: </w:t>
       </w:r>
       <w:r>
-        <w:t xml:space="preserve"> System Architecture for Authentication and Authorization Using </w:t>
-      </w:r>
-      <w:proofErr w:type="spellStart"/>
-      <w:r>
-        <w:t>Keycloak</w:t>
+        <w:t xml:space="preserve"> System Architecture for Authentication and Authorization Using Keycloak</w:t>
       </w:r>
       <w:bookmarkEnd w:id="38"/>
       <w:bookmarkEnd w:id="39"/>
       <w:bookmarkEnd w:id="40"/>
-      <w:proofErr w:type="spellEnd"/>
     </w:p>
     <w:p/>
     <w:p>
@@ -6305,6 +6034,7 @@
     </w:p>
     <w:p>
       <w:r>
+        <w:lastRenderedPageBreak/>
         <w:t>When a user enters a name into the search bar, the frontend transmits a request to the backend, which processes the query and returns a list of users whose usernames match the search criteria.</w:t>
       </w:r>
       <w:r>
@@ -6338,24 +6068,8 @@
           <w:lang w:eastAsia="de-DE"/>
           <w14:ligatures w14:val="none"/>
         </w:rPr>
-        <w:t>@</w:t>
-      </w:r>
-      <w:proofErr w:type="gramStart"/>
-      <w:r>
-        <w:rPr>
-          <w:rFonts w:ascii="Times New Roman" w:eastAsia="Times New Roman" w:hAnsi="Times New Roman" w:cs="Times New Roman"/>
-          <w:color w:val="E3EAF2"/>
-          <w:kern w:val="0"/>
-          <w:sz w:val="22"/>
-          <w:szCs w:val="22"/>
-          <w:bdr w:val="single" w:sz="2" w:space="0" w:color="auto" w:frame="1"/>
-          <w:shd w:val="clear" w:color="auto" w:fill="09090B"/>
-          <w:lang w:eastAsia="de-DE"/>
-          <w14:ligatures w14:val="none"/>
-        </w:rPr>
-        <w:t>Query(</w:t>
-      </w:r>
-      <w:proofErr w:type="gramEnd"/>
+        <w:t>@Query(</w:t>
+      </w:r>
       <w:r>
         <w:rPr>
           <w:rFonts w:ascii="Times New Roman" w:eastAsia="Times New Roman" w:hAnsi="Times New Roman" w:cs="Times New Roman"/>
@@ -6368,157 +6082,7 @@
           <w:lang w:eastAsia="de-DE"/>
           <w14:ligatures w14:val="none"/>
         </w:rPr>
-        <w:t xml:space="preserve">"SELECT p FROM </w:t>
-      </w:r>
-      <w:proofErr w:type="spellStart"/>
-      <w:r>
-        <w:rPr>
-          <w:rFonts w:ascii="Times New Roman" w:eastAsia="Times New Roman" w:hAnsi="Times New Roman" w:cs="Times New Roman"/>
-          <w:color w:val="91D076"/>
-          <w:kern w:val="0"/>
-          <w:sz w:val="22"/>
-          <w:szCs w:val="22"/>
-          <w:bdr w:val="single" w:sz="2" w:space="0" w:color="auto" w:frame="1"/>
-          <w:shd w:val="clear" w:color="auto" w:fill="09090B"/>
-          <w:lang w:eastAsia="de-DE"/>
-          <w14:ligatures w14:val="none"/>
-        </w:rPr>
-        <w:t>PublicUser</w:t>
-      </w:r>
-      <w:proofErr w:type="spellEnd"/>
-      <w:r>
-        <w:rPr>
-          <w:rFonts w:ascii="Times New Roman" w:eastAsia="Times New Roman" w:hAnsi="Times New Roman" w:cs="Times New Roman"/>
-          <w:color w:val="91D076"/>
-          <w:kern w:val="0"/>
-          <w:sz w:val="22"/>
-          <w:szCs w:val="22"/>
-          <w:bdr w:val="single" w:sz="2" w:space="0" w:color="auto" w:frame="1"/>
-          <w:shd w:val="clear" w:color="auto" w:fill="09090B"/>
-          <w:lang w:eastAsia="de-DE"/>
-          <w14:ligatures w14:val="none"/>
-        </w:rPr>
-        <w:t xml:space="preserve"> </w:t>
-      </w:r>
-      <w:proofErr w:type="spellStart"/>
-      <w:r>
-        <w:rPr>
-          <w:rFonts w:ascii="Times New Roman" w:eastAsia="Times New Roman" w:hAnsi="Times New Roman" w:cs="Times New Roman"/>
-          <w:color w:val="91D076"/>
-          <w:kern w:val="0"/>
-          <w:sz w:val="22"/>
-          <w:szCs w:val="22"/>
-          <w:bdr w:val="single" w:sz="2" w:space="0" w:color="auto" w:frame="1"/>
-          <w:shd w:val="clear" w:color="auto" w:fill="09090B"/>
-          <w:lang w:eastAsia="de-DE"/>
-          <w14:ligatures w14:val="none"/>
-        </w:rPr>
-        <w:t>ProfileEntity</w:t>
-      </w:r>
-      <w:proofErr w:type="spellEnd"/>
-      <w:r>
-        <w:rPr>
-          <w:rFonts w:ascii="Times New Roman" w:eastAsia="Times New Roman" w:hAnsi="Times New Roman" w:cs="Times New Roman"/>
-          <w:color w:val="91D076"/>
-          <w:kern w:val="0"/>
-          <w:sz w:val="22"/>
-          <w:szCs w:val="22"/>
-          <w:bdr w:val="single" w:sz="2" w:space="0" w:color="auto" w:frame="1"/>
-          <w:shd w:val="clear" w:color="auto" w:fill="09090B"/>
-          <w:lang w:eastAsia="de-DE"/>
-          <w14:ligatures w14:val="none"/>
-        </w:rPr>
-        <w:t xml:space="preserve"> p WHERE </w:t>
-      </w:r>
-      <w:proofErr w:type="spellStart"/>
-      <w:r>
-        <w:rPr>
-          <w:rFonts w:ascii="Times New Roman" w:eastAsia="Times New Roman" w:hAnsi="Times New Roman" w:cs="Times New Roman"/>
-          <w:color w:val="91D076"/>
-          <w:kern w:val="0"/>
-          <w:sz w:val="22"/>
-          <w:szCs w:val="22"/>
-          <w:bdr w:val="single" w:sz="2" w:space="0" w:color="auto" w:frame="1"/>
-          <w:shd w:val="clear" w:color="auto" w:fill="09090B"/>
-          <w:lang w:eastAsia="de-DE"/>
-          <w14:ligatures w14:val="none"/>
-        </w:rPr>
-        <w:t>p.username</w:t>
-      </w:r>
-      <w:proofErr w:type="spellEnd"/>
-      <w:r>
-        <w:rPr>
-          <w:rFonts w:ascii="Times New Roman" w:eastAsia="Times New Roman" w:hAnsi="Times New Roman" w:cs="Times New Roman"/>
-          <w:color w:val="91D076"/>
-          <w:kern w:val="0"/>
-          <w:sz w:val="22"/>
-          <w:szCs w:val="22"/>
-          <w:bdr w:val="single" w:sz="2" w:space="0" w:color="auto" w:frame="1"/>
-          <w:shd w:val="clear" w:color="auto" w:fill="09090B"/>
-          <w:lang w:eastAsia="de-DE"/>
-          <w14:ligatures w14:val="none"/>
-        </w:rPr>
-        <w:t xml:space="preserve"> LIKE %:username% AND </w:t>
-      </w:r>
-      <w:proofErr w:type="spellStart"/>
-      <w:r>
-        <w:rPr>
-          <w:rFonts w:ascii="Times New Roman" w:eastAsia="Times New Roman" w:hAnsi="Times New Roman" w:cs="Times New Roman"/>
-          <w:color w:val="91D076"/>
-          <w:kern w:val="0"/>
-          <w:sz w:val="22"/>
-          <w:szCs w:val="22"/>
-          <w:bdr w:val="single" w:sz="2" w:space="0" w:color="auto" w:frame="1"/>
-          <w:shd w:val="clear" w:color="auto" w:fill="09090B"/>
-          <w:lang w:eastAsia="de-DE"/>
-          <w14:ligatures w14:val="none"/>
-        </w:rPr>
-        <w:t>p.keycloakUser</w:t>
-      </w:r>
-      <w:proofErr w:type="spellEnd"/>
-      <w:r>
-        <w:rPr>
-          <w:rFonts w:ascii="Times New Roman" w:eastAsia="Times New Roman" w:hAnsi="Times New Roman" w:cs="Times New Roman"/>
-          <w:color w:val="91D076"/>
-          <w:kern w:val="0"/>
-          <w:sz w:val="22"/>
-          <w:szCs w:val="22"/>
-          <w:bdr w:val="single" w:sz="2" w:space="0" w:color="auto" w:frame="1"/>
-          <w:shd w:val="clear" w:color="auto" w:fill="09090B"/>
-          <w:lang w:eastAsia="de-DE"/>
-          <w14:ligatures w14:val="none"/>
-        </w:rPr>
-        <w:t xml:space="preserve"> Id &lt;&gt; :</w:t>
-      </w:r>
-      <w:proofErr w:type="spellStart"/>
-      <w:r>
-        <w:rPr>
-          <w:rFonts w:ascii="Times New Roman" w:eastAsia="Times New Roman" w:hAnsi="Times New Roman" w:cs="Times New Roman"/>
-          <w:color w:val="91D076"/>
-          <w:kern w:val="0"/>
-          <w:sz w:val="22"/>
-          <w:szCs w:val="22"/>
-          <w:bdr w:val="single" w:sz="2" w:space="0" w:color="auto" w:frame="1"/>
-          <w:shd w:val="clear" w:color="auto" w:fill="09090B"/>
-          <w:lang w:eastAsia="de-DE"/>
-          <w14:ligatures w14:val="none"/>
-        </w:rPr>
-        <w:t>currentUser</w:t>
-      </w:r>
-      <w:proofErr w:type="spellEnd"/>
-      <w:r>
-        <w:rPr>
-          <w:rFonts w:ascii="Times New Roman" w:eastAsia="Times New Roman" w:hAnsi="Times New Roman" w:cs="Times New Roman"/>
-          <w:color w:val="91D076"/>
-          <w:kern w:val="0"/>
-          <w:sz w:val="22"/>
-          <w:szCs w:val="22"/>
-          <w:bdr w:val="single" w:sz="2" w:space="0" w:color="auto" w:frame="1"/>
-          <w:shd w:val="clear" w:color="auto" w:fill="09090B"/>
-          <w:lang w:eastAsia="de-DE"/>
-          <w14:ligatures w14:val="none"/>
-        </w:rPr>
-        <w:t xml:space="preserve"> Id"</w:t>
+        <w:t>"SELECT p FROM PublicUser ProfileEntity p WHERE p.username LIKE %:username% AND p.keycloakUser Id &lt;&gt; :currentUser Id"</w:t>
       </w:r>
       <w:r>
         <w:rPr>
@@ -6553,7 +6117,6 @@
     </w:p>
     <w:p>
       <w:r>
-        <w:lastRenderedPageBreak/>
         <w:t xml:space="preserve">Importantly, the backend </w:t>
       </w:r>
       <w:r>
@@ -6624,15 +6187,7 @@
     </w:p>
     <w:p>
       <w:r>
-        <w:t xml:space="preserve">The search results are dynamically rendered in a user-friendly card format, </w:t>
-      </w:r>
-      <w:proofErr w:type="gramStart"/>
-      <w:r>
-        <w:t>similar to</w:t>
-      </w:r>
-      <w:proofErr w:type="gramEnd"/>
-      <w:r>
-        <w:t xml:space="preserve"> the available users' display. Each card presents the user's profile picture, username, and status, allowing users to quickly identify potential contacts.</w:t>
+        <w:t>The search results are dynamically rendered in a user-friendly card format, similar to the available users' display. Each card presents the user's profile picture, username, and status, allowing users to quickly identify potential contacts.</w:t>
       </w:r>
     </w:p>
     <w:p>
@@ -6674,53 +6229,12 @@
           <w:bCs/>
         </w:rPr>
       </w:pPr>
-      <w:proofErr w:type="spellStart"/>
       <w:r>
         <w:rPr>
           <w:b/>
           <w:bCs/>
         </w:rPr>
-        <w:t>AvailableUserDTO</w:t>
-      </w:r>
-      <w:proofErr w:type="spellEnd"/>
-      <w:r>
-        <w:rPr>
-          <w:b/>
-          <w:bCs/>
-        </w:rPr>
-        <w:t>=</w:t>
-      </w:r>
-      <w:proofErr w:type="gramStart"/>
-      <w:r>
-        <w:rPr>
-          <w:b/>
-          <w:bCs/>
-        </w:rPr>
-        <w:t xml:space="preserve">   [</w:t>
-      </w:r>
-      <w:proofErr w:type="gramEnd"/>
-      <w:r>
-        <w:rPr>
-          <w:b/>
-          <w:bCs/>
-        </w:rPr>
-        <w:t xml:space="preserve">id; username ; </w:t>
-      </w:r>
-      <w:proofErr w:type="spellStart"/>
-      <w:r>
-        <w:rPr>
-          <w:b/>
-          <w:bCs/>
-        </w:rPr>
-        <w:t>profilePhoto</w:t>
-      </w:r>
-      <w:proofErr w:type="spellEnd"/>
-      <w:r>
-        <w:rPr>
-          <w:b/>
-          <w:bCs/>
-        </w:rPr>
-        <w:t xml:space="preserve"> ; bio; status ]</w:t>
+        <w:t>AvailableUserDTO=   [id; username ; profilePhoto ; bio; status ]</w:t>
       </w:r>
     </w:p>
     <w:p>
@@ -6751,7 +6265,11 @@
         <w:t>ed</w:t>
       </w:r>
       <w:r>
-        <w:t xml:space="preserve"> pagination by fetching and displaying a maximum of 10 users at a time. This allows users to navigate through the list of available users easily, using "Previous" and "Next" buttons to view the next or previous set of available users. This approach enhances the user experience by preventing overwhelming amounts of information from being displayed at once and allows for smoother navigation through the available user profiles.</w:t>
+        <w:t xml:space="preserve"> pagination by fetching and displaying a maximum of 10 users at a time. This allows users to navigate through the list of available users easily, using "Previous" and "Next" buttons to view the next or previous set of available users. This approach enhances the user experience by preventing overwhelming amounts of </w:t>
+      </w:r>
+      <w:r>
+        <w:lastRenderedPageBreak/>
+        <w:t>information from being displayed at once and allows for smoother navigation through the available user profiles.</w:t>
       </w:r>
     </w:p>
     <w:p>
@@ -6769,7 +6287,6 @@
       </w:pPr>
       <w:bookmarkStart w:id="43" w:name="_Toc190161238"/>
       <w:r>
-        <w:lastRenderedPageBreak/>
         <w:t>Architecture</w:t>
       </w:r>
       <w:bookmarkEnd w:id="43"/>
@@ -6856,27 +6373,14 @@
       <w:r>
         <w:t xml:space="preserve">Figure </w:t>
       </w:r>
-      <w:r>
-        <w:fldChar w:fldCharType="begin"/>
-      </w:r>
-      <w:r>
-        <w:instrText xml:space="preserve"> SEQ Figure \* ARABIC </w:instrText>
-      </w:r>
-      <w:r>
-        <w:fldChar w:fldCharType="separate"/>
-      </w:r>
-      <w:r>
-        <w:rPr>
-          <w:noProof/>
-        </w:rPr>
-        <w:t>12</w:t>
-      </w:r>
-      <w:r>
-        <w:rPr>
-          <w:noProof/>
-        </w:rPr>
-        <w:fldChar w:fldCharType="end"/>
-      </w:r>
+      <w:fldSimple w:instr=" SEQ Figure \* ARABIC ">
+        <w:r>
+          <w:rPr>
+            <w:noProof/>
+          </w:rPr>
+          <w:t>12</w:t>
+        </w:r>
+      </w:fldSimple>
       <w:r>
         <w:t>: General Overview of our Architecture</w:t>
       </w:r>
@@ -6989,27 +6493,14 @@
       <w:r>
         <w:t xml:space="preserve">Figure </w:t>
       </w:r>
-      <w:r>
-        <w:fldChar w:fldCharType="begin"/>
-      </w:r>
-      <w:r>
-        <w:instrText xml:space="preserve"> SEQ Figure \* ARABIC </w:instrText>
-      </w:r>
-      <w:r>
-        <w:fldChar w:fldCharType="separate"/>
-      </w:r>
-      <w:r>
-        <w:rPr>
-          <w:noProof/>
-        </w:rPr>
-        <w:t>13</w:t>
-      </w:r>
-      <w:r>
-        <w:rPr>
-          <w:noProof/>
-        </w:rPr>
-        <w:fldChar w:fldCharType="end"/>
-      </w:r>
+      <w:fldSimple w:instr=" SEQ Figure \* ARABIC ">
+        <w:r>
+          <w:rPr>
+            <w:noProof/>
+          </w:rPr>
+          <w:t>13</w:t>
+        </w:r>
+      </w:fldSimple>
       <w:r>
         <w:t xml:space="preserve">: </w:t>
       </w:r>
@@ -7105,27 +6596,14 @@
       <w:r>
         <w:t xml:space="preserve">Figure </w:t>
       </w:r>
-      <w:r>
-        <w:fldChar w:fldCharType="begin"/>
-      </w:r>
-      <w:r>
-        <w:instrText xml:space="preserve"> SEQ Figure \* ARABIC </w:instrText>
-      </w:r>
-      <w:r>
-        <w:fldChar w:fldCharType="separate"/>
-      </w:r>
-      <w:r>
-        <w:rPr>
-          <w:noProof/>
-        </w:rPr>
-        <w:t>14</w:t>
-      </w:r>
-      <w:r>
-        <w:rPr>
-          <w:noProof/>
-        </w:rPr>
-        <w:fldChar w:fldCharType="end"/>
-      </w:r>
+      <w:fldSimple w:instr=" SEQ Figure \* ARABIC ">
+        <w:r>
+          <w:rPr>
+            <w:noProof/>
+          </w:rPr>
+          <w:t>14</w:t>
+        </w:r>
+      </w:fldSimple>
       <w:r>
         <w:t>: Sequence Diagram for E2EE(a)</w:t>
       </w:r>
@@ -7135,58 +6613,10 @@
     </w:p>
     <w:p>
       <w:r>
-        <w:t xml:space="preserve">This sequence diagram illustrates how end-to-end encryption is realized, through illustrating the flow when a new user registers and sends a new message to another (existing) user. Important abbreviations: hash – hashing algorithm, pk – passkey, </w:t>
-      </w:r>
-      <w:proofErr w:type="spellStart"/>
-      <w:r>
-        <w:t>mn</w:t>
-      </w:r>
-      <w:proofErr w:type="spellEnd"/>
-      <w:r>
-        <w:t xml:space="preserve"> – magic number, enc – encryption algorithm, </w:t>
-      </w:r>
-      <w:proofErr w:type="spellStart"/>
-      <w:r>
-        <w:t>enc_variable</w:t>
-      </w:r>
-      <w:proofErr w:type="spellEnd"/>
-      <w:r>
-        <w:t xml:space="preserve"> - encrypted variable, </w:t>
-      </w:r>
-      <w:proofErr w:type="spellStart"/>
-      <w:r>
-        <w:t>pubkey</w:t>
-      </w:r>
-      <w:proofErr w:type="spellEnd"/>
-      <w:r>
-        <w:t xml:space="preserve"> – public key, </w:t>
-      </w:r>
-      <w:proofErr w:type="spellStart"/>
-      <w:r>
-        <w:t>privkey</w:t>
-      </w:r>
-      <w:proofErr w:type="spellEnd"/>
-      <w:r>
-        <w:t xml:space="preserve"> – private key, </w:t>
-      </w:r>
-      <w:proofErr w:type="spellStart"/>
-      <w:r>
-        <w:t>symkey</w:t>
-      </w:r>
-      <w:proofErr w:type="spellEnd"/>
-      <w:r>
-        <w:t xml:space="preserve"> – symmetric key, msg – message</w:t>
-      </w:r>
-      <w:r>
-        <w:t xml:space="preserve">, </w:t>
-      </w:r>
-      <w:proofErr w:type="spellStart"/>
-      <w:r>
-        <w:t>db</w:t>
-      </w:r>
-      <w:proofErr w:type="spellEnd"/>
-      <w:r>
-        <w:t xml:space="preserve"> - database</w:t>
+        <w:t>This sequence diagram illustrates how end-to-end encryption is realized, through illustrating the flow when a new user registers and sends a new message to another (existing) user. Important abbreviations: hash – hashing algorithm, pk – passkey, mn – magic number, enc – encryption algorithm, enc_variable - encrypted variable, pubkey – public key, privkey – private key, symkey – symmetric key, msg – message</w:t>
+      </w:r>
+      <w:r>
+        <w:t>, db - database</w:t>
       </w:r>
       <w:r>
         <w:t xml:space="preserve">. </w:t>
@@ -7262,27 +6692,14 @@
       <w:r>
         <w:t xml:space="preserve">Figure </w:t>
       </w:r>
-      <w:r>
-        <w:fldChar w:fldCharType="begin"/>
-      </w:r>
-      <w:r>
-        <w:instrText xml:space="preserve"> SEQ Figure \* ARABIC </w:instrText>
-      </w:r>
-      <w:r>
-        <w:fldChar w:fldCharType="separate"/>
-      </w:r>
-      <w:r>
-        <w:rPr>
-          <w:noProof/>
-        </w:rPr>
-        <w:t>15</w:t>
-      </w:r>
-      <w:r>
-        <w:rPr>
-          <w:noProof/>
-        </w:rPr>
-        <w:fldChar w:fldCharType="end"/>
-      </w:r>
+      <w:fldSimple w:instr=" SEQ Figure \* ARABIC ">
+        <w:r>
+          <w:rPr>
+            <w:noProof/>
+          </w:rPr>
+          <w:t>15</w:t>
+        </w:r>
+      </w:fldSimple>
       <w:r>
         <w:t xml:space="preserve">: </w:t>
       </w:r>
@@ -7301,66 +6718,10 @@
     </w:p>
     <w:p>
       <w:r>
-        <w:t xml:space="preserve">This sequence diagram illustrates how the other user logs in and receives the new message from the new user. Important abbreviations: hash – hashing algorithm, pk – passkey, </w:t>
-      </w:r>
-      <w:proofErr w:type="spellStart"/>
-      <w:r>
-        <w:t>mn</w:t>
-      </w:r>
-      <w:proofErr w:type="spellEnd"/>
-      <w:r>
-        <w:t xml:space="preserve"> – magic number, </w:t>
-      </w:r>
-      <w:proofErr w:type="spellStart"/>
-      <w:r>
-        <w:t>decr</w:t>
-      </w:r>
-      <w:proofErr w:type="spellEnd"/>
-      <w:r>
-        <w:t xml:space="preserve"> – decryption algorithm, </w:t>
-      </w:r>
-      <w:proofErr w:type="spellStart"/>
-      <w:r>
-        <w:t>enc_variable</w:t>
-      </w:r>
-      <w:proofErr w:type="spellEnd"/>
-      <w:r>
-        <w:t xml:space="preserve"> - encrypted variable, </w:t>
-      </w:r>
-      <w:proofErr w:type="spellStart"/>
-      <w:r>
-        <w:t>pubkey</w:t>
-      </w:r>
-      <w:proofErr w:type="spellEnd"/>
-      <w:r>
-        <w:t xml:space="preserve"> – public key, </w:t>
-      </w:r>
-      <w:proofErr w:type="spellStart"/>
-      <w:r>
-        <w:t>privkey</w:t>
-      </w:r>
-      <w:proofErr w:type="spellEnd"/>
-      <w:r>
-        <w:t xml:space="preserve"> – private key, </w:t>
-      </w:r>
-      <w:proofErr w:type="spellStart"/>
-      <w:r>
-        <w:t>symkey</w:t>
-      </w:r>
-      <w:proofErr w:type="spellEnd"/>
-      <w:r>
-        <w:t xml:space="preserve"> – symmetric key, msg – message</w:t>
-      </w:r>
-      <w:r>
-        <w:t xml:space="preserve">, </w:t>
-      </w:r>
-      <w:proofErr w:type="spellStart"/>
-      <w:r>
-        <w:t>db</w:t>
-      </w:r>
-      <w:proofErr w:type="spellEnd"/>
-      <w:r>
-        <w:t xml:space="preserve"> - database</w:t>
+        <w:t>This sequence diagram illustrates how the other user logs in and receives the new message from the new user. Important abbreviations: hash – hashing algorithm, pk – passkey, mn – magic number, decr – decryption algorithm, enc_variable - encrypted variable, pubkey – public key, privkey – private key, symkey – symmetric key, msg – message</w:t>
+      </w:r>
+      <w:r>
+        <w:t>, db - database</w:t>
       </w:r>
       <w:r>
         <w:t>.</w:t>
@@ -7449,27 +6810,14 @@
       <w:r>
         <w:t xml:space="preserve">Figure </w:t>
       </w:r>
-      <w:r>
-        <w:fldChar w:fldCharType="begin"/>
-      </w:r>
-      <w:r>
-        <w:instrText xml:space="preserve"> SEQ Figure \* ARABIC </w:instrText>
-      </w:r>
-      <w:r>
-        <w:fldChar w:fldCharType="separate"/>
-      </w:r>
-      <w:r>
-        <w:rPr>
-          <w:noProof/>
-        </w:rPr>
-        <w:t>16</w:t>
-      </w:r>
-      <w:r>
-        <w:rPr>
-          <w:noProof/>
-        </w:rPr>
-        <w:fldChar w:fldCharType="end"/>
-      </w:r>
+      <w:fldSimple w:instr=" SEQ Figure \* ARABIC ">
+        <w:r>
+          <w:rPr>
+            <w:noProof/>
+          </w:rPr>
+          <w:t>16</w:t>
+        </w:r>
+      </w:fldSimple>
       <w:r>
         <w:t>: Real Time Chatting - Architecture</w:t>
       </w:r>
@@ -7604,15 +6952,7 @@
         <w:t xml:space="preserve"> listed. An Icebreaker for this profile would be: “</w:t>
       </w:r>
       <w:r>
-        <w:t xml:space="preserve">Singing is </w:t>
-      </w:r>
-      <w:proofErr w:type="gramStart"/>
-      <w:r>
-        <w:t>really nice</w:t>
-      </w:r>
-      <w:proofErr w:type="gramEnd"/>
-      <w:r>
-        <w:t>. What kind of songs do you really like singing the most?</w:t>
+        <w:t>Singing is really nice. What kind of songs do you really like singing the most?</w:t>
       </w:r>
       <w:r>
         <w:t>” Each Icebreaker has two sentences, one sentence reaffirming the interest of the person and the other asking a question about it. We believe such a structure makes the most sense for first messages but also due to limitation in the number of datasets that we have</w:t>
@@ -7631,7 +6971,13 @@
         <w:t>cannot</w:t>
       </w:r>
       <w:r>
-        <w:t xml:space="preserve"> be considered “good”. Here we want to demonstrate an example for a generates Icebreaker with the fine-tuned gpt2-medium model. Profile:</w:t>
+        <w:t xml:space="preserve"> be considered “good”. Here we want to demonstrate an example for a generate</w:t>
+      </w:r>
+      <w:r>
+        <w:t xml:space="preserve">d </w:t>
+      </w:r>
+      <w:r>
+        <w:t>Icebreaker with the fine-tuned gpt2-medium model. Profile:</w:t>
       </w:r>
       <w:r>
         <w:t>”</w:t>
@@ -7718,15 +7064,7 @@
         <w:t xml:space="preserve"> faced significant challenges because we worked on different machines. When Utkarsh for example set up the </w:t>
       </w:r>
       <w:r>
-        <w:t xml:space="preserve">login functionalities and parts of the frontend, we could not immediately run the program as we for example had older or newer versions of node.js, java, etc. Or we did not have it at all and had to download the correct version. In this regard dependencies were a huge problem as well, often they needed to be downloaded separately, as here too versions mattered this could become a lengthy process of trial and error. We tried to mitigate this problem using docker, both </w:t>
-      </w:r>
-      <w:proofErr w:type="spellStart"/>
-      <w:r>
-        <w:t>keycloak</w:t>
-      </w:r>
-      <w:proofErr w:type="spellEnd"/>
-      <w:r>
-        <w:t xml:space="preserve"> and PostgreSQL would for example run in docker. Docker tries to solve the described problem, by making the creator of a program able to include all dependencies, libraries, etc. in so called docker images.  </w:t>
+        <w:t xml:space="preserve">login functionalities and parts of the frontend, we could not immediately run the program as we for example had older or newer versions of node.js, java, etc. Or we did not have it at all and had to download the correct version. In this regard dependencies were a huge problem as well, often they needed to be downloaded separately, as here too versions mattered this could become a lengthy process of trial and error. We tried to mitigate this problem using docker, both keycloak and PostgreSQL would for example run in docker. Docker tries to solve the described problem, by making the creator of a program able to include all dependencies, libraries, etc. in so called docker images.  </w:t>
       </w:r>
       <w:r>
         <w:t>However, due to the project's complexity and numerous components, many dependency issues had to be resolved manually.</w:t>
@@ -7968,15 +7306,7 @@
     </w:p>
     <w:p>
       <w:r>
-        <w:t xml:space="preserve">This was our </w:t>
-      </w:r>
-      <w:proofErr w:type="spellStart"/>
-      <w:r>
-        <w:t>favourite</w:t>
-      </w:r>
-      <w:proofErr w:type="spellEnd"/>
-      <w:r>
-        <w:t xml:space="preserve"> project of our young career so far, mainly because we were given the freedom to create what we want and the fact that we could work on one of the most important topics in computer science of this day. Through this project we were able to understand neural networks which are th</w:t>
+        <w:t>This was our favourite project of our young career so far, mainly because we were given the freedom to create what we want and the fact that we could work on one of the most important topics in computer science of this day. Through this project we were able to understand neural networks which are th</w:t>
       </w:r>
       <w:r>
         <w:t xml:space="preserve">e basis for all modern AI. Furthermore, we were able to work with and understand the complex models of </w:t>
@@ -7985,21 +7315,19 @@
         <w:t>today’s</w:t>
       </w:r>
       <w:r>
-        <w:t xml:space="preserve"> age which extend the classic neural networks, namely generative AI models like ChatGPT. We had a lot of fun understanding how AIs like ChatGPT work and how we can fine-tune these models to our demands. Furthermore, we were able to sophisticate and enlarge our knowledge of creating complex websites, which incorporate a java driven backend (in our case </w:t>
-      </w:r>
-      <w:proofErr w:type="spellStart"/>
-      <w:r>
-        <w:t>springboot</w:t>
-      </w:r>
-      <w:proofErr w:type="spellEnd"/>
-      <w:r>
-        <w:t xml:space="preserve">), a </w:t>
+        <w:t xml:space="preserve"> age which extend the classic neural networks, namely generative AI models like ChatGPT. We had a lot of fun understanding how AIs like ChatGPT work and how we can fine-tune these models to our demands. Furthermore, we were able to sophisticate and enlarge our knowledge of creating complex websites, which incorporate a java driven backend (in our case springboot), a </w:t>
       </w:r>
       <w:r>
         <w:t>JavaScript</w:t>
       </w:r>
       <w:r>
-        <w:t xml:space="preserve"> driven frontend (in our case angular) and database structure (in our case PostgreSQL). Especially conceptualizing and implementing the chat functionality demanded a lot of our knowledge acquired in courses like: Distributed Systems or Computer Networks. Thus, we could bring a lot of the learned concepts into practice. The same can be said for the end-to-end encryption. Here the knowledge acquired in the IT Security lecture</w:t>
+        <w:t xml:space="preserve"> driven frontend (in our case angular) and </w:t>
+      </w:r>
+      <w:r>
+        <w:t xml:space="preserve">a </w:t>
+      </w:r>
+      <w:r>
+        <w:t>database structure (in our case PostgreSQL). Especially conceptualizing and implementing the chat functionality demanded a lot of our knowledge acquired in courses like: Distributed Systems or Computer Networks. Thus, we could bring a lot of the learned concepts into practice. The same can be said for the end-to-end encryption. Here the knowledge acquired in the IT Security lecture</w:t>
       </w:r>
       <w:r>
         <w:t>s</w:t>
@@ -8014,15 +7342,7 @@
         <w:t xml:space="preserve"> of vital importance to realize our ideas. </w:t>
       </w:r>
       <w:r>
-        <w:t xml:space="preserve">As the mentioned courses were among some of our </w:t>
-      </w:r>
-      <w:proofErr w:type="spellStart"/>
-      <w:r>
-        <w:t>favourites</w:t>
-      </w:r>
-      <w:proofErr w:type="spellEnd"/>
-      <w:r>
-        <w:t xml:space="preserve"> in our journey in this university, we were able to sophisticate our interests and get a first idea of what to do after acquiring our bachelor’s degree. (If all goes well all of us are finishing this year or at the beginning of next year). In </w:t>
+        <w:t xml:space="preserve">As the mentioned courses were among some of our favourites in our journey in this university, we were able to sophisticate our interests and get a first idea of what to do after acquiring our bachelor’s degree. (If all goes well all of us are finishing this year or at the beginning of next year). In </w:t>
       </w:r>
       <w:r>
         <w:t>conclusion,</w:t>

</xml_diff>

<commit_message>
location of user included
</commit_message>
<xml_diff>
--- a/IcebreakerReportChanged.docx
+++ b/IcebreakerReportChanged.docx
@@ -318,39 +318,7 @@
                                               <w:sz w:val="26"/>
                                               <w:szCs w:val="26"/>
                                             </w:rPr>
-                                            <w:t>Bilal Alali</w:t>
-                                          </w:r>
-                                          <w:r>
-                                            <w:rPr>
-                                              <w:color w:val="E97132" w:themeColor="accent2"/>
-                                              <w:sz w:val="26"/>
-                                              <w:szCs w:val="26"/>
-                                            </w:rPr>
-                                            <w:t>,</w:t>
-                                          </w:r>
-                                          <w:r>
-                                            <w:rPr>
-                                              <w:color w:val="E97132" w:themeColor="accent2"/>
-                                              <w:sz w:val="26"/>
-                                              <w:szCs w:val="26"/>
-                                            </w:rPr>
-                                            <w:t xml:space="preserve"> Utkarsh Fulara,</w:t>
-                                          </w:r>
-                                          <w:r>
-                                            <w:rPr>
-                                              <w:color w:val="E97132" w:themeColor="accent2"/>
-                                              <w:sz w:val="26"/>
-                                              <w:szCs w:val="26"/>
-                                            </w:rPr>
-                                            <w:t xml:space="preserve"> </w:t>
-                                          </w:r>
-                                          <w:r>
-                                            <w:rPr>
-                                              <w:color w:val="E97132" w:themeColor="accent2"/>
-                                              <w:sz w:val="26"/>
-                                              <w:szCs w:val="26"/>
-                                            </w:rPr>
-                                            <w:t xml:space="preserve">Andrej Sum-Shik </w:t>
+                                            <w:t>Bilal Alali, Utkarsh Fulara, Andrej Sum-Shik</w:t>
                                           </w:r>
                                         </w:p>
                                       </w:sdtContent>
@@ -657,39 +625,7 @@
                                         <w:sz w:val="26"/>
                                         <w:szCs w:val="26"/>
                                       </w:rPr>
-                                      <w:t>Bilal Alali</w:t>
-                                    </w:r>
-                                    <w:r>
-                                      <w:rPr>
-                                        <w:color w:val="E97132" w:themeColor="accent2"/>
-                                        <w:sz w:val="26"/>
-                                        <w:szCs w:val="26"/>
-                                      </w:rPr>
-                                      <w:t>,</w:t>
-                                    </w:r>
-                                    <w:r>
-                                      <w:rPr>
-                                        <w:color w:val="E97132" w:themeColor="accent2"/>
-                                        <w:sz w:val="26"/>
-                                        <w:szCs w:val="26"/>
-                                      </w:rPr>
-                                      <w:t xml:space="preserve"> Utkarsh Fulara,</w:t>
-                                    </w:r>
-                                    <w:r>
-                                      <w:rPr>
-                                        <w:color w:val="E97132" w:themeColor="accent2"/>
-                                        <w:sz w:val="26"/>
-                                        <w:szCs w:val="26"/>
-                                      </w:rPr>
-                                      <w:t xml:space="preserve"> </w:t>
-                                    </w:r>
-                                    <w:r>
-                                      <w:rPr>
-                                        <w:color w:val="E97132" w:themeColor="accent2"/>
-                                        <w:sz w:val="26"/>
-                                        <w:szCs w:val="26"/>
-                                      </w:rPr>
-                                      <w:t xml:space="preserve">Andrej Sum-Shik </w:t>
+                                      <w:t>Bilal Alali, Utkarsh Fulara, Andrej Sum-Shik</w:t>
                                     </w:r>
                                   </w:p>
                                 </w:sdtContent>
@@ -809,6 +745,7 @@
             <w:rPr>
               <w:rFonts w:eastAsiaTheme="minorEastAsia"/>
               <w:noProof/>
+              <w:lang w:val="en-DE" w:eastAsia="en-DE"/>
             </w:rPr>
           </w:pPr>
           <w:r>
@@ -820,7 +757,7 @@
           <w:r>
             <w:fldChar w:fldCharType="separate"/>
           </w:r>
-          <w:hyperlink w:anchor="_Toc190161226" w:history="1">
+          <w:hyperlink w:anchor="_Toc190222828" w:history="1">
             <w:r>
               <w:rPr>
                 <w:rStyle w:val="Hyperlink"/>
@@ -847,7 +784,7 @@
                 <w:noProof/>
                 <w:webHidden/>
               </w:rPr>
-              <w:instrText xml:space="preserve"> PAGEREF _Toc190161226 \h </w:instrText>
+              <w:instrText xml:space="preserve"> PAGEREF _Toc190222828 \h </w:instrText>
             </w:r>
             <w:r>
               <w:rPr>
@@ -888,9 +825,10 @@
             <w:rPr>
               <w:rFonts w:eastAsiaTheme="minorEastAsia"/>
               <w:noProof/>
+              <w:lang w:val="en-DE" w:eastAsia="en-DE"/>
             </w:rPr>
           </w:pPr>
-          <w:hyperlink w:anchor="_Toc190161227" w:history="1">
+          <w:hyperlink w:anchor="_Toc190222829" w:history="1">
             <w:r>
               <w:rPr>
                 <w:rStyle w:val="Hyperlink"/>
@@ -902,6 +840,7 @@
               <w:rPr>
                 <w:rFonts w:eastAsiaTheme="minorEastAsia"/>
                 <w:noProof/>
+                <w:lang w:val="en-DE" w:eastAsia="en-DE"/>
               </w:rPr>
               <w:tab/>
             </w:r>
@@ -931,7 +870,7 @@
                 <w:noProof/>
                 <w:webHidden/>
               </w:rPr>
-              <w:instrText xml:space="preserve"> PAGEREF _Toc190161227 \h </w:instrText>
+              <w:instrText xml:space="preserve"> PAGEREF _Toc190222829 \h </w:instrText>
             </w:r>
             <w:r>
               <w:rPr>
@@ -972,9 +911,10 @@
             <w:rPr>
               <w:rFonts w:eastAsiaTheme="minorEastAsia"/>
               <w:noProof/>
+              <w:lang w:val="en-DE" w:eastAsia="en-DE"/>
             </w:rPr>
           </w:pPr>
-          <w:hyperlink w:anchor="_Toc190161228" w:history="1">
+          <w:hyperlink w:anchor="_Toc190222830" w:history="1">
             <w:r>
               <w:rPr>
                 <w:rStyle w:val="Hyperlink"/>
@@ -986,6 +926,7 @@
               <w:rPr>
                 <w:rFonts w:eastAsiaTheme="minorEastAsia"/>
                 <w:noProof/>
+                <w:lang w:val="en-DE" w:eastAsia="en-DE"/>
               </w:rPr>
               <w:tab/>
             </w:r>
@@ -1015,7 +956,7 @@
                 <w:noProof/>
                 <w:webHidden/>
               </w:rPr>
-              <w:instrText xml:space="preserve"> PAGEREF _Toc190161228 \h </w:instrText>
+              <w:instrText xml:space="preserve"> PAGEREF _Toc190222830 \h </w:instrText>
             </w:r>
             <w:r>
               <w:rPr>
@@ -1055,9 +996,10 @@
             <w:rPr>
               <w:rFonts w:eastAsiaTheme="minorEastAsia"/>
               <w:noProof/>
+              <w:lang w:val="en-DE" w:eastAsia="en-DE"/>
             </w:rPr>
           </w:pPr>
-          <w:hyperlink w:anchor="_Toc190161229" w:history="1">
+          <w:hyperlink w:anchor="_Toc190222831" w:history="1">
             <w:r>
               <w:rPr>
                 <w:rStyle w:val="Hyperlink"/>
@@ -1084,7 +1026,7 @@
                 <w:noProof/>
                 <w:webHidden/>
               </w:rPr>
-              <w:instrText xml:space="preserve"> PAGEREF _Toc190161229 \h </w:instrText>
+              <w:instrText xml:space="preserve"> PAGEREF _Toc190222831 \h </w:instrText>
             </w:r>
             <w:r>
               <w:rPr>
@@ -1124,9 +1066,10 @@
             <w:rPr>
               <w:rFonts w:eastAsiaTheme="minorEastAsia"/>
               <w:noProof/>
+              <w:lang w:val="en-DE" w:eastAsia="en-DE"/>
             </w:rPr>
           </w:pPr>
-          <w:hyperlink w:anchor="_Toc190161230" w:history="1">
+          <w:hyperlink w:anchor="_Toc190222832" w:history="1">
             <w:r>
               <w:rPr>
                 <w:rStyle w:val="Hyperlink"/>
@@ -1153,7 +1096,7 @@
                 <w:noProof/>
                 <w:webHidden/>
               </w:rPr>
-              <w:instrText xml:space="preserve"> PAGEREF _Toc190161230 \h </w:instrText>
+              <w:instrText xml:space="preserve"> PAGEREF _Toc190222832 \h </w:instrText>
             </w:r>
             <w:r>
               <w:rPr>
@@ -1193,9 +1136,10 @@
             <w:rPr>
               <w:rFonts w:eastAsiaTheme="minorEastAsia"/>
               <w:noProof/>
+              <w:lang w:val="en-DE" w:eastAsia="en-DE"/>
             </w:rPr>
           </w:pPr>
-          <w:hyperlink w:anchor="_Toc190161231" w:history="1">
+          <w:hyperlink w:anchor="_Toc190222833" w:history="1">
             <w:r>
               <w:rPr>
                 <w:rStyle w:val="Hyperlink"/>
@@ -1222,7 +1166,7 @@
                 <w:noProof/>
                 <w:webHidden/>
               </w:rPr>
-              <w:instrText xml:space="preserve"> PAGEREF _Toc190161231 \h </w:instrText>
+              <w:instrText xml:space="preserve"> PAGEREF _Toc190222833 \h </w:instrText>
             </w:r>
             <w:r>
               <w:rPr>
@@ -1262,9 +1206,10 @@
             <w:rPr>
               <w:rFonts w:eastAsiaTheme="minorEastAsia"/>
               <w:noProof/>
+              <w:lang w:val="en-DE" w:eastAsia="en-DE"/>
             </w:rPr>
           </w:pPr>
-          <w:hyperlink w:anchor="_Toc190161232" w:history="1">
+          <w:hyperlink w:anchor="_Toc190222834" w:history="1">
             <w:r>
               <w:rPr>
                 <w:rStyle w:val="Hyperlink"/>
@@ -1291,7 +1236,7 @@
                 <w:noProof/>
                 <w:webHidden/>
               </w:rPr>
-              <w:instrText xml:space="preserve"> PAGEREF _Toc190161232 \h </w:instrText>
+              <w:instrText xml:space="preserve"> PAGEREF _Toc190222834 \h </w:instrText>
             </w:r>
             <w:r>
               <w:rPr>
@@ -1331,9 +1276,10 @@
             <w:rPr>
               <w:rFonts w:eastAsiaTheme="minorEastAsia"/>
               <w:noProof/>
+              <w:lang w:val="en-DE" w:eastAsia="en-DE"/>
             </w:rPr>
           </w:pPr>
-          <w:hyperlink w:anchor="_Toc190161233" w:history="1">
+          <w:hyperlink w:anchor="_Toc190222835" w:history="1">
             <w:r>
               <w:rPr>
                 <w:rStyle w:val="Hyperlink"/>
@@ -1360,7 +1306,7 @@
                 <w:noProof/>
                 <w:webHidden/>
               </w:rPr>
-              <w:instrText xml:space="preserve"> PAGEREF _Toc190161233 \h </w:instrText>
+              <w:instrText xml:space="preserve"> PAGEREF _Toc190222835 \h </w:instrText>
             </w:r>
             <w:r>
               <w:rPr>
@@ -1400,9 +1346,10 @@
             <w:rPr>
               <w:rFonts w:eastAsiaTheme="minorEastAsia"/>
               <w:noProof/>
+              <w:lang w:val="en-DE" w:eastAsia="en-DE"/>
             </w:rPr>
           </w:pPr>
-          <w:hyperlink w:anchor="_Toc190161234" w:history="1">
+          <w:hyperlink w:anchor="_Toc190222836" w:history="1">
             <w:r>
               <w:rPr>
                 <w:rStyle w:val="Hyperlink"/>
@@ -1429,7 +1376,7 @@
                 <w:noProof/>
                 <w:webHidden/>
               </w:rPr>
-              <w:instrText xml:space="preserve"> PAGEREF _Toc190161234 \h </w:instrText>
+              <w:instrText xml:space="preserve"> PAGEREF _Toc190222836 \h </w:instrText>
             </w:r>
             <w:r>
               <w:rPr>
@@ -1469,9 +1416,10 @@
             <w:rPr>
               <w:rFonts w:eastAsiaTheme="minorEastAsia"/>
               <w:noProof/>
+              <w:lang w:val="en-DE" w:eastAsia="en-DE"/>
             </w:rPr>
           </w:pPr>
-          <w:hyperlink w:anchor="_Toc190161235" w:history="1">
+          <w:hyperlink w:anchor="_Toc190222837" w:history="1">
             <w:r>
               <w:rPr>
                 <w:rStyle w:val="Hyperlink"/>
@@ -1498,7 +1446,7 @@
                 <w:noProof/>
                 <w:webHidden/>
               </w:rPr>
-              <w:instrText xml:space="preserve"> PAGEREF _Toc190161235 \h </w:instrText>
+              <w:instrText xml:space="preserve"> PAGEREF _Toc190222837 \h </w:instrText>
             </w:r>
             <w:r>
               <w:rPr>
@@ -1538,9 +1486,10 @@
             <w:rPr>
               <w:rFonts w:eastAsiaTheme="minorEastAsia"/>
               <w:noProof/>
+              <w:lang w:val="en-DE" w:eastAsia="en-DE"/>
             </w:rPr>
           </w:pPr>
-          <w:hyperlink w:anchor="_Toc190161236" w:history="1">
+          <w:hyperlink w:anchor="_Toc190222838" w:history="1">
             <w:r>
               <w:rPr>
                 <w:rStyle w:val="Hyperlink"/>
@@ -1567,7 +1516,7 @@
                 <w:noProof/>
                 <w:webHidden/>
               </w:rPr>
-              <w:instrText xml:space="preserve"> PAGEREF _Toc190161236 \h </w:instrText>
+              <w:instrText xml:space="preserve"> PAGEREF _Toc190222838 \h </w:instrText>
             </w:r>
             <w:r>
               <w:rPr>
@@ -1607,9 +1556,10 @@
             <w:rPr>
               <w:rFonts w:eastAsiaTheme="minorEastAsia"/>
               <w:noProof/>
+              <w:lang w:val="en-DE" w:eastAsia="en-DE"/>
             </w:rPr>
           </w:pPr>
-          <w:hyperlink w:anchor="_Toc190161237" w:history="1">
+          <w:hyperlink w:anchor="_Toc190222839" w:history="1">
             <w:r>
               <w:rPr>
                 <w:rStyle w:val="Hyperlink"/>
@@ -1636,7 +1586,7 @@
                 <w:noProof/>
                 <w:webHidden/>
               </w:rPr>
-              <w:instrText xml:space="preserve"> PAGEREF _Toc190161237 \h </w:instrText>
+              <w:instrText xml:space="preserve"> PAGEREF _Toc190222839 \h </w:instrText>
             </w:r>
             <w:r>
               <w:rPr>
@@ -1677,9 +1627,10 @@
             <w:rPr>
               <w:rFonts w:eastAsiaTheme="minorEastAsia"/>
               <w:noProof/>
+              <w:lang w:val="en-DE" w:eastAsia="en-DE"/>
             </w:rPr>
           </w:pPr>
-          <w:hyperlink w:anchor="_Toc190161238" w:history="1">
+          <w:hyperlink w:anchor="_Toc190222840" w:history="1">
             <w:r>
               <w:rPr>
                 <w:rStyle w:val="Hyperlink"/>
@@ -1691,6 +1642,7 @@
               <w:rPr>
                 <w:rFonts w:eastAsiaTheme="minorEastAsia"/>
                 <w:noProof/>
+                <w:lang w:val="en-DE" w:eastAsia="en-DE"/>
               </w:rPr>
               <w:tab/>
             </w:r>
@@ -1720,7 +1672,7 @@
                 <w:noProof/>
                 <w:webHidden/>
               </w:rPr>
-              <w:instrText xml:space="preserve"> PAGEREF _Toc190161238 \h </w:instrText>
+              <w:instrText xml:space="preserve"> PAGEREF _Toc190222840 \h </w:instrText>
             </w:r>
             <w:r>
               <w:rPr>
@@ -1760,9 +1712,10 @@
             <w:rPr>
               <w:rFonts w:eastAsiaTheme="minorEastAsia"/>
               <w:noProof/>
+              <w:lang w:val="en-DE" w:eastAsia="en-DE"/>
             </w:rPr>
           </w:pPr>
-          <w:hyperlink w:anchor="_Toc190161239" w:history="1">
+          <w:hyperlink w:anchor="_Toc190222841" w:history="1">
             <w:r>
               <w:rPr>
                 <w:rStyle w:val="Hyperlink"/>
@@ -1789,7 +1742,7 @@
                 <w:noProof/>
                 <w:webHidden/>
               </w:rPr>
-              <w:instrText xml:space="preserve"> PAGEREF _Toc190161239 \h </w:instrText>
+              <w:instrText xml:space="preserve"> PAGEREF _Toc190222841 \h </w:instrText>
             </w:r>
             <w:r>
               <w:rPr>
@@ -1829,9 +1782,10 @@
             <w:rPr>
               <w:rFonts w:eastAsiaTheme="minorEastAsia"/>
               <w:noProof/>
+              <w:lang w:val="en-DE" w:eastAsia="en-DE"/>
             </w:rPr>
           </w:pPr>
-          <w:hyperlink w:anchor="_Toc190161240" w:history="1">
+          <w:hyperlink w:anchor="_Toc190222842" w:history="1">
             <w:r>
               <w:rPr>
                 <w:rStyle w:val="Hyperlink"/>
@@ -1858,7 +1812,7 @@
                 <w:noProof/>
                 <w:webHidden/>
               </w:rPr>
-              <w:instrText xml:space="preserve"> PAGEREF _Toc190161240 \h </w:instrText>
+              <w:instrText xml:space="preserve"> PAGEREF _Toc190222842 \h </w:instrText>
             </w:r>
             <w:r>
               <w:rPr>
@@ -1898,9 +1852,10 @@
             <w:rPr>
               <w:rFonts w:eastAsiaTheme="minorEastAsia"/>
               <w:noProof/>
+              <w:lang w:val="en-DE" w:eastAsia="en-DE"/>
             </w:rPr>
           </w:pPr>
-          <w:hyperlink w:anchor="_Toc190161241" w:history="1">
+          <w:hyperlink w:anchor="_Toc190222843" w:history="1">
             <w:r>
               <w:rPr>
                 <w:rStyle w:val="Hyperlink"/>
@@ -1927,7 +1882,7 @@
                 <w:noProof/>
                 <w:webHidden/>
               </w:rPr>
-              <w:instrText xml:space="preserve"> PAGEREF _Toc190161241 \h </w:instrText>
+              <w:instrText xml:space="preserve"> PAGEREF _Toc190222843 \h </w:instrText>
             </w:r>
             <w:r>
               <w:rPr>
@@ -1967,9 +1922,10 @@
             <w:rPr>
               <w:rFonts w:eastAsiaTheme="minorEastAsia"/>
               <w:noProof/>
+              <w:lang w:val="en-DE" w:eastAsia="en-DE"/>
             </w:rPr>
           </w:pPr>
-          <w:hyperlink w:anchor="_Toc190161242" w:history="1">
+          <w:hyperlink w:anchor="_Toc190222844" w:history="1">
             <w:r>
               <w:rPr>
                 <w:rStyle w:val="Hyperlink"/>
@@ -1996,7 +1952,7 @@
                 <w:noProof/>
                 <w:webHidden/>
               </w:rPr>
-              <w:instrText xml:space="preserve"> PAGEREF _Toc190161242 \h </w:instrText>
+              <w:instrText xml:space="preserve"> PAGEREF _Toc190222844 \h </w:instrText>
             </w:r>
             <w:r>
               <w:rPr>
@@ -2037,9 +1993,10 @@
             <w:rPr>
               <w:rFonts w:eastAsiaTheme="minorEastAsia"/>
               <w:noProof/>
+              <w:lang w:val="en-DE" w:eastAsia="en-DE"/>
             </w:rPr>
           </w:pPr>
-          <w:hyperlink w:anchor="_Toc190161243" w:history="1">
+          <w:hyperlink w:anchor="_Toc190222845" w:history="1">
             <w:r>
               <w:rPr>
                 <w:rStyle w:val="Hyperlink"/>
@@ -2051,6 +2008,7 @@
               <w:rPr>
                 <w:rFonts w:eastAsiaTheme="minorEastAsia"/>
                 <w:noProof/>
+                <w:lang w:val="en-DE" w:eastAsia="en-DE"/>
               </w:rPr>
               <w:tab/>
             </w:r>
@@ -2080,7 +2038,7 @@
                 <w:noProof/>
                 <w:webHidden/>
               </w:rPr>
-              <w:instrText xml:space="preserve"> PAGEREF _Toc190161243 \h </w:instrText>
+              <w:instrText xml:space="preserve"> PAGEREF _Toc190222845 \h </w:instrText>
             </w:r>
             <w:r>
               <w:rPr>
@@ -2120,9 +2078,10 @@
             <w:rPr>
               <w:rFonts w:eastAsiaTheme="minorEastAsia"/>
               <w:noProof/>
+              <w:lang w:val="en-DE" w:eastAsia="en-DE"/>
             </w:rPr>
           </w:pPr>
-          <w:hyperlink w:anchor="_Toc190161244" w:history="1">
+          <w:hyperlink w:anchor="_Toc190222846" w:history="1">
             <w:r>
               <w:rPr>
                 <w:rStyle w:val="Hyperlink"/>
@@ -2149,7 +2108,7 @@
                 <w:noProof/>
                 <w:webHidden/>
               </w:rPr>
-              <w:instrText xml:space="preserve"> PAGEREF _Toc190161244 \h </w:instrText>
+              <w:instrText xml:space="preserve"> PAGEREF _Toc190222846 \h </w:instrText>
             </w:r>
             <w:r>
               <w:rPr>
@@ -2189,9 +2148,10 @@
             <w:rPr>
               <w:rFonts w:eastAsiaTheme="minorEastAsia"/>
               <w:noProof/>
+              <w:lang w:val="en-DE" w:eastAsia="en-DE"/>
             </w:rPr>
           </w:pPr>
-          <w:hyperlink w:anchor="_Toc190161245" w:history="1">
+          <w:hyperlink w:anchor="_Toc190222847" w:history="1">
             <w:r>
               <w:rPr>
                 <w:rStyle w:val="Hyperlink"/>
@@ -2218,7 +2178,7 @@
                 <w:noProof/>
                 <w:webHidden/>
               </w:rPr>
-              <w:instrText xml:space="preserve"> PAGEREF _Toc190161245 \h </w:instrText>
+              <w:instrText xml:space="preserve"> PAGEREF _Toc190222847 \h </w:instrText>
             </w:r>
             <w:r>
               <w:rPr>
@@ -2259,9 +2219,10 @@
             <w:rPr>
               <w:rFonts w:eastAsiaTheme="minorEastAsia"/>
               <w:noProof/>
+              <w:lang w:val="en-DE" w:eastAsia="en-DE"/>
             </w:rPr>
           </w:pPr>
-          <w:hyperlink w:anchor="_Toc190161246" w:history="1">
+          <w:hyperlink w:anchor="_Toc190222848" w:history="1">
             <w:r>
               <w:rPr>
                 <w:rStyle w:val="Hyperlink"/>
@@ -2273,6 +2234,7 @@
               <w:rPr>
                 <w:rFonts w:eastAsiaTheme="minorEastAsia"/>
                 <w:noProof/>
+                <w:lang w:val="en-DE" w:eastAsia="en-DE"/>
               </w:rPr>
               <w:tab/>
             </w:r>
@@ -2302,7 +2264,7 @@
                 <w:noProof/>
                 <w:webHidden/>
               </w:rPr>
-              <w:instrText xml:space="preserve"> PAGEREF _Toc190161246 \h </w:instrText>
+              <w:instrText xml:space="preserve"> PAGEREF _Toc190222848 \h </w:instrText>
             </w:r>
             <w:r>
               <w:rPr>
@@ -2343,9 +2305,10 @@
             <w:rPr>
               <w:rFonts w:eastAsiaTheme="minorEastAsia"/>
               <w:noProof/>
+              <w:lang w:val="en-DE" w:eastAsia="en-DE"/>
             </w:rPr>
           </w:pPr>
-          <w:hyperlink w:anchor="_Toc190161247" w:history="1">
+          <w:hyperlink w:anchor="_Toc190222849" w:history="1">
             <w:r>
               <w:rPr>
                 <w:rStyle w:val="Hyperlink"/>
@@ -2357,6 +2320,7 @@
               <w:rPr>
                 <w:rFonts w:eastAsiaTheme="minorEastAsia"/>
                 <w:noProof/>
+                <w:lang w:val="en-DE" w:eastAsia="en-DE"/>
               </w:rPr>
               <w:tab/>
             </w:r>
@@ -2386,7 +2350,7 @@
                 <w:noProof/>
                 <w:webHidden/>
               </w:rPr>
-              <w:instrText xml:space="preserve"> PAGEREF _Toc190161247 \h </w:instrText>
+              <w:instrText xml:space="preserve"> PAGEREF _Toc190222849 \h </w:instrText>
             </w:r>
             <w:r>
               <w:rPr>
@@ -2427,9 +2391,10 @@
             <w:rPr>
               <w:rFonts w:eastAsiaTheme="minorEastAsia"/>
               <w:noProof/>
+              <w:lang w:val="en-DE" w:eastAsia="en-DE"/>
             </w:rPr>
           </w:pPr>
-          <w:hyperlink w:anchor="_Toc190161248" w:history="1">
+          <w:hyperlink w:anchor="_Toc190222850" w:history="1">
             <w:r>
               <w:rPr>
                 <w:rStyle w:val="Hyperlink"/>
@@ -2441,6 +2406,7 @@
               <w:rPr>
                 <w:rFonts w:eastAsiaTheme="minorEastAsia"/>
                 <w:noProof/>
+                <w:lang w:val="en-DE" w:eastAsia="en-DE"/>
               </w:rPr>
               <w:tab/>
             </w:r>
@@ -2470,7 +2436,7 @@
                 <w:noProof/>
                 <w:webHidden/>
               </w:rPr>
-              <w:instrText xml:space="preserve"> PAGEREF _Toc190161248 \h </w:instrText>
+              <w:instrText xml:space="preserve"> PAGEREF _Toc190222850 \h </w:instrText>
             </w:r>
             <w:r>
               <w:rPr>
@@ -2511,9 +2477,10 @@
             <w:rPr>
               <w:rFonts w:eastAsiaTheme="minorEastAsia"/>
               <w:noProof/>
+              <w:lang w:val="en-DE" w:eastAsia="en-DE"/>
             </w:rPr>
           </w:pPr>
-          <w:hyperlink w:anchor="_Toc190161249" w:history="1">
+          <w:hyperlink w:anchor="_Toc190222851" w:history="1">
             <w:r>
               <w:rPr>
                 <w:rStyle w:val="Hyperlink"/>
@@ -2525,6 +2492,7 @@
               <w:rPr>
                 <w:rFonts w:eastAsiaTheme="minorEastAsia"/>
                 <w:noProof/>
+                <w:lang w:val="en-DE" w:eastAsia="en-DE"/>
               </w:rPr>
               <w:tab/>
             </w:r>
@@ -2554,7 +2522,7 @@
                 <w:noProof/>
                 <w:webHidden/>
               </w:rPr>
-              <w:instrText xml:space="preserve"> PAGEREF _Toc190161249 \h </w:instrText>
+              <w:instrText xml:space="preserve"> PAGEREF _Toc190222851 \h </w:instrText>
             </w:r>
             <w:r>
               <w:rPr>
@@ -2595,9 +2563,10 @@
             <w:rPr>
               <w:rFonts w:eastAsiaTheme="minorEastAsia"/>
               <w:noProof/>
+              <w:lang w:val="en-DE" w:eastAsia="en-DE"/>
             </w:rPr>
           </w:pPr>
-          <w:hyperlink w:anchor="_Toc190161250" w:history="1">
+          <w:hyperlink w:anchor="_Toc190222852" w:history="1">
             <w:r>
               <w:rPr>
                 <w:rStyle w:val="Hyperlink"/>
@@ -2609,6 +2578,7 @@
               <w:rPr>
                 <w:rFonts w:eastAsiaTheme="minorEastAsia"/>
                 <w:noProof/>
+                <w:lang w:val="en-DE" w:eastAsia="en-DE"/>
               </w:rPr>
               <w:tab/>
             </w:r>
@@ -2638,7 +2608,7 @@
                 <w:noProof/>
                 <w:webHidden/>
               </w:rPr>
-              <w:instrText xml:space="preserve"> PAGEREF _Toc190161250 \h </w:instrText>
+              <w:instrText xml:space="preserve"> PAGEREF _Toc190222852 \h </w:instrText>
             </w:r>
             <w:r>
               <w:rPr>
@@ -2679,9 +2649,10 @@
             <w:rPr>
               <w:rFonts w:eastAsiaTheme="minorEastAsia"/>
               <w:noProof/>
+              <w:lang w:val="en-DE" w:eastAsia="en-DE"/>
             </w:rPr>
           </w:pPr>
-          <w:hyperlink w:anchor="_Toc190161251" w:history="1">
+          <w:hyperlink w:anchor="_Toc190222853" w:history="1">
             <w:r>
               <w:rPr>
                 <w:rStyle w:val="Hyperlink"/>
@@ -2693,6 +2664,7 @@
               <w:rPr>
                 <w:rFonts w:eastAsiaTheme="minorEastAsia"/>
                 <w:noProof/>
+                <w:lang w:val="en-DE" w:eastAsia="en-DE"/>
               </w:rPr>
               <w:tab/>
             </w:r>
@@ -2722,7 +2694,7 @@
                 <w:noProof/>
                 <w:webHidden/>
               </w:rPr>
-              <w:instrText xml:space="preserve"> PAGEREF _Toc190161251 \h </w:instrText>
+              <w:instrText xml:space="preserve"> PAGEREF _Toc190222853 \h </w:instrText>
             </w:r>
             <w:r>
               <w:rPr>
@@ -2770,7 +2742,7 @@
       <w:pPr>
         <w:pStyle w:val="Heading1"/>
       </w:pPr>
-      <w:bookmarkStart w:id="0" w:name="_Toc190161226"/>
+      <w:bookmarkStart w:id="0" w:name="_Toc190222828"/>
       <w:r>
         <w:lastRenderedPageBreak/>
         <w:t>Table of figures</w:t>
@@ -3914,7 +3886,7 @@
           <w:numId w:val="2"/>
         </w:numPr>
       </w:pPr>
-      <w:bookmarkStart w:id="1" w:name="_Toc190161227"/>
+      <w:bookmarkStart w:id="1" w:name="_Toc190222829"/>
       <w:r>
         <w:lastRenderedPageBreak/>
         <w:t>Introduction</w:t>
@@ -3923,16 +3895,72 @@
     </w:p>
     <w:p>
       <w:r>
-        <w:t>Nowadays the term AI is discussed in nearly every corner of this world. The Term AI refers to artificial intelligence. But what that actually means is hard to tell, as we humans do not have a decisive definition of the term intelligence. Mainly because our own intellect is still a mystery to us. The term artificial seems a lot more straightforward, as it refers to something that is man</w:t>
+        <w:t xml:space="preserve">Nowadays the term AI is discussed in nearly every corner of this world. The Term AI refers to artificial intelligence. But what that </w:t>
+      </w:r>
+      <w:proofErr w:type="gramStart"/>
+      <w:r>
+        <w:t>actually means</w:t>
+      </w:r>
+      <w:proofErr w:type="gramEnd"/>
+      <w:r>
+        <w:t xml:space="preserve"> is hard to tell, as we humans do not have a decisive definition of the term intelligence. Mainly because our own intellect is still a mystery to us. The term artificial seems a lot more straightforward, as it refers to something that is man</w:t>
       </w:r>
       <w:r>
         <w:t>-</w:t>
       </w:r>
       <w:r>
-        <w:t>made and not naturally produced. (Although as every component in every machine is made out of particles, you cannot definitely prove that there is not a planet in the universe where this particular machine was made by nature). To still derive a general definition artificial intelligence refers to a man-made machine which exhibits cognitive skills similar to that of a human. In recent years AI has made further progress and was able to sophisticate itself in everyday life, that is to escape from the purely scientific world and acquiring general relevance in the world of all human beings. ChatGPT made a significant contribution to this change, as it allowed every human being to come into contact with the scientific and mathematical world of AI, without having to understand any of the complex structure behind it. For most of us ChatGPT has become an irreplaceable companion that helps us in our everyday tasks. Especially for university students this technology became a brand-new way of learning and understanding complex concepts in every branch of research</w:t>
-      </w:r>
-      <w:r>
-        <w:t>. But as popular as AI is, it is also a highly controversial topic. Many fear the rise of AI, as it has the potential to become a lot smarter than us. Although, there a valid reasons for this fear, a bigger problem right now stems from the fact that most people discussing this topic do not actually understand how AIs like ChatGPT work</w:t>
+        <w:t xml:space="preserve">made and not naturally produced. (Although as every component in every machine is </w:t>
+      </w:r>
+      <w:proofErr w:type="gramStart"/>
+      <w:r>
+        <w:t>made out of</w:t>
+      </w:r>
+      <w:proofErr w:type="gramEnd"/>
+      <w:r>
+        <w:t xml:space="preserve"> particles, you cannot definitely prove that there is not a planet in the universe where this particular machine was made by nature). To still derive a general definition artificial intelligence refers to a man-made machine which exhibits cognitive skills </w:t>
+      </w:r>
+      <w:proofErr w:type="gramStart"/>
+      <w:r>
+        <w:t>similar to</w:t>
+      </w:r>
+      <w:proofErr w:type="gramEnd"/>
+      <w:r>
+        <w:t xml:space="preserve"> that of a human. In recent years AI has made further progress and was able to sophisticate itself in everyday life, that is to escape from the purely scientific world and acquiring general relevance in the world of all human beings. ChatGPT made a significant contribution to this change, as it allowed every human being to </w:t>
+      </w:r>
+      <w:proofErr w:type="gramStart"/>
+      <w:r>
+        <w:t>come into contact with</w:t>
+      </w:r>
+      <w:proofErr w:type="gramEnd"/>
+      <w:r>
+        <w:t xml:space="preserve"> the scientific and mathematical world of AI, without having to understand any of the complex structure behind it. For most of us ChatGPT has become an irreplaceable companion that helps us in our everyday tasks. Especially for university </w:t>
+      </w:r>
+      <w:proofErr w:type="gramStart"/>
+      <w:r>
+        <w:t>students</w:t>
+      </w:r>
+      <w:proofErr w:type="gramEnd"/>
+      <w:r>
+        <w:t xml:space="preserve"> this technology became a brand-new way of learning and understanding complex concepts in every branch of research</w:t>
+      </w:r>
+      <w:r>
+        <w:t xml:space="preserve">. But as popular as AI is, it is also a highly controversial topic. Many fear the rise of AI, as it has the potential to become a lot smarter than us. </w:t>
+      </w:r>
+      <w:proofErr w:type="gramStart"/>
+      <w:r>
+        <w:t>Although,</w:t>
+      </w:r>
+      <w:proofErr w:type="gramEnd"/>
+      <w:r>
+        <w:t xml:space="preserve"> there a </w:t>
+      </w:r>
+      <w:proofErr w:type="gramStart"/>
+      <w:r>
+        <w:t>valid reasons</w:t>
+      </w:r>
+      <w:proofErr w:type="gramEnd"/>
+      <w:r>
+        <w:t xml:space="preserve"> for this fear, a bigger problem right now stems from the fact that most people discussing this topic do not actually understand how AIs like ChatGPT work</w:t>
       </w:r>
       <w:r>
         <w:rPr>
@@ -3947,13 +3975,29 @@
         <w:t xml:space="preserve">ChatGPT does not actually understand us, what it does instead is predict the most likely next word for an input. It then concatenates the input and the predicted word as a new input and repeats this process. This is resumed until there is a response. In this project we want to leverage this “skill” ChatGPT has, we take user profiles as an input and </w:t>
       </w:r>
       <w:r>
-        <w:t>try to produce an output for that. We call the desired output “Icebreakers” and as the name implies, we want this system to generate good first messages for a given user profile. All of this is part of a real-time chat application. How we realised this task and what problems and obstacles we face</w:t>
+        <w:t xml:space="preserve">try to produce an output for that. We call the desired output “Icebreakers” and as the name implies, we want this system to generate good first messages for a given user profile. All of this is part of a real-time chat application. How we </w:t>
+      </w:r>
+      <w:proofErr w:type="spellStart"/>
+      <w:r>
+        <w:t>realised</w:t>
+      </w:r>
+      <w:proofErr w:type="spellEnd"/>
+      <w:r>
+        <w:t xml:space="preserve"> this task and what problems and obstacles we face</w:t>
       </w:r>
       <w:r>
         <w:t>d</w:t>
       </w:r>
       <w:r>
-        <w:t xml:space="preserve"> will be discussed in this report. Furthermore, this report serves as a first dive into the strange and scientific world of AI, that we as team began diving into since the start of this semester (October 2024). </w:t>
+        <w:t xml:space="preserve"> will be discussed in this report. Furthermore, this report serves as a first dive into the strange and scientific world of AI, that we as </w:t>
+      </w:r>
+      <w:proofErr w:type="gramStart"/>
+      <w:r>
+        <w:t>team</w:t>
+      </w:r>
+      <w:proofErr w:type="gramEnd"/>
+      <w:r>
+        <w:t xml:space="preserve"> began diving into since the start of this semester (October 2024). </w:t>
       </w:r>
     </w:p>
     <w:p/>
@@ -3966,7 +4010,7 @@
           <w:numId w:val="2"/>
         </w:numPr>
       </w:pPr>
-      <w:bookmarkStart w:id="2" w:name="_Toc190161228"/>
+      <w:bookmarkStart w:id="2" w:name="_Toc190222830"/>
       <w:r>
         <w:lastRenderedPageBreak/>
         <w:t>What is our app?</w:t>
@@ -3984,17 +4028,49 @@
         <w:t xml:space="preserve"> </w:t>
       </w:r>
       <w:r>
-        <w:t xml:space="preserve">she can select another user: Bilal. Then our AI analyses the description that Bilal wrote about himself and suggests Laura a few potential first messages she can send to Bilal. For instance: Bilal wrote about himself that he likes boxing, so a potential first message may be: “Boxing is so nerve-wrecking. Who is your favourite Boxer?” Laura selects this Icebreaker and sends it as a first message. A new chat now exists between Laura and Bilal. Here they can spend as much time texting each other as they want and best of all, only they know </w:t>
-      </w:r>
-      <w:r>
-        <w:t xml:space="preserve">the content of their conversation. Because we value user privacy, we want this chatting feature to be end-to-end encrypted, this means only Laura and Bilal have the means to decrypt the exchanged messages. </w:t>
+        <w:t xml:space="preserve">she can select another user: Bilal. Then our AI analyses the description that Bilal wrote about himself and </w:t>
+      </w:r>
+      <w:proofErr w:type="gramStart"/>
+      <w:r>
+        <w:t>suggests</w:t>
+      </w:r>
+      <w:proofErr w:type="gramEnd"/>
+      <w:r>
+        <w:t xml:space="preserve"> Laura a few </w:t>
+      </w:r>
+      <w:proofErr w:type="gramStart"/>
+      <w:r>
+        <w:t>potential</w:t>
+      </w:r>
+      <w:proofErr w:type="gramEnd"/>
+      <w:r>
+        <w:t xml:space="preserve"> first messages she can send to Bilal. For instance: Bilal wrote about himself that he likes boxing, so a potential first message may be: “Boxing is so nerve-wrecking. Who is your </w:t>
+      </w:r>
+      <w:proofErr w:type="spellStart"/>
+      <w:r>
+        <w:t>favourite</w:t>
+      </w:r>
+      <w:proofErr w:type="spellEnd"/>
+      <w:r>
+        <w:t xml:space="preserve"> Boxer?” Laura selects this Icebreaker and sends it as a first message. A new chat now exists between Laura and Bilal. Here they can spend as much time texting each other as they want and best of all, only they know </w:t>
+      </w:r>
+      <w:r>
+        <w:t xml:space="preserve">the content of their conversation. Because we value user privacy, we want this chatting feature to be </w:t>
+      </w:r>
+      <w:proofErr w:type="gramStart"/>
+      <w:r>
+        <w:t>end-to-end encrypted</w:t>
+      </w:r>
+      <w:proofErr w:type="gramEnd"/>
+      <w:r>
+        <w:t xml:space="preserve">, this means only Laura and Bilal have the means to decrypt the exchanged messages. </w:t>
       </w:r>
     </w:p>
     <w:p>
       <w:pPr>
         <w:pStyle w:val="Heading2"/>
       </w:pPr>
-      <w:bookmarkStart w:id="3" w:name="_Toc190161229"/>
+      <w:bookmarkStart w:id="3" w:name="_Toc190222831"/>
       <w:r>
         <w:t xml:space="preserve">2.1 </w:t>
       </w:r>
@@ -4248,7 +4324,15 @@
         <w:t xml:space="preserve"> </w:t>
       </w:r>
       <w:r>
-        <w:t xml:space="preserve">Users can logout manually </w:t>
+        <w:t xml:space="preserve">Users can </w:t>
+      </w:r>
+      <w:proofErr w:type="gramStart"/>
+      <w:r>
+        <w:t>logout</w:t>
+      </w:r>
+      <w:proofErr w:type="gramEnd"/>
+      <w:r>
+        <w:t xml:space="preserve"> manually </w:t>
       </w:r>
     </w:p>
     <w:p>
@@ -4267,7 +4351,7 @@
       <w:pPr>
         <w:pStyle w:val="Heading2"/>
       </w:pPr>
-      <w:bookmarkStart w:id="4" w:name="_Toc190161230"/>
+      <w:bookmarkStart w:id="4" w:name="_Toc190222832"/>
       <w:r>
         <w:lastRenderedPageBreak/>
         <w:t xml:space="preserve">2.2 </w:t>
@@ -4341,14 +4425,27 @@
       <w:r>
         <w:t xml:space="preserve">Figure </w:t>
       </w:r>
-      <w:fldSimple w:instr=" SEQ Figure \* ARABIC ">
-        <w:r>
-          <w:rPr>
-            <w:noProof/>
-          </w:rPr>
-          <w:t>1</w:t>
-        </w:r>
-      </w:fldSimple>
+      <w:r>
+        <w:fldChar w:fldCharType="begin"/>
+      </w:r>
+      <w:r>
+        <w:instrText xml:space="preserve"> SEQ Figure \* ARABIC </w:instrText>
+      </w:r>
+      <w:r>
+        <w:fldChar w:fldCharType="separate"/>
+      </w:r>
+      <w:r>
+        <w:rPr>
+          <w:noProof/>
+        </w:rPr>
+        <w:t>1</w:t>
+      </w:r>
+      <w:r>
+        <w:rPr>
+          <w:noProof/>
+        </w:rPr>
+        <w:fldChar w:fldCharType="end"/>
+      </w:r>
       <w:r>
         <w:t xml:space="preserve"> High Level Component Overview</w:t>
       </w:r>
@@ -4436,16 +4533,37 @@
       <w:r>
         <w:t xml:space="preserve">Figure </w:t>
       </w:r>
-      <w:fldSimple w:instr=" SEQ Figure \* ARABIC ">
-        <w:r>
-          <w:rPr>
-            <w:noProof/>
-          </w:rPr>
-          <w:t>2</w:t>
-        </w:r>
-      </w:fldSimple>
-      <w:r>
-        <w:t>: Keycloak Login Terminal</w:t>
+      <w:r>
+        <w:fldChar w:fldCharType="begin"/>
+      </w:r>
+      <w:r>
+        <w:instrText xml:space="preserve"> SEQ Figure \* ARABIC </w:instrText>
+      </w:r>
+      <w:r>
+        <w:fldChar w:fldCharType="separate"/>
+      </w:r>
+      <w:r>
+        <w:rPr>
+          <w:noProof/>
+        </w:rPr>
+        <w:t>2</w:t>
+      </w:r>
+      <w:r>
+        <w:rPr>
+          <w:noProof/>
+        </w:rPr>
+        <w:fldChar w:fldCharType="end"/>
+      </w:r>
+      <w:r>
+        <w:t xml:space="preserve">: </w:t>
+      </w:r>
+      <w:proofErr w:type="spellStart"/>
+      <w:r>
+        <w:t>Keycloak</w:t>
+      </w:r>
+      <w:proofErr w:type="spellEnd"/>
+      <w:r>
+        <w:t xml:space="preserve"> Login Terminal</w:t>
       </w:r>
       <w:bookmarkEnd w:id="6"/>
       <w:bookmarkEnd w:id="7"/>
@@ -4454,7 +4572,15 @@
     <w:p/>
     <w:p>
       <w:r>
-        <w:t>When the login was successful new users have to create a passphrase and a magic number</w:t>
+        <w:t xml:space="preserve">When the login was successful new users </w:t>
+      </w:r>
+      <w:proofErr w:type="gramStart"/>
+      <w:r>
+        <w:t>have to</w:t>
+      </w:r>
+      <w:proofErr w:type="gramEnd"/>
+      <w:r>
+        <w:t xml:space="preserve"> create a passphrase and a magic number</w:t>
       </w:r>
       <w:r>
         <w:t>,</w:t>
@@ -4536,14 +4662,27 @@
       <w:r>
         <w:t xml:space="preserve">Figure </w:t>
       </w:r>
-      <w:fldSimple w:instr=" SEQ Figure \* ARABIC ">
-        <w:r>
-          <w:rPr>
-            <w:noProof/>
-          </w:rPr>
-          <w:t>3</w:t>
-        </w:r>
-      </w:fldSimple>
+      <w:r>
+        <w:fldChar w:fldCharType="begin"/>
+      </w:r>
+      <w:r>
+        <w:instrText xml:space="preserve"> SEQ Figure \* ARABIC </w:instrText>
+      </w:r>
+      <w:r>
+        <w:fldChar w:fldCharType="separate"/>
+      </w:r>
+      <w:r>
+        <w:rPr>
+          <w:noProof/>
+        </w:rPr>
+        <w:t>3</w:t>
+      </w:r>
+      <w:r>
+        <w:rPr>
+          <w:noProof/>
+        </w:rPr>
+        <w:fldChar w:fldCharType="end"/>
+      </w:r>
       <w:r>
         <w:rPr>
           <w:lang w:val="de-DE"/>
@@ -4624,14 +4763,27 @@
       <w:r>
         <w:t xml:space="preserve">Figure </w:t>
       </w:r>
-      <w:fldSimple w:instr=" SEQ Figure \* ARABIC ">
-        <w:r>
-          <w:rPr>
-            <w:noProof/>
-          </w:rPr>
-          <w:t>4</w:t>
-        </w:r>
-      </w:fldSimple>
+      <w:r>
+        <w:fldChar w:fldCharType="begin"/>
+      </w:r>
+      <w:r>
+        <w:instrText xml:space="preserve"> SEQ Figure \* ARABIC </w:instrText>
+      </w:r>
+      <w:r>
+        <w:fldChar w:fldCharType="separate"/>
+      </w:r>
+      <w:r>
+        <w:rPr>
+          <w:noProof/>
+        </w:rPr>
+        <w:t>4</w:t>
+      </w:r>
+      <w:r>
+        <w:rPr>
+          <w:noProof/>
+        </w:rPr>
+        <w:fldChar w:fldCharType="end"/>
+      </w:r>
       <w:r>
         <w:t>: Passphrase Setup</w:t>
       </w:r>
@@ -4733,14 +4885,27 @@
       <w:r>
         <w:t xml:space="preserve">Figure </w:t>
       </w:r>
-      <w:fldSimple w:instr=" SEQ Figure \* ARABIC ">
-        <w:r>
-          <w:rPr>
-            <w:noProof/>
-          </w:rPr>
-          <w:t>5</w:t>
-        </w:r>
-      </w:fldSimple>
+      <w:r>
+        <w:fldChar w:fldCharType="begin"/>
+      </w:r>
+      <w:r>
+        <w:instrText xml:space="preserve"> SEQ Figure \* ARABIC </w:instrText>
+      </w:r>
+      <w:r>
+        <w:fldChar w:fldCharType="separate"/>
+      </w:r>
+      <w:r>
+        <w:rPr>
+          <w:noProof/>
+        </w:rPr>
+        <w:t>5</w:t>
+      </w:r>
+      <w:r>
+        <w:rPr>
+          <w:noProof/>
+        </w:rPr>
+        <w:fldChar w:fldCharType="end"/>
+      </w:r>
       <w:r>
         <w:t>: Available Users-Home Screen</w:t>
       </w:r>
@@ -4824,14 +4989,27 @@
       <w:r>
         <w:t xml:space="preserve">Figure </w:t>
       </w:r>
-      <w:fldSimple w:instr=" SEQ Figure \* ARABIC ">
-        <w:r>
-          <w:rPr>
-            <w:noProof/>
-          </w:rPr>
-          <w:t>6</w:t>
-        </w:r>
-      </w:fldSimple>
+      <w:r>
+        <w:fldChar w:fldCharType="begin"/>
+      </w:r>
+      <w:r>
+        <w:instrText xml:space="preserve"> SEQ Figure \* ARABIC </w:instrText>
+      </w:r>
+      <w:r>
+        <w:fldChar w:fldCharType="separate"/>
+      </w:r>
+      <w:r>
+        <w:rPr>
+          <w:noProof/>
+        </w:rPr>
+        <w:t>6</w:t>
+      </w:r>
+      <w:r>
+        <w:rPr>
+          <w:noProof/>
+        </w:rPr>
+        <w:fldChar w:fldCharType="end"/>
+      </w:r>
       <w:r>
         <w:t>: Public User Profile</w:t>
       </w:r>
@@ -4921,14 +5099,27 @@
       <w:r>
         <w:t xml:space="preserve">Figure </w:t>
       </w:r>
-      <w:fldSimple w:instr=" SEQ Figure \* ARABIC ">
-        <w:r>
-          <w:rPr>
-            <w:noProof/>
-          </w:rPr>
-          <w:t>7</w:t>
-        </w:r>
-      </w:fldSimple>
+      <w:r>
+        <w:fldChar w:fldCharType="begin"/>
+      </w:r>
+      <w:r>
+        <w:instrText xml:space="preserve"> SEQ Figure \* ARABIC </w:instrText>
+      </w:r>
+      <w:r>
+        <w:fldChar w:fldCharType="separate"/>
+      </w:r>
+      <w:r>
+        <w:rPr>
+          <w:noProof/>
+        </w:rPr>
+        <w:t>7</w:t>
+      </w:r>
+      <w:r>
+        <w:rPr>
+          <w:noProof/>
+        </w:rPr>
+        <w:fldChar w:fldCharType="end"/>
+      </w:r>
       <w:r>
         <w:t>: Online available Users</w:t>
       </w:r>
@@ -4944,7 +5135,25 @@
     </w:p>
     <w:p>
       <w:r>
-        <w:t xml:space="preserve">When clicking on a user profile the user can send a first message to this person, there the icebreakers are also generated, this takes some time, so in the mean time the user sees various messages as to distract him/her from the passing time. </w:t>
+        <w:t xml:space="preserve">When clicking on a user profile the user can send a first message to this person, there the icebreakers are also generated, this takes some time, so in the </w:t>
+      </w:r>
+      <w:proofErr w:type="spellStart"/>
+      <w:proofErr w:type="gramStart"/>
+      <w:r>
+        <w:t>mean time</w:t>
+      </w:r>
+      <w:proofErr w:type="spellEnd"/>
+      <w:proofErr w:type="gramEnd"/>
+      <w:r>
+        <w:t xml:space="preserve"> the user sees various </w:t>
+      </w:r>
+      <w:proofErr w:type="gramStart"/>
+      <w:r>
+        <w:t>messages as</w:t>
+      </w:r>
+      <w:proofErr w:type="gramEnd"/>
+      <w:r>
+        <w:t xml:space="preserve"> to distract him/her from the passing time. </w:t>
       </w:r>
     </w:p>
     <w:p>
@@ -5018,14 +5227,27 @@
       <w:r>
         <w:t xml:space="preserve">Figure </w:t>
       </w:r>
-      <w:fldSimple w:instr=" SEQ Figure \* ARABIC ">
-        <w:r>
-          <w:rPr>
-            <w:noProof/>
-          </w:rPr>
-          <w:t>8</w:t>
-        </w:r>
-      </w:fldSimple>
+      <w:r>
+        <w:fldChar w:fldCharType="begin"/>
+      </w:r>
+      <w:r>
+        <w:instrText xml:space="preserve"> SEQ Figure \* ARABIC </w:instrText>
+      </w:r>
+      <w:r>
+        <w:fldChar w:fldCharType="separate"/>
+      </w:r>
+      <w:r>
+        <w:rPr>
+          <w:noProof/>
+        </w:rPr>
+        <w:t>8</w:t>
+      </w:r>
+      <w:r>
+        <w:rPr>
+          <w:noProof/>
+        </w:rPr>
+        <w:fldChar w:fldCharType="end"/>
+      </w:r>
       <w:r>
         <w:t>: One particular 'Waiting Time Slogan'</w:t>
       </w:r>
@@ -5103,14 +5325,27 @@
       <w:r>
         <w:t xml:space="preserve">Figure </w:t>
       </w:r>
-      <w:fldSimple w:instr=" SEQ Figure \* ARABIC ">
-        <w:r>
-          <w:rPr>
-            <w:noProof/>
-          </w:rPr>
-          <w:t>9</w:t>
-        </w:r>
-      </w:fldSimple>
+      <w:r>
+        <w:fldChar w:fldCharType="begin"/>
+      </w:r>
+      <w:r>
+        <w:instrText xml:space="preserve"> SEQ Figure \* ARABIC </w:instrText>
+      </w:r>
+      <w:r>
+        <w:fldChar w:fldCharType="separate"/>
+      </w:r>
+      <w:r>
+        <w:rPr>
+          <w:noProof/>
+        </w:rPr>
+        <w:t>9</w:t>
+      </w:r>
+      <w:r>
+        <w:rPr>
+          <w:noProof/>
+        </w:rPr>
+        <w:fldChar w:fldCharType="end"/>
+      </w:r>
       <w:r>
         <w:t>: Generated Icebreakers for this Profile</w:t>
       </w:r>
@@ -5121,7 +5356,15 @@
     <w:p/>
     <w:p>
       <w:r>
-        <w:t>When a user sends a first message a chat is created</w:t>
+        <w:t xml:space="preserve">When a user sends </w:t>
+      </w:r>
+      <w:proofErr w:type="gramStart"/>
+      <w:r>
+        <w:t>a first</w:t>
+      </w:r>
+      <w:proofErr w:type="gramEnd"/>
+      <w:r>
+        <w:t xml:space="preserve"> message a chat is created</w:t>
       </w:r>
       <w:r>
         <w:t>,</w:t>
@@ -5206,14 +5449,27 @@
       <w:r>
         <w:t xml:space="preserve">Figure </w:t>
       </w:r>
-      <w:fldSimple w:instr=" SEQ Figure \* ARABIC ">
-        <w:r>
-          <w:rPr>
-            <w:noProof/>
-          </w:rPr>
-          <w:t>10</w:t>
-        </w:r>
-      </w:fldSimple>
+      <w:r>
+        <w:fldChar w:fldCharType="begin"/>
+      </w:r>
+      <w:r>
+        <w:instrText xml:space="preserve"> SEQ Figure \* ARABIC </w:instrText>
+      </w:r>
+      <w:r>
+        <w:fldChar w:fldCharType="separate"/>
+      </w:r>
+      <w:r>
+        <w:rPr>
+          <w:noProof/>
+        </w:rPr>
+        <w:t>10</w:t>
+      </w:r>
+      <w:r>
+        <w:rPr>
+          <w:noProof/>
+        </w:rPr>
+        <w:fldChar w:fldCharType="end"/>
+      </w:r>
       <w:r>
         <w:t>: Chat Screen with E2EE</w:t>
       </w:r>
@@ -5223,13 +5479,29 @@
     </w:p>
     <w:p>
       <w:r>
-        <w:t>This is what the user sees afterwards, here all of his chats are displayed. When he</w:t>
+        <w:t xml:space="preserve">This is what the user sees afterwards, here </w:t>
+      </w:r>
+      <w:proofErr w:type="gramStart"/>
+      <w:r>
+        <w:t>all of</w:t>
+      </w:r>
+      <w:proofErr w:type="gramEnd"/>
+      <w:r>
+        <w:t xml:space="preserve"> his chats are displayed. When he</w:t>
       </w:r>
       <w:r>
         <w:t>/she</w:t>
       </w:r>
       <w:r>
-        <w:t xml:space="preserve"> selects a particular chat (like here with test3) he</w:t>
+        <w:t xml:space="preserve"> selects a particular chat (like here with </w:t>
+      </w:r>
+      <w:proofErr w:type="gramStart"/>
+      <w:r>
+        <w:t>test3</w:t>
+      </w:r>
+      <w:proofErr w:type="gramEnd"/>
+      <w:r>
+        <w:t>) he</w:t>
       </w:r>
       <w:r>
         <w:t>/she</w:t>
@@ -5264,7 +5536,7 @@
       <w:pPr>
         <w:pStyle w:val="Heading2"/>
       </w:pPr>
-      <w:bookmarkStart w:id="33" w:name="_Toc190161231"/>
+      <w:bookmarkStart w:id="33" w:name="_Toc190222833"/>
       <w:r>
         <w:t xml:space="preserve">2.3 </w:t>
       </w:r>
@@ -5277,7 +5549,7 @@
       <w:pPr>
         <w:pStyle w:val="Heading3"/>
       </w:pPr>
-      <w:bookmarkStart w:id="34" w:name="_Toc190161232"/>
+      <w:bookmarkStart w:id="34" w:name="_Toc190222834"/>
       <w:r>
         <w:t xml:space="preserve">2.3.1 </w:t>
       </w:r>
@@ -5291,7 +5563,15 @@
         <w:t>The feature is a fine-tuned version of the pretrained gpt2-medium model.</w:t>
       </w:r>
       <w:r>
-        <w:t xml:space="preserve"> In the following it will be described step-by-step</w:t>
+        <w:t xml:space="preserve"> In the following it will </w:t>
+      </w:r>
+      <w:proofErr w:type="gramStart"/>
+      <w:r>
+        <w:t>be described</w:t>
+      </w:r>
+      <w:proofErr w:type="gramEnd"/>
+      <w:r>
+        <w:t xml:space="preserve"> step-by-step</w:t>
       </w:r>
       <w:r>
         <w:t xml:space="preserve"> how generative AIs work and how we can leverage that for our</w:t>
@@ -5333,10 +5613,26 @@
         <w:t xml:space="preserve">”, at first the values for these weights are random, this process can also be described as a matrix multiplication. Because many inputs (for example multiple pictures each with 1000 pixels for instance) are multiplied by a variety of weights. (The height of the input matrix may be the number of pictures and the width the number of pixels). </w:t>
       </w:r>
       <w:r>
-        <w:t>Each output from the matrix multiplication (weights × inputs) is called a pre-activation. A bias term is added to each pre-activation, acting as a learnable offset that adjusts the neuron’s sensitivity. The result is then passed through a non-linear activation function (e.g., ReLU), which returns 0 for negative inputs and the input itself for positive values. This final output is called the neuron’s activation, loosely inspired by biological neurons that ‘fire’ when their input crosses a threshold.</w:t>
-      </w:r>
-      <w:r>
-        <w:t xml:space="preserve"> This described process is then repeated x times. At last, there is an output, also called a “prediction”, (for example there may be 10 outputs representing the numbers 0-9</w:t>
+        <w:t xml:space="preserve">Each output from the matrix multiplication (weights × inputs) is called a pre-activation. A bias term is added to each pre-activation, acting as a learnable offset that adjusts the neuron’s sensitivity. The result is then passed through a non-linear activation function (e.g., </w:t>
+      </w:r>
+      <w:proofErr w:type="spellStart"/>
+      <w:r>
+        <w:t>ReLU</w:t>
+      </w:r>
+      <w:proofErr w:type="spellEnd"/>
+      <w:r>
+        <w:t>), which returns 0 for negative inputs and the input itself for positive values. This final output is called the neuron’s activation, loosely inspired by biological neurons that ‘fire’ when their input crosses a threshold.</w:t>
+      </w:r>
+      <w:r>
+        <w:t xml:space="preserve"> </w:t>
+      </w:r>
+      <w:proofErr w:type="gramStart"/>
+      <w:r>
+        <w:t>This described</w:t>
+      </w:r>
+      <w:proofErr w:type="gramEnd"/>
+      <w:r>
+        <w:t xml:space="preserve"> process is then repeated x times. At last, there is an output, also called a “prediction”, (for example there may be 10 outputs representing the numbers 0-9</w:t>
       </w:r>
       <w:r>
         <w:t>,</w:t>
@@ -5357,7 +5653,15 @@
         <w:t>a certain</w:t>
       </w:r>
       <w:r>
-        <w:t xml:space="preserve"> prediction actually is and then build an estimate of all predictions. But since the prediction depends on the weights which can be changed, </w:t>
+        <w:t xml:space="preserve"> prediction </w:t>
+      </w:r>
+      <w:proofErr w:type="gramStart"/>
+      <w:r>
+        <w:t>actually is</w:t>
+      </w:r>
+      <w:proofErr w:type="gramEnd"/>
+      <w:r>
+        <w:t xml:space="preserve"> and then build an estimate of all predictions. But since the prediction depends on the weights which can be changed, </w:t>
       </w:r>
       <w:r>
         <w:t>the</w:t>
@@ -5475,7 +5779,15 @@
         <w:t xml:space="preserve"> and then divided by the square root of the dimension size of the vectors (for scaling)</w:t>
       </w:r>
       <w:r>
-        <w:t xml:space="preserve">, this is put into softmax (a function scaling all values between 0 and 1) to find out the </w:t>
+        <w:t xml:space="preserve">, this is put into </w:t>
+      </w:r>
+      <w:proofErr w:type="spellStart"/>
+      <w:r>
+        <w:t>softmax</w:t>
+      </w:r>
+      <w:proofErr w:type="spellEnd"/>
+      <w:r>
+        <w:t xml:space="preserve"> (a function scaling all values between 0 and 1) to find out the </w:t>
       </w:r>
       <w:r>
         <w:t>probability distribution of the results.</w:t>
@@ -5487,10 +5799,34 @@
         <w:t>a high probability means a strong relevance between tokens</w:t>
       </w:r>
       <w:r>
-        <w:t xml:space="preserve">). This in turn is multiplied by the value vectors; by learning how closely each of the embedding vectors are, the AI can learn the structure of the sentences. If the AI models is fed with a lot of sentences and information, it could thus, learn its structure and reproduce it. This is the magic behind how ChatGPT is able to predict the next word for an input. </w:t>
-      </w:r>
-      <w:r>
-        <w:t xml:space="preserve">(A few important aspects to mention are generative AI models often use Gelu instead of Relu and a cross-entropy loss instead of the mean squared error; masked self-attention is also important so that no “future” tokens are used when predicting the next token during training. Lastly, </w:t>
+        <w:t xml:space="preserve">). This in turn is multiplied by the value vectors; by learning how closely each of the embedding vectors are, the AI can learn the structure of the sentences. If the AI models </w:t>
+      </w:r>
+      <w:proofErr w:type="gramStart"/>
+      <w:r>
+        <w:t>is</w:t>
+      </w:r>
+      <w:proofErr w:type="gramEnd"/>
+      <w:r>
+        <w:t xml:space="preserve"> fed with a lot of sentences and information, it could thus, learn its structure and reproduce it. This is the magic behind how ChatGPT </w:t>
+      </w:r>
+      <w:proofErr w:type="gramStart"/>
+      <w:r>
+        <w:t>is able to</w:t>
+      </w:r>
+      <w:proofErr w:type="gramEnd"/>
+      <w:r>
+        <w:t xml:space="preserve"> predict the next word for an input. </w:t>
+      </w:r>
+      <w:r>
+        <w:t xml:space="preserve">(A few important aspects to mention are generative AI models often use Gelu instead of </w:t>
+      </w:r>
+      <w:proofErr w:type="spellStart"/>
+      <w:r>
+        <w:t>Relu</w:t>
+      </w:r>
+      <w:proofErr w:type="spellEnd"/>
+      <w:r>
+        <w:t xml:space="preserve"> and a cross-entropy loss instead of the mean squared error; masked self-attention is also important so that no “future” tokens are used when predicting the next token during training. Lastly, </w:t>
       </w:r>
       <w:r>
         <w:t xml:space="preserve">the model </w:t>
@@ -5540,8 +5876,13 @@
       <w:r>
         <w:t xml:space="preserve">                                                                                                                                                                                           </w:t>
       </w:r>
-      <w:r>
-        <w:t xml:space="preserve">With this knowledge our use of the gpt2-medium model can be explained. We wanted the model to learn the structure of user profiles and corresponding “icebreakers”, thus, we had to create 200-300 of these examples. (For professional purposes a lot more a needed). These are then fed into the </w:t>
+      <w:proofErr w:type="gramStart"/>
+      <w:r>
+        <w:t>With</w:t>
+      </w:r>
+      <w:proofErr w:type="gramEnd"/>
+      <w:r>
+        <w:t xml:space="preserve"> this knowledge our use of the gpt2-medium model can be explained. We wanted the model to learn the structure of user profiles and corresponding “icebreakers”, thus, we had to create 200-300 of these examples. (For professional purposes a lot more a needed). These are then fed into the </w:t>
       </w:r>
       <w:r>
         <w:t xml:space="preserve">gpt2-medium model to learn the relationship between the profiles and the icebreakers. We used a pretrained model, because, without a pretrained model, gpt2-medium would have no knowledge of grammar or sentence structure and a lot more than 200-300 examples would have been needed to train the model. Now that we understood how the model works it also makes sense why feeding the model the following structure for learning would not bring any result: “Profile </w:t>
@@ -5566,10 +5907,26 @@
         <w:t>t</w:t>
       </w:r>
       <w:r>
-        <w:t xml:space="preserve"> work as the model will learn contradicting relationships between the tokens and would not be able to produce valid output. Thus, a better structure would be “Profile A- Icebreaker 1- Icebreaker 2.... Profile B- Icebreaker 1....”. With this structure the model will learn all icebreakers corresponding to one user profile. This learned knowledge is then captured in its updated weights, these are used to then predict several icebreakers for new profiles written by users of our app. This works pretty </w:t>
-      </w:r>
-      <w:r>
-        <w:t>well;</w:t>
+        <w:t xml:space="preserve"> work as the model will learn contradicting relationships between the tokens and </w:t>
+      </w:r>
+      <w:proofErr w:type="gramStart"/>
+      <w:r>
+        <w:t>would</w:t>
+      </w:r>
+      <w:proofErr w:type="gramEnd"/>
+      <w:r>
+        <w:t xml:space="preserve"> not be able to produce valid output. Thus, a better structure would be “Profile A- Icebreaker 1- Icebreaker 2.... Profile B- Icebreaker 1....”. With this structure the model will learn all icebreakers corresponding to one user profile. This learned knowledge is then captured in its updated weights, these are used to then predict several icebreakers for new profiles written by users of our app. This works </w:t>
+      </w:r>
+      <w:proofErr w:type="gramStart"/>
+      <w:r>
+        <w:t xml:space="preserve">pretty </w:t>
+      </w:r>
+      <w:r>
+        <w:t>well</w:t>
+      </w:r>
+      <w:proofErr w:type="gramEnd"/>
+      <w:r>
+        <w:t>;</w:t>
       </w:r>
       <w:r>
         <w:t xml:space="preserve"> the limitations of our fine-tuned model are discussed in the section “Challenges we have faced”. </w:t>
@@ -5579,7 +5936,7 @@
       <w:pPr>
         <w:pStyle w:val="Heading3"/>
       </w:pPr>
-      <w:bookmarkStart w:id="35" w:name="_Toc190161233"/>
+      <w:bookmarkStart w:id="35" w:name="_Toc190222835"/>
       <w:r>
         <w:t xml:space="preserve">2.3.2 </w:t>
       </w:r>
@@ -5589,156 +5946,233 @@
       <w:bookmarkEnd w:id="35"/>
     </w:p>
     <w:p>
-      <w:r>
-        <w:t xml:space="preserve">During the discussion, as to how this app shall look like, we derived that it is extremely important that each chat is end-to-end encrypted. The first reason is, that users may not want the server or the provider of the app to know the contents of their conversations </w:t>
-      </w:r>
-      <w:r>
-        <w:t>and secondly the messages are saved on servers, if they are stored as plaintext, an attacker hijacking the servers may find out all contents of each conversation. Therefore, we needed a way to prevent this. Upon creating an account, the user creates a passphrase and a magic number. The passphrase alongside the magic number is put into a hash function and only the hash value alongside the magic number (also called salt) is saved on the server. A hash function</w:t>
-      </w:r>
-      <w:r>
-        <w:t xml:space="preserve"> (sha256)</w:t>
-      </w:r>
-      <w:r>
-        <w:t xml:space="preserve"> is used so that hash(p,m) = x is easy but the reverse is computationally infeasible. Then in the frontend a new public/private key pair is generated. The private key is encrypted with passphrase to the power of magic number modulo 10^12+33.</w:t>
-      </w:r>
-      <w:r>
-        <w:t xml:space="preserve"> (A modulo value large enough, so that brute force attacks are infeasible).</w:t>
-      </w:r>
-      <w:r>
+      <w:pPr>
+        <w:rPr>
+          <w:lang w:val="en-DE"/>
+        </w:rPr>
+      </w:pPr>
+      <w:r>
+        <w:rPr>
+          <w:lang w:val="en-DE"/>
+        </w:rPr>
+        <w:t>During the discussion, as to how this app shall look like, we derived that it is extremely important that each chat is end-to-end encrypted. The first reason is, that users may not want the server or the provider of the app to know the contents of their conversations and secondly the messages are saved on servers, if they are stored as plaintext, an attacker hijacking the servers may find out all contents of each conversation. Therefore, we needed a way to prevent this.</w:t>
+      </w:r>
+    </w:p>
+    <w:p>
+      <w:pPr>
+        <w:rPr>
+          <w:lang w:val="en-DE"/>
+        </w:rPr>
+      </w:pPr>
+      <w:r>
+        <w:rPr>
+          <w:lang w:val="en-DE"/>
+        </w:rPr>
+        <w:t xml:space="preserve">Upon creating an account, the user creates a passphrase and a magic number. The passphrase alongside the magic number is put into a hash function and only the hash value alongside the magic number (also called salt) is saved on the server. A hash function (SHA-256) is used so that </w:t>
+      </w:r>
+      <w:proofErr w:type="gramStart"/>
+      <w:r>
+        <w:rPr>
+          <w:lang w:val="en-DE"/>
+        </w:rPr>
+        <w:t>hash(</w:t>
+      </w:r>
+      <w:proofErr w:type="gramEnd"/>
+      <w:r>
+        <w:rPr>
+          <w:lang w:val="en-DE"/>
+        </w:rPr>
+        <w:t>p, m) = x is easy but the reverse is computationally infeasible.</w:t>
+      </w:r>
+    </w:p>
+    <w:p>
+      <w:pPr>
+        <w:rPr>
+          <w:lang w:val="en-DE"/>
+        </w:rPr>
+      </w:pPr>
+      <w:r>
+        <w:rPr>
+          <w:lang w:val="en-DE"/>
+        </w:rPr>
+        <w:t xml:space="preserve">Then in the frontend a new public/private key pair is generated. The private key is encrypted with passphrase to the power of magic number modulo 10^12+33 (a modulo value large enough, so that brute force attacks are infeasible). Thus, in the end it is </w:t>
+      </w:r>
+      <w:proofErr w:type="gramStart"/>
+      <w:r>
+        <w:rPr>
+          <w:lang w:val="en-DE"/>
+        </w:rPr>
+        <w:t>encrypt(</w:t>
+      </w:r>
+      <w:proofErr w:type="spellStart"/>
+      <w:proofErr w:type="gramEnd"/>
+      <w:r>
+        <w:rPr>
+          <w:lang w:val="en-DE"/>
+        </w:rPr>
+        <w:t>privkey</w:t>
+      </w:r>
+      <w:proofErr w:type="spellEnd"/>
+      <w:r>
+        <w:rPr>
+          <w:lang w:val="en-DE"/>
+        </w:rPr>
+        <w:t xml:space="preserve">, </w:t>
+      </w:r>
+      <w:proofErr w:type="spellStart"/>
+      <w:r>
+        <w:rPr>
+          <w:lang w:val="en-DE"/>
+        </w:rPr>
+        <w:t>p^m</w:t>
+      </w:r>
+      <w:proofErr w:type="spellEnd"/>
+      <w:r>
+        <w:rPr>
+          <w:lang w:val="en-DE"/>
+        </w:rPr>
+        <w:t xml:space="preserve"> % 10^12+33) with the encryption algorithm (AES-256 in CBC mode with PKCS7 padding and a 16-byte random IV). The keypair is then uploaded to the server.</w:t>
+      </w:r>
+    </w:p>
+    <w:p>
+      <w:pPr>
+        <w:rPr>
+          <w:lang w:val="en-DE"/>
+        </w:rPr>
+      </w:pPr>
+      <w:r>
+        <w:rPr>
+          <w:lang w:val="en-DE"/>
+        </w:rPr>
+        <w:t>When starting a new chat, the frontend retrieves the public key of the recipient (which is not encrypted) and generates a symmetric key (AES-256, returned as a Base64 string). It then encrypts the first message with the symmetric key (using AES-256 in CBC mode with PKCS7 padding and a 16-byte random IV) and then in turn encrypts the symmetric key twice (using RSA-OAEP (2048-bit, SHA-256)), once with the sender’s public key and once with the public key of the recipient. These encrypted symmetric keys are uploaded to the server.</w:t>
+      </w:r>
+      <w:r>
+        <w:rPr>
+          <w:lang w:val="en-DE"/>
+        </w:rPr>
         <w:t xml:space="preserve"> </w:t>
       </w:r>
-      <w:r>
-        <w:t>Thus, in the end it is encrypt(</w:t>
-      </w:r>
-      <w:r>
-        <w:t>privkey, p^m%10^12+33) using AES for the encryption algorithm</w:t>
+    </w:p>
+    <w:p>
+      <w:pPr>
+        <w:rPr>
+          <w:lang w:val="en-DE"/>
+        </w:rPr>
+      </w:pPr>
+      <w:r>
+        <w:rPr>
+          <w:lang w:val="en-DE"/>
+        </w:rPr>
+        <w:t xml:space="preserve">When the recipient logs into the website he/she </w:t>
+      </w:r>
+      <w:proofErr w:type="gramStart"/>
+      <w:r>
+        <w:rPr>
+          <w:lang w:val="en-DE"/>
+        </w:rPr>
+        <w:t>has to</w:t>
+      </w:r>
+      <w:proofErr w:type="gramEnd"/>
+      <w:r>
+        <w:rPr>
+          <w:lang w:val="en-DE"/>
+        </w:rPr>
+        <w:t xml:space="preserve"> type in the passphrase (the magic number is also fetched from the server), the output hash is compared to the one stored on the server; if they match, he/she is permitted to enter. His/her encrypted </w:t>
+      </w:r>
+      <w:r>
+        <w:rPr>
+          <w:lang w:val="en-DE"/>
+        </w:rPr>
+        <w:lastRenderedPageBreak/>
+        <w:t>private key is fetched from the server, and in the frontend the passphrase is used to decrypt it. Now he/she can go to the new chat. For this, the symmetric key (encrypted with this user’s public key) is fetched, the decrypted private key is used to decrypt the symmetric key, then the symmetric key is used to decrypt the new message. This lengthy process is only needed in the beginning; from the moment the user fetched the symmetric key for this chat, the key is saved in the local cache and used for encrypting/decrypting all messages during the session (referring to the period where the user uses our website; a session terminates if a user is inactive or logs out. For more details on the implementation please refer to our code, especially E2EEComponents in the Frontend).</w:t>
+      </w:r>
+    </w:p>
+    <w:p>
+      <w:pPr>
+        <w:pStyle w:val="Heading3"/>
+        <w:rPr>
+          <w:lang w:val="en-DE"/>
+        </w:rPr>
+      </w:pPr>
+      <w:bookmarkStart w:id="36" w:name="_Toc190222836"/>
+      <w:r>
+        <w:t xml:space="preserve">2.3.3 </w:t>
+      </w:r>
+      <w:r>
+        <w:t>Real-time chatting</w:t>
+      </w:r>
+      <w:bookmarkEnd w:id="36"/>
+    </w:p>
+    <w:p>
+      <w:r>
+        <w:t xml:space="preserve">The idea behind the chat feature was to create a seamless experience where there’s no lag during conversations, and users don’t have to click any button to refresh the chat. When someone sends a message, the recipient should see it instantly, without doing anything. This made it clear that a traditional request-response architecture wouldn’t work. </w:t>
+      </w:r>
+    </w:p>
+    <w:p>
+      <w:r>
+        <w:t xml:space="preserve">We started exploring other options and came across the publish-subscribe architecture. In this setup, an event automatically sends notifications to </w:t>
+      </w:r>
+      <w:proofErr w:type="gramStart"/>
+      <w:r>
+        <w:t>everyone</w:t>
+      </w:r>
+      <w:proofErr w:type="gramEnd"/>
+      <w:r>
+        <w:t xml:space="preserve"> subscribed to it. However, since we were working across two different platforms, implementing this wasn’t straightforward. After some research, we found a great solution </w:t>
+      </w:r>
+      <w:r>
+        <w:t>using WebSocket</w:t>
       </w:r>
       <w:r>
         <w:t>.</w:t>
       </w:r>
-      <w:r>
-        <w:t xml:space="preserve"> </w:t>
-      </w:r>
-      <w:r>
-        <w:t xml:space="preserve">The keypair is then uploaded to the server. When starting a new chat, the </w:t>
-      </w:r>
-      <w:r>
-        <w:t>frontend</w:t>
-      </w:r>
-      <w:r>
-        <w:t xml:space="preserve"> retrieves the public key of the recipient (which is not encrypted) and generates a symmetric key, </w:t>
-      </w:r>
-      <w:r>
-        <w:t xml:space="preserve">then it </w:t>
-      </w:r>
-      <w:r>
-        <w:t>encrypts the first message with the symmetric key and then in turn encrypts the symmetric key twice</w:t>
-      </w:r>
-      <w:r>
-        <w:t xml:space="preserve"> (using RSA-OAEP)</w:t>
-      </w:r>
-      <w:r>
-        <w:t>. Once with his</w:t>
-      </w:r>
-      <w:r>
-        <w:t>/her</w:t>
-      </w:r>
-      <w:r>
-        <w:t xml:space="preserve"> public key and once with the public key of the recipient.</w:t>
-      </w:r>
-      <w:r>
-        <w:t xml:space="preserve"> These encrypted symmetric keys are uploaded to the server.</w:t>
-      </w:r>
-      <w:r>
-        <w:t xml:space="preserve"> When</w:t>
-      </w:r>
-      <w:r>
-        <w:t xml:space="preserve"> the recipient logs into the website he/she has to type in the passphrase</w:t>
-      </w:r>
-      <w:r>
-        <w:t xml:space="preserve"> (the magic number is also fetched from the server)</w:t>
-      </w:r>
-      <w:r>
-        <w:t>, the output hash is compared to the one stored on the server if they match, he/she is permitted to enter. His/her encrypted private key is fetched from the server, in the frontend the passphrase is used to decrypt it. Now he/she can go to the new chat. For this, the symmetric key (encrypted with this user’s public key) is fetched, the decrypted private key is used to decrypt the symmetric key, then the symmetric key is used to decrypt the new message. This lengthy process is only needed in the beginning, from the moment the user fetched the symmetric key for this chat, the key is saved in the local cache and used for encrypting/decrypting all messages during the session. (Referring to the period where the user uses our website</w:t>
-      </w:r>
-      <w:r>
-        <w:t xml:space="preserve">; </w:t>
-      </w:r>
-      <w:r>
-        <w:lastRenderedPageBreak/>
-        <w:t>a session terminates, if a user is inactive or logs out</w:t>
-      </w:r>
-      <w:r>
-        <w:t xml:space="preserve">. Furthermore, for more details on the implementation please refer to our code, especially E2EEComponents in the Frontend). </w:t>
+    </w:p>
+    <w:p>
+      <w:r>
+        <w:t>Here’s how it works: every time a user starts a chat with someone, a queue is created specifically for th</w:t>
+      </w:r>
+      <w:r>
+        <w:t>e user</w:t>
+      </w:r>
+      <w:r>
+        <w:t>, and the user is subscribed to it. The queues follow a standard structure, like user/</w:t>
+      </w:r>
+      <w:proofErr w:type="gramStart"/>
+      <w:r>
+        <w:t>queue/{</w:t>
+      </w:r>
+      <w:proofErr w:type="gramEnd"/>
+      <w:r>
+        <w:t>username}/messages. This consistency allows the server to automatically create queues even if they don’t already exist.</w:t>
+      </w:r>
+    </w:p>
+    <w:p>
+      <w:r>
+        <w:t xml:space="preserve">When a message is sent, it goes to the server, which then publishes it to the relevant queue </w:t>
+      </w:r>
+      <w:r>
+        <w:t xml:space="preserve">of recipient </w:t>
+      </w:r>
+      <w:r>
+        <w:t xml:space="preserve">without </w:t>
+      </w:r>
+      <w:r>
+        <w:t xml:space="preserve">him </w:t>
+      </w:r>
+      <w:r>
+        <w:t>needing to make a request. This way, the server acts as a middleman, simply forwarding the messages in real time while also saving them for future use.</w:t>
+      </w:r>
+    </w:p>
+    <w:p>
+      <w:r>
+        <w:t>This approach gave us a real-time chat system that works smoothly and could even support notifications in the future. Unfortunately, we had to skip adding notifications this time due to time constraints.</w:t>
       </w:r>
     </w:p>
     <w:p>
       <w:pPr>
         <w:pStyle w:val="Heading3"/>
       </w:pPr>
-      <w:bookmarkStart w:id="36" w:name="_Toc190161234"/>
-      <w:r>
-        <w:t xml:space="preserve">2.3.3 </w:t>
-      </w:r>
-      <w:r>
-        <w:t>Real-time chatting</w:t>
-      </w:r>
-      <w:bookmarkEnd w:id="36"/>
-    </w:p>
-    <w:p>
-      <w:r>
-        <w:t xml:space="preserve">The idea behind the chat feature was to create a seamless experience where there’s no lag during conversations, and users don’t have to click any button to refresh the chat. When someone sends a message, the recipient should see it instantly, without doing anything. This made it clear that a traditional request-response architecture wouldn’t work. </w:t>
-      </w:r>
-    </w:p>
-    <w:p>
-      <w:r>
-        <w:t xml:space="preserve">We started exploring other options and came across the publish-subscribe architecture. In this setup, an event automatically sends notifications to everyone subscribed to it. However, since we were working across two different platforms, implementing this wasn’t straightforward. After some research, we found a great solution </w:t>
-      </w:r>
-      <w:r>
-        <w:t>using WebSocket</w:t>
-      </w:r>
-      <w:r>
-        <w:t>.</w:t>
-      </w:r>
-    </w:p>
-    <w:p>
-      <w:r>
-        <w:t>Here’s how it works: every time a user starts a chat with someone, a queue is created specifically for th</w:t>
-      </w:r>
-      <w:r>
-        <w:t>e user</w:t>
-      </w:r>
-      <w:r>
-        <w:t>, and the user is subscribed to it. The queues follow a standard structure, like user/queue/{username}/messages. This consistency allows the server to automatically create queues even if they don’t already exist.</w:t>
-      </w:r>
-    </w:p>
-    <w:p>
-      <w:r>
-        <w:t xml:space="preserve">When a message is sent, it goes to the server, which then publishes it to the relevant queue </w:t>
-      </w:r>
-      <w:r>
-        <w:t xml:space="preserve">of recipient </w:t>
-      </w:r>
-      <w:r>
-        <w:t xml:space="preserve">without </w:t>
-      </w:r>
-      <w:r>
-        <w:t xml:space="preserve">him </w:t>
-      </w:r>
-      <w:r>
-        <w:t>needing to make a request. This way, the server acts as a middleman, simply forwarding the messages in real time while also saving them for future use.</w:t>
-      </w:r>
-    </w:p>
-    <w:p>
-      <w:r>
-        <w:t>This approach gave us a real-time chat system that works smoothly and could even support notifications in the future. Unfortunately, we had to skip adding notifications this time due to time constraints.</w:t>
-      </w:r>
-    </w:p>
-    <w:p>
-      <w:pPr>
-        <w:pStyle w:val="Heading3"/>
-      </w:pPr>
-      <w:bookmarkStart w:id="37" w:name="_Toc190161235"/>
+      <w:bookmarkStart w:id="37" w:name="_Toc190222837"/>
       <w:r>
         <w:t xml:space="preserve">2.3.4 </w:t>
       </w:r>
@@ -5776,12 +6210,45 @@
           <w:b/>
           <w:bCs/>
         </w:rPr>
-        <w:t>2.  Leverage an open-source authentication microservice to handle these tasks efficiently.</w:t>
-      </w:r>
-    </w:p>
-    <w:p>
-      <w:r>
-        <w:t>After evaluating our options, we decided to integrate Keycloak, an open-source identity and access management solution. We containerized Keycloak using Docker, configuring it to listen on port 8081.</w:t>
+        <w:lastRenderedPageBreak/>
+        <w:t>2</w:t>
+      </w:r>
+      <w:proofErr w:type="gramStart"/>
+      <w:r>
+        <w:rPr>
+          <w:b/>
+          <w:bCs/>
+        </w:rPr>
+        <w:t>.  Leverage</w:t>
+      </w:r>
+      <w:proofErr w:type="gramEnd"/>
+      <w:r>
+        <w:rPr>
+          <w:b/>
+          <w:bCs/>
+        </w:rPr>
+        <w:t xml:space="preserve"> an open-source authentication microservice to handle these tasks efficiently.</w:t>
+      </w:r>
+    </w:p>
+    <w:p>
+      <w:r>
+        <w:t xml:space="preserve">After evaluating our options, we decided to integrate </w:t>
+      </w:r>
+      <w:proofErr w:type="spellStart"/>
+      <w:r>
+        <w:t>Keycloak</w:t>
+      </w:r>
+      <w:proofErr w:type="spellEnd"/>
+      <w:r>
+        <w:t xml:space="preserve">, an open-source identity and access management solution. We containerized </w:t>
+      </w:r>
+      <w:proofErr w:type="spellStart"/>
+      <w:r>
+        <w:t>Keycloak</w:t>
+      </w:r>
+      <w:proofErr w:type="spellEnd"/>
+      <w:r>
+        <w:t xml:space="preserve"> using Docker, configuring it to listen on port 8081.</w:t>
       </w:r>
     </w:p>
     <w:p>
@@ -5789,13 +6256,20 @@
         <w:pStyle w:val="Heading4"/>
       </w:pPr>
       <w:r>
-        <w:lastRenderedPageBreak/>
         <w:t>Implementation Overview</w:t>
       </w:r>
     </w:p>
     <w:p>
       <w:r>
-        <w:t>The core functionality we implemented involves checking for an authentication token in every outgoing request to the backend. If a request lacks a valid token, the user is automatically redirected to the login page.</w:t>
+        <w:t xml:space="preserve">The core functionality we implemented involves checking for an authentication </w:t>
+      </w:r>
+      <w:proofErr w:type="gramStart"/>
+      <w:r>
+        <w:t>token</w:t>
+      </w:r>
+      <w:proofErr w:type="gramEnd"/>
+      <w:r>
+        <w:t xml:space="preserve"> in every outgoing request to the backend. If a request lacks a valid token, the user is automatically redirected to the login page.</w:t>
       </w:r>
     </w:p>
     <w:p>
@@ -5855,7 +6329,43 @@
           <w:kern w:val="0"/>
           <w14:ligatures w14:val="none"/>
         </w:rPr>
-        <w:t>The backend then retrieves this token and forwards it to the Keycloak microservice for validation. If the token is verified as legitimate, Keycloak sends a green flag to the backend, which then processes the request and returns the appropriate response to the frontend.</w:t>
+        <w:t xml:space="preserve">The backend then retrieves this token and forwards it to the </w:t>
+      </w:r>
+      <w:proofErr w:type="spellStart"/>
+      <w:r>
+        <w:rPr>
+          <w:rFonts w:ascii="Times New Roman" w:eastAsia="Times New Roman" w:hAnsi="Times New Roman" w:cs="Times New Roman"/>
+          <w:kern w:val="0"/>
+          <w14:ligatures w14:val="none"/>
+        </w:rPr>
+        <w:t>Keycloak</w:t>
+      </w:r>
+      <w:proofErr w:type="spellEnd"/>
+      <w:r>
+        <w:rPr>
+          <w:rFonts w:ascii="Times New Roman" w:eastAsia="Times New Roman" w:hAnsi="Times New Roman" w:cs="Times New Roman"/>
+          <w:kern w:val="0"/>
+          <w14:ligatures w14:val="none"/>
+        </w:rPr>
+        <w:t xml:space="preserve"> microservice for validation. If the token is verified as legitimate, </w:t>
+      </w:r>
+      <w:proofErr w:type="spellStart"/>
+      <w:r>
+        <w:rPr>
+          <w:rFonts w:ascii="Times New Roman" w:eastAsia="Times New Roman" w:hAnsi="Times New Roman" w:cs="Times New Roman"/>
+          <w:kern w:val="0"/>
+          <w14:ligatures w14:val="none"/>
+        </w:rPr>
+        <w:t>Keycloak</w:t>
+      </w:r>
+      <w:proofErr w:type="spellEnd"/>
+      <w:r>
+        <w:rPr>
+          <w:rFonts w:ascii="Times New Roman" w:eastAsia="Times New Roman" w:hAnsi="Times New Roman" w:cs="Times New Roman"/>
+          <w:kern w:val="0"/>
+          <w14:ligatures w14:val="none"/>
+        </w:rPr>
+        <w:t xml:space="preserve"> sends a green flag to the backend, which then processes the request and returns the appropriate response to the frontend.</w:t>
       </w:r>
     </w:p>
     <w:p>
@@ -5971,30 +6481,48 @@
       <w:r>
         <w:t xml:space="preserve">Figure </w:t>
       </w:r>
-      <w:fldSimple w:instr=" SEQ Figure \* ARABIC ">
-        <w:r>
-          <w:rPr>
-            <w:noProof/>
-          </w:rPr>
-          <w:t>11</w:t>
-        </w:r>
-      </w:fldSimple>
+      <w:r>
+        <w:fldChar w:fldCharType="begin"/>
+      </w:r>
+      <w:r>
+        <w:instrText xml:space="preserve"> SEQ Figure \* ARABIC </w:instrText>
+      </w:r>
+      <w:r>
+        <w:fldChar w:fldCharType="separate"/>
+      </w:r>
+      <w:r>
+        <w:rPr>
+          <w:noProof/>
+        </w:rPr>
+        <w:t>11</w:t>
+      </w:r>
+      <w:r>
+        <w:rPr>
+          <w:noProof/>
+        </w:rPr>
+        <w:fldChar w:fldCharType="end"/>
+      </w:r>
       <w:r>
         <w:t xml:space="preserve">: </w:t>
       </w:r>
       <w:r>
-        <w:t xml:space="preserve"> System Architecture for Authentication and Authorization Using Keycloak</w:t>
+        <w:t xml:space="preserve"> System Architecture for Authentication and Authorization Using </w:t>
+      </w:r>
+      <w:proofErr w:type="spellStart"/>
+      <w:r>
+        <w:t>Keycloak</w:t>
       </w:r>
       <w:bookmarkEnd w:id="38"/>
       <w:bookmarkEnd w:id="39"/>
       <w:bookmarkEnd w:id="40"/>
+      <w:proofErr w:type="spellEnd"/>
     </w:p>
     <w:p/>
     <w:p>
       <w:pPr>
         <w:pStyle w:val="Heading3"/>
       </w:pPr>
-      <w:bookmarkStart w:id="41" w:name="_Toc190161236"/>
+      <w:bookmarkStart w:id="41" w:name="_Toc190222838"/>
       <w:r>
         <w:t xml:space="preserve">2.3.5 </w:t>
       </w:r>
@@ -6024,7 +6552,11 @@
         <w:t xml:space="preserve"> </w:t>
       </w:r>
       <w:r>
-        <w:t>This feature was designed with the same principles of Object-Oriented Programming (OOP) that guided the development of the "Available Users" overview, focusing on modularity, reusability, and efficiency.</w:t>
+        <w:t>This feature was designed with the same principles of Object-</w:t>
+      </w:r>
+      <w:r>
+        <w:lastRenderedPageBreak/>
+        <w:t>Oriented Programming (OOP) that guided the development of the "Available Users" overview, focusing on modularity, reusability, and efficiency.</w:t>
       </w:r>
     </w:p>
     <w:p>
@@ -6034,7 +6566,6 @@
     </w:p>
     <w:p>
       <w:r>
-        <w:lastRenderedPageBreak/>
         <w:t>When a user enters a name into the search bar, the frontend transmits a request to the backend, which processes the query and returns a list of users whose usernames match the search criteria.</w:t>
       </w:r>
       <w:r>
@@ -6068,8 +6599,24 @@
           <w:lang w:eastAsia="de-DE"/>
           <w14:ligatures w14:val="none"/>
         </w:rPr>
-        <w:t>@Query(</w:t>
-      </w:r>
+        <w:t>@</w:t>
+      </w:r>
+      <w:proofErr w:type="gramStart"/>
+      <w:r>
+        <w:rPr>
+          <w:rFonts w:ascii="Times New Roman" w:eastAsia="Times New Roman" w:hAnsi="Times New Roman" w:cs="Times New Roman"/>
+          <w:color w:val="E3EAF2"/>
+          <w:kern w:val="0"/>
+          <w:sz w:val="22"/>
+          <w:szCs w:val="22"/>
+          <w:bdr w:val="single" w:sz="2" w:space="0" w:color="auto" w:frame="1"/>
+          <w:shd w:val="clear" w:color="auto" w:fill="09090B"/>
+          <w:lang w:eastAsia="de-DE"/>
+          <w14:ligatures w14:val="none"/>
+        </w:rPr>
+        <w:t>Query(</w:t>
+      </w:r>
+      <w:proofErr w:type="gramEnd"/>
       <w:r>
         <w:rPr>
           <w:rFonts w:ascii="Times New Roman" w:eastAsia="Times New Roman" w:hAnsi="Times New Roman" w:cs="Times New Roman"/>
@@ -6082,7 +6629,157 @@
           <w:lang w:eastAsia="de-DE"/>
           <w14:ligatures w14:val="none"/>
         </w:rPr>
-        <w:t>"SELECT p FROM PublicUser ProfileEntity p WHERE p.username LIKE %:username% AND p.keycloakUser Id &lt;&gt; :currentUser Id"</w:t>
+        <w:t xml:space="preserve">"SELECT p FROM </w:t>
+      </w:r>
+      <w:proofErr w:type="spellStart"/>
+      <w:r>
+        <w:rPr>
+          <w:rFonts w:ascii="Times New Roman" w:eastAsia="Times New Roman" w:hAnsi="Times New Roman" w:cs="Times New Roman"/>
+          <w:color w:val="91D076"/>
+          <w:kern w:val="0"/>
+          <w:sz w:val="22"/>
+          <w:szCs w:val="22"/>
+          <w:bdr w:val="single" w:sz="2" w:space="0" w:color="auto" w:frame="1"/>
+          <w:shd w:val="clear" w:color="auto" w:fill="09090B"/>
+          <w:lang w:eastAsia="de-DE"/>
+          <w14:ligatures w14:val="none"/>
+        </w:rPr>
+        <w:t>PublicUser</w:t>
+      </w:r>
+      <w:proofErr w:type="spellEnd"/>
+      <w:r>
+        <w:rPr>
+          <w:rFonts w:ascii="Times New Roman" w:eastAsia="Times New Roman" w:hAnsi="Times New Roman" w:cs="Times New Roman"/>
+          <w:color w:val="91D076"/>
+          <w:kern w:val="0"/>
+          <w:sz w:val="22"/>
+          <w:szCs w:val="22"/>
+          <w:bdr w:val="single" w:sz="2" w:space="0" w:color="auto" w:frame="1"/>
+          <w:shd w:val="clear" w:color="auto" w:fill="09090B"/>
+          <w:lang w:eastAsia="de-DE"/>
+          <w14:ligatures w14:val="none"/>
+        </w:rPr>
+        <w:t xml:space="preserve"> </w:t>
+      </w:r>
+      <w:proofErr w:type="spellStart"/>
+      <w:r>
+        <w:rPr>
+          <w:rFonts w:ascii="Times New Roman" w:eastAsia="Times New Roman" w:hAnsi="Times New Roman" w:cs="Times New Roman"/>
+          <w:color w:val="91D076"/>
+          <w:kern w:val="0"/>
+          <w:sz w:val="22"/>
+          <w:szCs w:val="22"/>
+          <w:bdr w:val="single" w:sz="2" w:space="0" w:color="auto" w:frame="1"/>
+          <w:shd w:val="clear" w:color="auto" w:fill="09090B"/>
+          <w:lang w:eastAsia="de-DE"/>
+          <w14:ligatures w14:val="none"/>
+        </w:rPr>
+        <w:t>ProfileEntity</w:t>
+      </w:r>
+      <w:proofErr w:type="spellEnd"/>
+      <w:r>
+        <w:rPr>
+          <w:rFonts w:ascii="Times New Roman" w:eastAsia="Times New Roman" w:hAnsi="Times New Roman" w:cs="Times New Roman"/>
+          <w:color w:val="91D076"/>
+          <w:kern w:val="0"/>
+          <w:sz w:val="22"/>
+          <w:szCs w:val="22"/>
+          <w:bdr w:val="single" w:sz="2" w:space="0" w:color="auto" w:frame="1"/>
+          <w:shd w:val="clear" w:color="auto" w:fill="09090B"/>
+          <w:lang w:eastAsia="de-DE"/>
+          <w14:ligatures w14:val="none"/>
+        </w:rPr>
+        <w:t xml:space="preserve"> p WHERE </w:t>
+      </w:r>
+      <w:proofErr w:type="spellStart"/>
+      <w:r>
+        <w:rPr>
+          <w:rFonts w:ascii="Times New Roman" w:eastAsia="Times New Roman" w:hAnsi="Times New Roman" w:cs="Times New Roman"/>
+          <w:color w:val="91D076"/>
+          <w:kern w:val="0"/>
+          <w:sz w:val="22"/>
+          <w:szCs w:val="22"/>
+          <w:bdr w:val="single" w:sz="2" w:space="0" w:color="auto" w:frame="1"/>
+          <w:shd w:val="clear" w:color="auto" w:fill="09090B"/>
+          <w:lang w:eastAsia="de-DE"/>
+          <w14:ligatures w14:val="none"/>
+        </w:rPr>
+        <w:t>p.username</w:t>
+      </w:r>
+      <w:proofErr w:type="spellEnd"/>
+      <w:r>
+        <w:rPr>
+          <w:rFonts w:ascii="Times New Roman" w:eastAsia="Times New Roman" w:hAnsi="Times New Roman" w:cs="Times New Roman"/>
+          <w:color w:val="91D076"/>
+          <w:kern w:val="0"/>
+          <w:sz w:val="22"/>
+          <w:szCs w:val="22"/>
+          <w:bdr w:val="single" w:sz="2" w:space="0" w:color="auto" w:frame="1"/>
+          <w:shd w:val="clear" w:color="auto" w:fill="09090B"/>
+          <w:lang w:eastAsia="de-DE"/>
+          <w14:ligatures w14:val="none"/>
+        </w:rPr>
+        <w:t xml:space="preserve"> LIKE %:username% AND </w:t>
+      </w:r>
+      <w:proofErr w:type="spellStart"/>
+      <w:r>
+        <w:rPr>
+          <w:rFonts w:ascii="Times New Roman" w:eastAsia="Times New Roman" w:hAnsi="Times New Roman" w:cs="Times New Roman"/>
+          <w:color w:val="91D076"/>
+          <w:kern w:val="0"/>
+          <w:sz w:val="22"/>
+          <w:szCs w:val="22"/>
+          <w:bdr w:val="single" w:sz="2" w:space="0" w:color="auto" w:frame="1"/>
+          <w:shd w:val="clear" w:color="auto" w:fill="09090B"/>
+          <w:lang w:eastAsia="de-DE"/>
+          <w14:ligatures w14:val="none"/>
+        </w:rPr>
+        <w:t>p.keycloakUser</w:t>
+      </w:r>
+      <w:proofErr w:type="spellEnd"/>
+      <w:r>
+        <w:rPr>
+          <w:rFonts w:ascii="Times New Roman" w:eastAsia="Times New Roman" w:hAnsi="Times New Roman" w:cs="Times New Roman"/>
+          <w:color w:val="91D076"/>
+          <w:kern w:val="0"/>
+          <w:sz w:val="22"/>
+          <w:szCs w:val="22"/>
+          <w:bdr w:val="single" w:sz="2" w:space="0" w:color="auto" w:frame="1"/>
+          <w:shd w:val="clear" w:color="auto" w:fill="09090B"/>
+          <w:lang w:eastAsia="de-DE"/>
+          <w14:ligatures w14:val="none"/>
+        </w:rPr>
+        <w:t xml:space="preserve"> Id &lt;&gt; :</w:t>
+      </w:r>
+      <w:proofErr w:type="spellStart"/>
+      <w:r>
+        <w:rPr>
+          <w:rFonts w:ascii="Times New Roman" w:eastAsia="Times New Roman" w:hAnsi="Times New Roman" w:cs="Times New Roman"/>
+          <w:color w:val="91D076"/>
+          <w:kern w:val="0"/>
+          <w:sz w:val="22"/>
+          <w:szCs w:val="22"/>
+          <w:bdr w:val="single" w:sz="2" w:space="0" w:color="auto" w:frame="1"/>
+          <w:shd w:val="clear" w:color="auto" w:fill="09090B"/>
+          <w:lang w:eastAsia="de-DE"/>
+          <w14:ligatures w14:val="none"/>
+        </w:rPr>
+        <w:t>currentUser</w:t>
+      </w:r>
+      <w:proofErr w:type="spellEnd"/>
+      <w:r>
+        <w:rPr>
+          <w:rFonts w:ascii="Times New Roman" w:eastAsia="Times New Roman" w:hAnsi="Times New Roman" w:cs="Times New Roman"/>
+          <w:color w:val="91D076"/>
+          <w:kern w:val="0"/>
+          <w:sz w:val="22"/>
+          <w:szCs w:val="22"/>
+          <w:bdr w:val="single" w:sz="2" w:space="0" w:color="auto" w:frame="1"/>
+          <w:shd w:val="clear" w:color="auto" w:fill="09090B"/>
+          <w:lang w:eastAsia="de-DE"/>
+          <w14:ligatures w14:val="none"/>
+        </w:rPr>
+        <w:t xml:space="preserve"> Id"</w:t>
       </w:r>
       <w:r>
         <w:rPr>
@@ -6187,14 +6884,22 @@
     </w:p>
     <w:p>
       <w:r>
-        <w:t>The search results are dynamically rendered in a user-friendly card format, similar to the available users' display. Each card presents the user's profile picture, username, and status, allowing users to quickly identify potential contacts.</w:t>
+        <w:t xml:space="preserve">The search results are dynamically rendered in a user-friendly card format, </w:t>
+      </w:r>
+      <w:proofErr w:type="gramStart"/>
+      <w:r>
+        <w:t>similar to</w:t>
+      </w:r>
+      <w:proofErr w:type="gramEnd"/>
+      <w:r>
+        <w:t xml:space="preserve"> the available users' display. Each card presents the user's profile picture, username, and status, allowing users to quickly identify potential contacts.</w:t>
       </w:r>
     </w:p>
     <w:p>
       <w:pPr>
         <w:pStyle w:val="Heading3"/>
       </w:pPr>
-      <w:bookmarkStart w:id="42" w:name="_Toc190161237"/>
+      <w:bookmarkStart w:id="42" w:name="_Toc190222839"/>
       <w:r>
         <w:t xml:space="preserve">2.3.6 </w:t>
       </w:r>
@@ -6229,12 +6934,53 @@
           <w:bCs/>
         </w:rPr>
       </w:pPr>
+      <w:proofErr w:type="spellStart"/>
       <w:r>
         <w:rPr>
           <w:b/>
           <w:bCs/>
         </w:rPr>
-        <w:t>AvailableUserDTO=   [id; username ; profilePhoto ; bio; status ]</w:t>
+        <w:t>AvailableUserDTO</w:t>
+      </w:r>
+      <w:proofErr w:type="spellEnd"/>
+      <w:r>
+        <w:rPr>
+          <w:b/>
+          <w:bCs/>
+        </w:rPr>
+        <w:t>=</w:t>
+      </w:r>
+      <w:proofErr w:type="gramStart"/>
+      <w:r>
+        <w:rPr>
+          <w:b/>
+          <w:bCs/>
+        </w:rPr>
+        <w:t xml:space="preserve">   [</w:t>
+      </w:r>
+      <w:proofErr w:type="gramEnd"/>
+      <w:r>
+        <w:rPr>
+          <w:b/>
+          <w:bCs/>
+        </w:rPr>
+        <w:t xml:space="preserve">id; username ; </w:t>
+      </w:r>
+      <w:proofErr w:type="spellStart"/>
+      <w:r>
+        <w:rPr>
+          <w:b/>
+          <w:bCs/>
+        </w:rPr>
+        <w:t>profilePhoto</w:t>
+      </w:r>
+      <w:proofErr w:type="spellEnd"/>
+      <w:r>
+        <w:rPr>
+          <w:b/>
+          <w:bCs/>
+        </w:rPr>
+        <w:t xml:space="preserve"> ; bio; status ]</w:t>
       </w:r>
     </w:p>
     <w:p>
@@ -6250,6 +6996,7 @@
     </w:p>
     <w:p>
       <w:r>
+        <w:lastRenderedPageBreak/>
         <w:t>W</w:t>
       </w:r>
       <w:r>
@@ -6265,11 +7012,7 @@
         <w:t>ed</w:t>
       </w:r>
       <w:r>
-        <w:t xml:space="preserve"> pagination by fetching and displaying a maximum of 10 users at a time. This allows users to navigate through the list of available users easily, using "Previous" and "Next" buttons to view the next or previous set of available users. This approach enhances the user experience by preventing overwhelming amounts of </w:t>
-      </w:r>
-      <w:r>
-        <w:lastRenderedPageBreak/>
-        <w:t>information from being displayed at once and allows for smoother navigation through the available user profiles.</w:t>
+        <w:t xml:space="preserve"> pagination by fetching and displaying a maximum of 10 users at a time. This allows users to navigate through the list of available users easily, using "Previous" and "Next" buttons to view the next or previous set of available users. This approach enhances the user experience by preventing overwhelming amounts of information from being displayed at once and allows for smoother navigation through the available user profiles.</w:t>
       </w:r>
     </w:p>
     <w:p>
@@ -6285,7 +7028,7 @@
           <w:numId w:val="2"/>
         </w:numPr>
       </w:pPr>
-      <w:bookmarkStart w:id="43" w:name="_Toc190161238"/>
+      <w:bookmarkStart w:id="43" w:name="_Toc190222840"/>
       <w:r>
         <w:t>Architecture</w:t>
       </w:r>
@@ -6295,7 +7038,7 @@
       <w:pPr>
         <w:pStyle w:val="Heading2"/>
       </w:pPr>
-      <w:bookmarkStart w:id="44" w:name="_Toc190161239"/>
+      <w:bookmarkStart w:id="44" w:name="_Toc190222841"/>
       <w:r>
         <w:t xml:space="preserve">3.1 </w:t>
       </w:r>
@@ -6373,14 +7116,27 @@
       <w:r>
         <w:t xml:space="preserve">Figure </w:t>
       </w:r>
-      <w:fldSimple w:instr=" SEQ Figure \* ARABIC ">
-        <w:r>
-          <w:rPr>
-            <w:noProof/>
-          </w:rPr>
-          <w:t>12</w:t>
-        </w:r>
-      </w:fldSimple>
+      <w:r>
+        <w:fldChar w:fldCharType="begin"/>
+      </w:r>
+      <w:r>
+        <w:instrText xml:space="preserve"> SEQ Figure \* ARABIC </w:instrText>
+      </w:r>
+      <w:r>
+        <w:fldChar w:fldCharType="separate"/>
+      </w:r>
+      <w:r>
+        <w:rPr>
+          <w:noProof/>
+        </w:rPr>
+        <w:t>12</w:t>
+      </w:r>
+      <w:r>
+        <w:rPr>
+          <w:noProof/>
+        </w:rPr>
+        <w:fldChar w:fldCharType="end"/>
+      </w:r>
       <w:r>
         <w:t>: General Overview of our Architecture</w:t>
       </w:r>
@@ -6415,7 +7171,7 @@
       <w:pPr>
         <w:pStyle w:val="Heading2"/>
       </w:pPr>
-      <w:bookmarkStart w:id="48" w:name="_Toc190161240"/>
+      <w:bookmarkStart w:id="48" w:name="_Toc190222842"/>
       <w:r>
         <w:lastRenderedPageBreak/>
         <w:t xml:space="preserve">3.2 </w:t>
@@ -6493,14 +7249,27 @@
       <w:r>
         <w:t xml:space="preserve">Figure </w:t>
       </w:r>
-      <w:fldSimple w:instr=" SEQ Figure \* ARABIC ">
-        <w:r>
-          <w:rPr>
-            <w:noProof/>
-          </w:rPr>
-          <w:t>13</w:t>
-        </w:r>
-      </w:fldSimple>
+      <w:r>
+        <w:fldChar w:fldCharType="begin"/>
+      </w:r>
+      <w:r>
+        <w:instrText xml:space="preserve"> SEQ Figure \* ARABIC </w:instrText>
+      </w:r>
+      <w:r>
+        <w:fldChar w:fldCharType="separate"/>
+      </w:r>
+      <w:r>
+        <w:rPr>
+          <w:noProof/>
+        </w:rPr>
+        <w:t>13</w:t>
+      </w:r>
+      <w:r>
+        <w:rPr>
+          <w:noProof/>
+        </w:rPr>
+        <w:fldChar w:fldCharType="end"/>
+      </w:r>
       <w:r>
         <w:t xml:space="preserve">: </w:t>
       </w:r>
@@ -6517,7 +7286,7 @@
       <w:pPr>
         <w:pStyle w:val="Heading2"/>
       </w:pPr>
-      <w:bookmarkStart w:id="52" w:name="_Toc190161241"/>
+      <w:bookmarkStart w:id="52" w:name="_Toc190222843"/>
       <w:r>
         <w:lastRenderedPageBreak/>
         <w:t xml:space="preserve">3.3 </w:t>
@@ -6596,14 +7365,27 @@
       <w:r>
         <w:t xml:space="preserve">Figure </w:t>
       </w:r>
-      <w:fldSimple w:instr=" SEQ Figure \* ARABIC ">
-        <w:r>
-          <w:rPr>
-            <w:noProof/>
-          </w:rPr>
-          <w:t>14</w:t>
-        </w:r>
-      </w:fldSimple>
+      <w:r>
+        <w:fldChar w:fldCharType="begin"/>
+      </w:r>
+      <w:r>
+        <w:instrText xml:space="preserve"> SEQ Figure \* ARABIC </w:instrText>
+      </w:r>
+      <w:r>
+        <w:fldChar w:fldCharType="separate"/>
+      </w:r>
+      <w:r>
+        <w:rPr>
+          <w:noProof/>
+        </w:rPr>
+        <w:t>14</w:t>
+      </w:r>
+      <w:r>
+        <w:rPr>
+          <w:noProof/>
+        </w:rPr>
+        <w:fldChar w:fldCharType="end"/>
+      </w:r>
       <w:r>
         <w:t>: Sequence Diagram for E2EE(a)</w:t>
       </w:r>
@@ -6613,10 +7395,58 @@
     </w:p>
     <w:p>
       <w:r>
-        <w:t>This sequence diagram illustrates how end-to-end encryption is realized, through illustrating the flow when a new user registers and sends a new message to another (existing) user. Important abbreviations: hash – hashing algorithm, pk – passkey, mn – magic number, enc – encryption algorithm, enc_variable - encrypted variable, pubkey – public key, privkey – private key, symkey – symmetric key, msg – message</w:t>
-      </w:r>
-      <w:r>
-        <w:t>, db - database</w:t>
+        <w:t xml:space="preserve">This sequence diagram illustrates how end-to-end encryption is realized, through illustrating the flow when a new user registers and sends a new message to another (existing) user. Important abbreviations: hash – hashing algorithm, pk – passkey, </w:t>
+      </w:r>
+      <w:proofErr w:type="spellStart"/>
+      <w:r>
+        <w:t>mn</w:t>
+      </w:r>
+      <w:proofErr w:type="spellEnd"/>
+      <w:r>
+        <w:t xml:space="preserve"> – magic number, enc – encryption algorithm, </w:t>
+      </w:r>
+      <w:proofErr w:type="spellStart"/>
+      <w:r>
+        <w:t>enc_variable</w:t>
+      </w:r>
+      <w:proofErr w:type="spellEnd"/>
+      <w:r>
+        <w:t xml:space="preserve"> - encrypted variable, </w:t>
+      </w:r>
+      <w:proofErr w:type="spellStart"/>
+      <w:r>
+        <w:t>pubkey</w:t>
+      </w:r>
+      <w:proofErr w:type="spellEnd"/>
+      <w:r>
+        <w:t xml:space="preserve"> – public key, </w:t>
+      </w:r>
+      <w:proofErr w:type="spellStart"/>
+      <w:r>
+        <w:t>privkey</w:t>
+      </w:r>
+      <w:proofErr w:type="spellEnd"/>
+      <w:r>
+        <w:t xml:space="preserve"> – private key, </w:t>
+      </w:r>
+      <w:proofErr w:type="spellStart"/>
+      <w:r>
+        <w:t>symkey</w:t>
+      </w:r>
+      <w:proofErr w:type="spellEnd"/>
+      <w:r>
+        <w:t xml:space="preserve"> – symmetric key, msg – message</w:t>
+      </w:r>
+      <w:r>
+        <w:t xml:space="preserve">, </w:t>
+      </w:r>
+      <w:proofErr w:type="spellStart"/>
+      <w:r>
+        <w:t>db</w:t>
+      </w:r>
+      <w:proofErr w:type="spellEnd"/>
+      <w:r>
+        <w:t xml:space="preserve"> - database</w:t>
       </w:r>
       <w:r>
         <w:t xml:space="preserve">. </w:t>
@@ -6692,14 +7522,27 @@
       <w:r>
         <w:t xml:space="preserve">Figure </w:t>
       </w:r>
-      <w:fldSimple w:instr=" SEQ Figure \* ARABIC ">
-        <w:r>
-          <w:rPr>
-            <w:noProof/>
-          </w:rPr>
-          <w:t>15</w:t>
-        </w:r>
-      </w:fldSimple>
+      <w:r>
+        <w:fldChar w:fldCharType="begin"/>
+      </w:r>
+      <w:r>
+        <w:instrText xml:space="preserve"> SEQ Figure \* ARABIC </w:instrText>
+      </w:r>
+      <w:r>
+        <w:fldChar w:fldCharType="separate"/>
+      </w:r>
+      <w:r>
+        <w:rPr>
+          <w:noProof/>
+        </w:rPr>
+        <w:t>15</w:t>
+      </w:r>
+      <w:r>
+        <w:rPr>
+          <w:noProof/>
+        </w:rPr>
+        <w:fldChar w:fldCharType="end"/>
+      </w:r>
       <w:r>
         <w:t xml:space="preserve">: </w:t>
       </w:r>
@@ -6718,10 +7561,74 @@
     </w:p>
     <w:p>
       <w:r>
-        <w:t>This sequence diagram illustrates how the other user logs in and receives the new message from the new user. Important abbreviations: hash – hashing algorithm, pk – passkey, mn – magic number, decr – decryption algorithm, enc_variable - encrypted variable, pubkey – public key, privkey – private key, symkey – symmetric key, msg – message</w:t>
-      </w:r>
-      <w:r>
-        <w:t>, db - database</w:t>
+        <w:t xml:space="preserve">This sequence diagram illustrates how the other user logs in and receives </w:t>
+      </w:r>
+      <w:proofErr w:type="gramStart"/>
+      <w:r>
+        <w:t>the</w:t>
+      </w:r>
+      <w:proofErr w:type="gramEnd"/>
+      <w:r>
+        <w:t xml:space="preserve"> new message from the new user. Important abbreviations: hash – hashing algorithm, pk – passkey, </w:t>
+      </w:r>
+      <w:proofErr w:type="spellStart"/>
+      <w:r>
+        <w:t>mn</w:t>
+      </w:r>
+      <w:proofErr w:type="spellEnd"/>
+      <w:r>
+        <w:t xml:space="preserve"> – magic number, </w:t>
+      </w:r>
+      <w:proofErr w:type="spellStart"/>
+      <w:r>
+        <w:t>decr</w:t>
+      </w:r>
+      <w:proofErr w:type="spellEnd"/>
+      <w:r>
+        <w:t xml:space="preserve"> – decryption algorithm, </w:t>
+      </w:r>
+      <w:proofErr w:type="spellStart"/>
+      <w:r>
+        <w:t>enc_variable</w:t>
+      </w:r>
+      <w:proofErr w:type="spellEnd"/>
+      <w:r>
+        <w:t xml:space="preserve"> - encrypted variable, </w:t>
+      </w:r>
+      <w:proofErr w:type="spellStart"/>
+      <w:r>
+        <w:t>pubkey</w:t>
+      </w:r>
+      <w:proofErr w:type="spellEnd"/>
+      <w:r>
+        <w:t xml:space="preserve"> – public key, </w:t>
+      </w:r>
+      <w:proofErr w:type="spellStart"/>
+      <w:r>
+        <w:t>privkey</w:t>
+      </w:r>
+      <w:proofErr w:type="spellEnd"/>
+      <w:r>
+        <w:t xml:space="preserve"> – private key, </w:t>
+      </w:r>
+      <w:proofErr w:type="spellStart"/>
+      <w:r>
+        <w:t>symkey</w:t>
+      </w:r>
+      <w:proofErr w:type="spellEnd"/>
+      <w:r>
+        <w:t xml:space="preserve"> – symmetric key, msg – message</w:t>
+      </w:r>
+      <w:r>
+        <w:t xml:space="preserve">, </w:t>
+      </w:r>
+      <w:proofErr w:type="spellStart"/>
+      <w:r>
+        <w:t>db</w:t>
+      </w:r>
+      <w:proofErr w:type="spellEnd"/>
+      <w:r>
+        <w:t xml:space="preserve"> - database</w:t>
       </w:r>
       <w:r>
         <w:t>.</w:t>
@@ -6731,7 +7638,7 @@
       <w:pPr>
         <w:pStyle w:val="Heading2"/>
       </w:pPr>
-      <w:bookmarkStart w:id="59" w:name="_Toc190161242"/>
+      <w:bookmarkStart w:id="59" w:name="_Toc190222844"/>
       <w:r>
         <w:lastRenderedPageBreak/>
         <w:t>3.</w:t>
@@ -6810,14 +7717,27 @@
       <w:r>
         <w:t xml:space="preserve">Figure </w:t>
       </w:r>
-      <w:fldSimple w:instr=" SEQ Figure \* ARABIC ">
-        <w:r>
-          <w:rPr>
-            <w:noProof/>
-          </w:rPr>
-          <w:t>16</w:t>
-        </w:r>
-      </w:fldSimple>
+      <w:r>
+        <w:fldChar w:fldCharType="begin"/>
+      </w:r>
+      <w:r>
+        <w:instrText xml:space="preserve"> SEQ Figure \* ARABIC </w:instrText>
+      </w:r>
+      <w:r>
+        <w:fldChar w:fldCharType="separate"/>
+      </w:r>
+      <w:r>
+        <w:rPr>
+          <w:noProof/>
+        </w:rPr>
+        <w:t>16</w:t>
+      </w:r>
+      <w:r>
+        <w:rPr>
+          <w:noProof/>
+        </w:rPr>
+        <w:fldChar w:fldCharType="end"/>
+      </w:r>
       <w:r>
         <w:t>: Real Time Chatting - Architecture</w:t>
       </w:r>
@@ -6833,7 +7753,7 @@
           <w:numId w:val="2"/>
         </w:numPr>
       </w:pPr>
-      <w:bookmarkStart w:id="63" w:name="_Toc190161243"/>
+      <w:bookmarkStart w:id="63" w:name="_Toc190222845"/>
       <w:r>
         <w:t>Challenges we have faced</w:t>
       </w:r>
@@ -6843,7 +7763,7 @@
       <w:pPr>
         <w:pStyle w:val="Heading2"/>
       </w:pPr>
-      <w:bookmarkStart w:id="64" w:name="_Toc190161244"/>
+      <w:bookmarkStart w:id="64" w:name="_Toc190222846"/>
       <w:r>
         <w:t xml:space="preserve">4.1 </w:t>
       </w:r>
@@ -6952,7 +7872,15 @@
         <w:t xml:space="preserve"> listed. An Icebreaker for this profile would be: “</w:t>
       </w:r>
       <w:r>
-        <w:t>Singing is really nice. What kind of songs do you really like singing the most?</w:t>
+        <w:t xml:space="preserve">Singing is </w:t>
+      </w:r>
+      <w:proofErr w:type="gramStart"/>
+      <w:r>
+        <w:t>really nice</w:t>
+      </w:r>
+      <w:proofErr w:type="gramEnd"/>
+      <w:r>
+        <w:t>. What kind of songs do you really like singing the most?</w:t>
       </w:r>
       <w:r>
         <w:t>” Each Icebreaker has two sentences, one sentence reaffirming the interest of the person and the other asking a question about it. We believe such a structure makes the most sense for first messages but also due to limitation in the number of datasets that we have</w:t>
@@ -7047,7 +7975,7 @@
       <w:pPr>
         <w:pStyle w:val="Heading2"/>
       </w:pPr>
-      <w:bookmarkStart w:id="65" w:name="_Toc190161245"/>
+      <w:bookmarkStart w:id="65" w:name="_Toc190222847"/>
       <w:r>
         <w:t>4.2 Compatibility, Versioning and Dependencies</w:t>
       </w:r>
@@ -7064,7 +7992,15 @@
         <w:t xml:space="preserve"> faced significant challenges because we worked on different machines. When Utkarsh for example set up the </w:t>
       </w:r>
       <w:r>
-        <w:t xml:space="preserve">login functionalities and parts of the frontend, we could not immediately run the program as we for example had older or newer versions of node.js, java, etc. Or we did not have it at all and had to download the correct version. In this regard dependencies were a huge problem as well, often they needed to be downloaded separately, as here too versions mattered this could become a lengthy process of trial and error. We tried to mitigate this problem using docker, both keycloak and PostgreSQL would for example run in docker. Docker tries to solve the described problem, by making the creator of a program able to include all dependencies, libraries, etc. in so called docker images.  </w:t>
+        <w:t xml:space="preserve">login functionalities and parts of the frontend, we could not immediately run the program as we for example had older or newer versions of node.js, java, etc. Or we did not have it at all and had to download the correct version. In this regard dependencies were a huge problem as well, often they needed to be downloaded separately, as here too versions mattered this could become a lengthy process of trial and error. We tried to mitigate this problem using docker, both </w:t>
+      </w:r>
+      <w:proofErr w:type="spellStart"/>
+      <w:r>
+        <w:t>keycloak</w:t>
+      </w:r>
+      <w:proofErr w:type="spellEnd"/>
+      <w:r>
+        <w:t xml:space="preserve"> and PostgreSQL would for example run in docker. Docker tries to solve the described problem, by making the creator of a program able to include all dependencies, libraries, etc. in so called docker images.  </w:t>
       </w:r>
       <w:r>
         <w:t>However, due to the project's complexity and numerous components, many dependency issues had to be resolved manually.</w:t>
@@ -7073,7 +8009,15 @@
         <w:t xml:space="preserve"> </w:t>
       </w:r>
       <w:r>
-        <w:t xml:space="preserve">Especially, when trying to run our program on a separate machine to test it, we again noticed how much versions of node.js, java, etc. mattered. We changed the </w:t>
+        <w:t xml:space="preserve">Especially, when trying to run our program on a separate machine to test it, we again noticed how </w:t>
+      </w:r>
+      <w:proofErr w:type="gramStart"/>
+      <w:r>
+        <w:t>much</w:t>
+      </w:r>
+      <w:proofErr w:type="gramEnd"/>
+      <w:r>
+        <w:t xml:space="preserve"> versions of node.js, java, etc. mattered. We changed the </w:t>
       </w:r>
       <w:r>
         <w:t>“README”</w:t>
@@ -7093,7 +8037,7 @@
           <w:numId w:val="2"/>
         </w:numPr>
       </w:pPr>
-      <w:bookmarkStart w:id="66" w:name="_Toc190161246"/>
+      <w:bookmarkStart w:id="66" w:name="_Toc190222848"/>
       <w:r>
         <w:lastRenderedPageBreak/>
         <w:t>Real Time Chat Application</w:t>
@@ -7106,7 +8050,15 @@
     <w:p/>
     <w:p>
       <w:r>
-        <w:t xml:space="preserve">With all the knowledge we gathered up to the 4th semester, we felt fully equipped to understand how a real-time chat application could be designed—at least in theory. However, we underestimated the effort required to transition from theory to reality. </w:t>
+        <w:t xml:space="preserve">With all the knowledge we gathered up to the 4th semester, we felt fully equipped to understand how a real-time chat application could be </w:t>
+      </w:r>
+      <w:proofErr w:type="gramStart"/>
+      <w:r>
+        <w:t>designed—at</w:t>
+      </w:r>
+      <w:proofErr w:type="gramEnd"/>
+      <w:r>
+        <w:t xml:space="preserve"> least in theory. However, we underestimated the effort required to transition from theory to reality. </w:t>
       </w:r>
     </w:p>
     <w:p>
@@ -7116,7 +8068,15 @@
     </w:p>
     <w:p>
       <w:r>
-        <w:t>Additionally, many of the YouTube tutorials we found were outdated and incompatible with the latest versions of the technologies we were using. Syntax changes and missing documentation for our specific framework further complicated the process. Since there were no up-to-date video tutorials available, we had to rely entirely on official documentation. This turned out to be a significant challenge, as the necessary information was scattered across multiple web pages, requiring extensive time and effort to piece everything together. Apart from that, connecting the backend and frontend was another major challenge. A direct POST request was not a viable option in this scenario, which required substantial syntax modifications. Adapting to these changes and ensuring proper communication between both ends of the application took considerable effort.</w:t>
+        <w:t xml:space="preserve">Additionally, many of the YouTube tutorials we found were outdated and incompatible with the latest versions of the technologies we were using. Syntax changes and missing documentation for our specific framework further complicated the process. Since there were no up-to-date video tutorials available, we had to rely entirely on official documentation. This turned out to be a significant challenge, as the necessary information was scattered across multiple web pages, requiring extensive time and effort to piece everything together. Apart from that, connecting the backend and </w:t>
+      </w:r>
+      <w:proofErr w:type="gramStart"/>
+      <w:r>
+        <w:t>frontend</w:t>
+      </w:r>
+      <w:proofErr w:type="gramEnd"/>
+      <w:r>
+        <w:t xml:space="preserve"> was another major challenge. A direct POST request was not a viable option in this scenario, which required substantial syntax modifications. Adapting to these changes and ensuring proper communication between both ends of the application took considerable effort.</w:t>
       </w:r>
     </w:p>
     <w:p>
@@ -7137,7 +8097,7 @@
           <w:numId w:val="2"/>
         </w:numPr>
       </w:pPr>
-      <w:bookmarkStart w:id="67" w:name="_Toc190161247"/>
+      <w:bookmarkStart w:id="67" w:name="_Toc190222849"/>
       <w:r>
         <w:t>UI Designing</w:t>
       </w:r>
@@ -7159,7 +8119,7 @@
           <w:numId w:val="2"/>
         </w:numPr>
       </w:pPr>
-      <w:bookmarkStart w:id="68" w:name="_Toc190161248"/>
+      <w:bookmarkStart w:id="68" w:name="_Toc190222850"/>
       <w:r>
         <w:lastRenderedPageBreak/>
         <w:t>Bugs</w:t>
@@ -7201,7 +8161,7 @@
           <w:numId w:val="2"/>
         </w:numPr>
       </w:pPr>
-      <w:bookmarkStart w:id="69" w:name="_Toc190161249"/>
+      <w:bookmarkStart w:id="69" w:name="_Toc190222851"/>
       <w:r>
         <w:t>HTTPS Connection</w:t>
       </w:r>
@@ -7263,7 +8223,7 @@
           <w:numId w:val="2"/>
         </w:numPr>
       </w:pPr>
-      <w:bookmarkStart w:id="70" w:name="_Toc190161250"/>
+      <w:bookmarkStart w:id="70" w:name="_Toc190222852"/>
       <w:r>
         <w:t>Who has done what</w:t>
       </w:r>
@@ -7281,7 +8241,15 @@
       </w:r>
       <w:r>
         <w:lastRenderedPageBreak/>
-        <w:t xml:space="preserve">end encryption of the messages. All members worked on creating architectures for the application. Especially </w:t>
+        <w:t xml:space="preserve">end encryption of the messages. All members worked on creating </w:t>
+      </w:r>
+      <w:proofErr w:type="gramStart"/>
+      <w:r>
+        <w:t>architectures</w:t>
+      </w:r>
+      <w:proofErr w:type="gramEnd"/>
+      <w:r>
+        <w:t xml:space="preserve"> for the application. Especially </w:t>
       </w:r>
       <w:r>
         <w:t>conceptualizing</w:t>
@@ -7298,7 +8266,7 @@
           <w:numId w:val="2"/>
         </w:numPr>
       </w:pPr>
-      <w:bookmarkStart w:id="71" w:name="_Toc190161251"/>
+      <w:bookmarkStart w:id="71" w:name="_Toc190222853"/>
       <w:r>
         <w:t>Conclusion</w:t>
       </w:r>
@@ -7306,7 +8274,15 @@
     </w:p>
     <w:p>
       <w:r>
-        <w:t>This was our favourite project of our young career so far, mainly because we were given the freedom to create what we want and the fact that we could work on one of the most important topics in computer science of this day. Through this project we were able to understand neural networks which are th</w:t>
+        <w:t xml:space="preserve">This was our </w:t>
+      </w:r>
+      <w:proofErr w:type="spellStart"/>
+      <w:r>
+        <w:t>favourite</w:t>
+      </w:r>
+      <w:proofErr w:type="spellEnd"/>
+      <w:r>
+        <w:t xml:space="preserve"> project of our young career so far, mainly because we were given the freedom to create what we want and the fact that we could work on one of the most important topics in computer science of this day. Through this project we were able to understand neural networks which are th</w:t>
       </w:r>
       <w:r>
         <w:t xml:space="preserve">e basis for all modern AI. Furthermore, we were able to work with and understand the complex models of </w:t>
@@ -7315,7 +8291,23 @@
         <w:t>today’s</w:t>
       </w:r>
       <w:r>
-        <w:t xml:space="preserve"> age which extend the classic neural networks, namely generative AI models like ChatGPT. We had a lot of fun understanding how AIs like ChatGPT work and how we can fine-tune these models to our demands. Furthermore, we were able to sophisticate and enlarge our knowledge of creating complex websites, which incorporate a java driven backend (in our case springboot), a </w:t>
+        <w:t xml:space="preserve"> age which extend the classic neural networks, namely generative AI models like ChatGPT. We had a lot of fun understanding how AIs like ChatGPT </w:t>
+      </w:r>
+      <w:proofErr w:type="gramStart"/>
+      <w:r>
+        <w:t>work</w:t>
+      </w:r>
+      <w:proofErr w:type="gramEnd"/>
+      <w:r>
+        <w:t xml:space="preserve"> and how we can fine-tune these models to our demands. Furthermore, we were able to sophisticate and enlarge our knowledge of creating complex websites, which incorporate a java driven backend (in our case </w:t>
+      </w:r>
+      <w:proofErr w:type="spellStart"/>
+      <w:r>
+        <w:t>springboot</w:t>
+      </w:r>
+      <w:proofErr w:type="spellEnd"/>
+      <w:r>
+        <w:t xml:space="preserve">), a </w:t>
       </w:r>
       <w:r>
         <w:t>JavaScript</w:t>
@@ -7327,7 +8319,15 @@
         <w:t xml:space="preserve">a </w:t>
       </w:r>
       <w:r>
-        <w:t>database structure (in our case PostgreSQL). Especially conceptualizing and implementing the chat functionality demanded a lot of our knowledge acquired in courses like: Distributed Systems or Computer Networks. Thus, we could bring a lot of the learned concepts into practice. The same can be said for the end-to-end encryption. Here the knowledge acquired in the IT Security lecture</w:t>
+        <w:t xml:space="preserve">database structure (in our case PostgreSQL). Especially conceptualizing and implementing the chat functionality demanded a lot of our knowledge acquired in courses like: Distributed Systems or Computer Networks. Thus, we could bring a lot of the </w:t>
+      </w:r>
+      <w:proofErr w:type="gramStart"/>
+      <w:r>
+        <w:t>learned concepts</w:t>
+      </w:r>
+      <w:proofErr w:type="gramEnd"/>
+      <w:r>
+        <w:t xml:space="preserve"> into practice. The same can be said for the end-to-end encryption. Here the knowledge acquired in the IT Security lecture</w:t>
       </w:r>
       <w:r>
         <w:t>s</w:t>
@@ -7339,16 +8339,48 @@
         <w:t>was</w:t>
       </w:r>
       <w:r>
-        <w:t xml:space="preserve"> of vital importance to realize our ideas. </w:t>
-      </w:r>
-      <w:r>
-        <w:t xml:space="preserve">As the mentioned courses were among some of our favourites in our journey in this university, we were able to sophisticate our interests and get a first idea of what to do after acquiring our bachelor’s degree. (If all goes well all of us are finishing this year or at the beginning of next year). In </w:t>
+        <w:t xml:space="preserve"> of vital importance to </w:t>
+      </w:r>
+      <w:proofErr w:type="gramStart"/>
+      <w:r>
+        <w:t>realize</w:t>
+      </w:r>
+      <w:proofErr w:type="gramEnd"/>
+      <w:r>
+        <w:t xml:space="preserve"> our ideas. </w:t>
+      </w:r>
+      <w:r>
+        <w:t xml:space="preserve">As the </w:t>
+      </w:r>
+      <w:proofErr w:type="gramStart"/>
+      <w:r>
+        <w:t>mentioned courses</w:t>
+      </w:r>
+      <w:proofErr w:type="gramEnd"/>
+      <w:r>
+        <w:t xml:space="preserve"> were among some of our </w:t>
+      </w:r>
+      <w:proofErr w:type="spellStart"/>
+      <w:r>
+        <w:t>favourites</w:t>
+      </w:r>
+      <w:proofErr w:type="spellEnd"/>
+      <w:r>
+        <w:t xml:space="preserve"> in our journey in this university, we were able to sophisticate our interests and get a first idea of what to do after acquiring our bachelor’s degree. (If all goes well all of us are finishing this year or at the beginning of next year). In </w:t>
       </w:r>
       <w:r>
         <w:t>conclusion,</w:t>
       </w:r>
       <w:r>
-        <w:t xml:space="preserve"> on behalf of the entire team: Utkarsh Fulara, Bilal Alali and Andrej Sum-Shik we would like to thank Prof. Dr. </w:t>
+        <w:t xml:space="preserve"> on behalf of the entire team: Utkarsh Fulara, Bilal Alali and Andrej Sum-</w:t>
+      </w:r>
+      <w:proofErr w:type="gramStart"/>
+      <w:r>
+        <w:t>Shik</w:t>
+      </w:r>
+      <w:proofErr w:type="gramEnd"/>
+      <w:r>
+        <w:t xml:space="preserve"> we would like to thank Prof. Dr. </w:t>
       </w:r>
       <w:r>
         <w:t>-</w:t>
@@ -7471,14 +8503,47 @@
         <w:t xml:space="preserve"> </w:t>
       </w:r>
       <w:r>
-        <w:t>Vaswani, A., Shazeer, N., Parmar, N., Uszkoreit, J., Jones, L., Gomez, A. N., Kaiser, L. &amp; Polosukhin, I. (2017). Attention is All you Need. </w:t>
-      </w:r>
+        <w:t xml:space="preserve">Vaswani, A., </w:t>
+      </w:r>
+      <w:proofErr w:type="spellStart"/>
+      <w:r>
+        <w:t>Shazeer</w:t>
+      </w:r>
+      <w:proofErr w:type="spellEnd"/>
+      <w:r>
+        <w:t xml:space="preserve">, N., Parmar, N., </w:t>
+      </w:r>
+      <w:proofErr w:type="spellStart"/>
+      <w:r>
+        <w:t>Uszkoreit</w:t>
+      </w:r>
+      <w:proofErr w:type="spellEnd"/>
+      <w:r>
+        <w:t xml:space="preserve">, J., Jones, L., Gomez, A. N., Kaiser, L. &amp; </w:t>
+      </w:r>
+      <w:proofErr w:type="spellStart"/>
+      <w:r>
+        <w:t>Polosukhin</w:t>
+      </w:r>
+      <w:proofErr w:type="spellEnd"/>
+      <w:r>
+        <w:t>, I. (2017). Attention is All you Need. </w:t>
+      </w:r>
+      <w:proofErr w:type="spellStart"/>
       <w:r>
         <w:rPr>
           <w:i/>
           <w:iCs/>
         </w:rPr>
-        <w:t>arXiv (Cornell University)</w:t>
+        <w:t>arXiv</w:t>
+      </w:r>
+      <w:proofErr w:type="spellEnd"/>
+      <w:r>
+        <w:rPr>
+          <w:i/>
+          <w:iCs/>
+        </w:rPr>
+        <w:t xml:space="preserve"> (Cornell University)</w:t>
       </w:r>
       <w:r>
         <w:t>, </w:t>
@@ -9114,7 +10179,6 @@
   <w:style w:type="character" w:default="1" w:styleId="DefaultParagraphFont">
     <w:name w:val="Default Paragraph Font"/>
     <w:uiPriority w:val="1"/>
-    <w:semiHidden/>
     <w:unhideWhenUsed/>
   </w:style>
   <w:style w:type="table" w:default="1" w:styleId="TableNormal">

</xml_diff>